<commit_message>
feat: extend compare list report with new and closed committees #BKDO-4199
</commit_message>
<xml_diff>
--- a/src/Bk.APG.Api/Templates/Compare_List_French.docx
+++ b/src/Bk.APG.Api/Templates/Compare_List_French.docx
@@ -1963,7 +1963,23 @@
                 <w:szCs w:val="24"/>
                 <w:lang w:val="fr-CH"/>
               </w:rPr>
-              <w:t>Représentation des communautés linguistiques</w:t>
+              <w:t>Représentation de</w:t>
+            </w:r>
+            <w:r>
+              <w:rPr>
+                <w:rFonts w:ascii="Times New Roman" w:hAnsi="Times New Roman"/>
+                <w:szCs w:val="24"/>
+                <w:lang w:val="fr-CH"/>
+              </w:rPr>
+              <w:t xml:space="preserve"> la</w:t>
+            </w:r>
+            <w:r>
+              <w:rPr>
+                <w:rFonts w:ascii="Times New Roman" w:hAnsi="Times New Roman"/>
+                <w:szCs w:val="24"/>
+                <w:lang w:val="fr-CH"/>
+              </w:rPr>
+              <w:t xml:space="preserve"> communauté linguistique</w:t>
             </w:r>
             <w:r>
               <w:rPr>
@@ -1979,7 +1995,7 @@
                 <w:szCs w:val="24"/>
                 <w:lang w:val="fr-CH"/>
               </w:rPr>
-              <w:t>germanophones</w:t>
+              <w:t>allemande</w:t>
             </w:r>
           </w:p>
         </w:tc>
@@ -2131,15 +2147,39 @@
                 <w:szCs w:val="24"/>
                 <w:lang w:val="fr-CH"/>
               </w:rPr>
-              <w:t xml:space="preserve">Représentation des communautés linguistiques </w:t>
-            </w:r>
-            <w:r>
-              <w:rPr>
-                <w:rFonts w:ascii="Times New Roman" w:hAnsi="Times New Roman"/>
-                <w:szCs w:val="24"/>
-                <w:lang w:val="fr-CH"/>
-              </w:rPr>
-              <w:t>germanophones</w:t>
+              <w:t xml:space="preserve">Représentation </w:t>
+            </w:r>
+            <w:r>
+              <w:rPr>
+                <w:rFonts w:ascii="Times New Roman" w:hAnsi="Times New Roman"/>
+                <w:szCs w:val="24"/>
+                <w:lang w:val="fr-CH"/>
+              </w:rPr>
+              <w:t>de</w:t>
+            </w:r>
+            <w:r>
+              <w:rPr>
+                <w:rFonts w:ascii="Times New Roman" w:hAnsi="Times New Roman"/>
+                <w:szCs w:val="24"/>
+                <w:lang w:val="fr-CH"/>
+              </w:rPr>
+              <w:t xml:space="preserve"> la</w:t>
+            </w:r>
+            <w:r>
+              <w:rPr>
+                <w:rFonts w:ascii="Times New Roman" w:hAnsi="Times New Roman"/>
+                <w:szCs w:val="24"/>
+                <w:lang w:val="fr-CH"/>
+              </w:rPr>
+              <w:t xml:space="preserve"> communauté linguistique </w:t>
+            </w:r>
+            <w:r>
+              <w:rPr>
+                <w:rFonts w:ascii="Times New Roman" w:hAnsi="Times New Roman"/>
+                <w:szCs w:val="24"/>
+                <w:lang w:val="fr-CH"/>
+              </w:rPr>
+              <w:t>allemande</w:t>
             </w:r>
           </w:p>
         </w:tc>
@@ -2268,15 +2308,39 @@
                 <w:szCs w:val="24"/>
                 <w:lang w:val="fr-CH"/>
               </w:rPr>
-              <w:t xml:space="preserve">Représentation des communautés linguistiques </w:t>
-            </w:r>
-            <w:r>
-              <w:rPr>
-                <w:rFonts w:ascii="Times New Roman" w:hAnsi="Times New Roman"/>
-                <w:szCs w:val="24"/>
-                <w:lang w:val="fr-CH"/>
-              </w:rPr>
-              <w:t>germanophones</w:t>
+              <w:t xml:space="preserve">Représentation </w:t>
+            </w:r>
+            <w:r>
+              <w:rPr>
+                <w:rFonts w:ascii="Times New Roman" w:hAnsi="Times New Roman"/>
+                <w:szCs w:val="24"/>
+                <w:lang w:val="fr-CH"/>
+              </w:rPr>
+              <w:t>de</w:t>
+            </w:r>
+            <w:r>
+              <w:rPr>
+                <w:rFonts w:ascii="Times New Roman" w:hAnsi="Times New Roman"/>
+                <w:szCs w:val="24"/>
+                <w:lang w:val="fr-CH"/>
+              </w:rPr>
+              <w:t xml:space="preserve"> la</w:t>
+            </w:r>
+            <w:r>
+              <w:rPr>
+                <w:rFonts w:ascii="Times New Roman" w:hAnsi="Times New Roman"/>
+                <w:szCs w:val="24"/>
+                <w:lang w:val="fr-CH"/>
+              </w:rPr>
+              <w:t xml:space="preserve"> communauté linguistique </w:t>
+            </w:r>
+            <w:r>
+              <w:rPr>
+                <w:rFonts w:ascii="Times New Roman" w:hAnsi="Times New Roman"/>
+                <w:szCs w:val="24"/>
+                <w:lang w:val="fr-CH"/>
+              </w:rPr>
+              <w:t>allemande</w:t>
             </w:r>
           </w:p>
         </w:tc>
@@ -2402,18 +2466,29 @@
             <w:r>
               <w:rPr>
                 <w:rFonts w:ascii="Times New Roman" w:hAnsi="Times New Roman"/>
-                <w:szCs w:val="24"/>
-                <w:lang w:val="fr-CH"/>
-              </w:rPr>
-              <w:t xml:space="preserve">Représentation des communautés linguistiques </w:t>
-            </w:r>
-            <w:r>
-              <w:rPr>
-                <w:rFonts w:ascii="Times New Roman" w:hAnsi="Times New Roman"/>
-                <w:szCs w:val="24"/>
-                <w:lang w:val="fr-CH"/>
-              </w:rPr>
-              <w:t>francophones</w:t>
+                <w:bCs/>
+                <w:szCs w:val="24"/>
+                <w:lang w:val="fr-CH"/>
+              </w:rPr>
+              <w:t>Représentation de</w:t>
+            </w:r>
+            <w:r>
+              <w:rPr>
+                <w:rFonts w:ascii="Times New Roman" w:hAnsi="Times New Roman"/>
+                <w:bCs/>
+                <w:szCs w:val="24"/>
+                <w:lang w:val="fr-CH"/>
+              </w:rPr>
+              <w:t xml:space="preserve"> la communauté linguistique </w:t>
+            </w:r>
+            <w:r>
+              <w:rPr>
+                <w:rFonts w:ascii="Times New Roman" w:hAnsi="Times New Roman"/>
+                <w:bCs/>
+                <w:szCs w:val="24"/>
+                <w:lang w:val="fr-CH"/>
+              </w:rPr>
+              <w:t>française</w:t>
             </w:r>
           </w:p>
         </w:tc>
@@ -2551,15 +2626,25 @@
                 <w:szCs w:val="24"/>
                 <w:lang w:val="fr-CH"/>
               </w:rPr>
-              <w:t xml:space="preserve">Représentation des communautés linguistiques </w:t>
-            </w:r>
-            <w:r>
-              <w:rPr>
-                <w:rFonts w:ascii="Times New Roman" w:hAnsi="Times New Roman"/>
-                <w:szCs w:val="24"/>
-                <w:lang w:val="fr-CH"/>
-              </w:rPr>
-              <w:t>francophones</w:t>
+              <w:t xml:space="preserve">Représentation </w:t>
+            </w:r>
+            <w:r>
+              <w:rPr>
+                <w:rFonts w:ascii="Times New Roman" w:hAnsi="Times New Roman"/>
+                <w:bCs/>
+                <w:szCs w:val="24"/>
+                <w:lang w:val="fr-CH"/>
+              </w:rPr>
+              <w:t xml:space="preserve">de la communauté linguistique </w:t>
+            </w:r>
+            <w:r>
+              <w:rPr>
+                <w:rFonts w:ascii="Times New Roman" w:hAnsi="Times New Roman"/>
+                <w:bCs/>
+                <w:szCs w:val="24"/>
+                <w:lang w:val="fr-CH"/>
+              </w:rPr>
+              <w:t>française</w:t>
             </w:r>
           </w:p>
         </w:tc>
@@ -2688,15 +2773,25 @@
                 <w:szCs w:val="24"/>
                 <w:lang w:val="fr-CH"/>
               </w:rPr>
-              <w:t xml:space="preserve">Représentation des communautés linguistiques </w:t>
-            </w:r>
-            <w:r>
-              <w:rPr>
-                <w:rFonts w:ascii="Times New Roman" w:hAnsi="Times New Roman"/>
-                <w:szCs w:val="24"/>
-                <w:lang w:val="fr-CH"/>
-              </w:rPr>
-              <w:t>francophones</w:t>
+              <w:t xml:space="preserve">Représentation </w:t>
+            </w:r>
+            <w:r>
+              <w:rPr>
+                <w:rFonts w:ascii="Times New Roman" w:hAnsi="Times New Roman"/>
+                <w:bCs/>
+                <w:szCs w:val="24"/>
+                <w:lang w:val="fr-CH"/>
+              </w:rPr>
+              <w:t xml:space="preserve">de la communauté linguistique </w:t>
+            </w:r>
+            <w:r>
+              <w:rPr>
+                <w:rFonts w:ascii="Times New Roman" w:hAnsi="Times New Roman"/>
+                <w:bCs/>
+                <w:szCs w:val="24"/>
+                <w:lang w:val="fr-CH"/>
+              </w:rPr>
+              <w:t>française</w:t>
             </w:r>
           </w:p>
         </w:tc>
@@ -2825,15 +2920,32 @@
                 <w:szCs w:val="24"/>
                 <w:lang w:val="fr-CH"/>
               </w:rPr>
-              <w:t xml:space="preserve">Représentation des communautés linguistiques </w:t>
-            </w:r>
-            <w:r>
-              <w:rPr>
-                <w:rFonts w:ascii="Times New Roman" w:hAnsi="Times New Roman"/>
-                <w:szCs w:val="24"/>
-                <w:lang w:val="fr-CH"/>
-              </w:rPr>
-              <w:t>italiennes</w:t>
+              <w:t xml:space="preserve">Représentation </w:t>
+            </w:r>
+            <w:r>
+              <w:rPr>
+                <w:rFonts w:ascii="Times New Roman" w:hAnsi="Times New Roman"/>
+                <w:bCs/>
+                <w:szCs w:val="24"/>
+                <w:lang w:val="fr-CH"/>
+              </w:rPr>
+              <w:t>de la communauté linguistique</w:t>
+            </w:r>
+            <w:r>
+              <w:rPr>
+                <w:rFonts w:ascii="Times New Roman" w:hAnsi="Times New Roman"/>
+                <w:szCs w:val="24"/>
+                <w:lang w:val="fr-CH"/>
+              </w:rPr>
+              <w:t xml:space="preserve"> </w:t>
+            </w:r>
+            <w:r>
+              <w:rPr>
+                <w:rFonts w:ascii="Times New Roman" w:hAnsi="Times New Roman"/>
+                <w:szCs w:val="24"/>
+                <w:lang w:val="fr-CH"/>
+              </w:rPr>
+              <w:t>italienne</w:t>
             </w:r>
           </w:p>
         </w:tc>
@@ -2979,23 +3091,32 @@
                 <w:szCs w:val="24"/>
                 <w:lang w:val="fr-CH"/>
               </w:rPr>
-              <w:t xml:space="preserve">&gt;Représentation des communautés linguistiques </w:t>
-            </w:r>
-            <w:r>
-              <w:rPr>
-                <w:rFonts w:ascii="Times New Roman" w:hAnsi="Times New Roman"/>
-                <w:szCs w:val="24"/>
-                <w:lang w:val="fr-CH"/>
-              </w:rPr>
-              <w:t>i</w:t>
-            </w:r>
-            <w:r>
-              <w:rPr>
-                <w:rFonts w:ascii="Times New Roman" w:hAnsi="Times New Roman"/>
-                <w:szCs w:val="24"/>
-                <w:lang w:val="fr-CH"/>
-              </w:rPr>
-              <w:t>taliennes</w:t>
+              <w:t xml:space="preserve">Représentation </w:t>
+            </w:r>
+            <w:r>
+              <w:rPr>
+                <w:rFonts w:ascii="Times New Roman" w:hAnsi="Times New Roman"/>
+                <w:bCs/>
+                <w:szCs w:val="24"/>
+                <w:lang w:val="fr-CH"/>
+              </w:rPr>
+              <w:t>de la communauté linguistique</w:t>
+            </w:r>
+            <w:r>
+              <w:rPr>
+                <w:rFonts w:ascii="Times New Roman" w:hAnsi="Times New Roman"/>
+                <w:szCs w:val="24"/>
+                <w:lang w:val="fr-CH"/>
+              </w:rPr>
+              <w:t xml:space="preserve"> </w:t>
+            </w:r>
+            <w:r>
+              <w:rPr>
+                <w:rFonts w:ascii="Times New Roman" w:hAnsi="Times New Roman"/>
+                <w:szCs w:val="24"/>
+                <w:lang w:val="fr-CH"/>
+              </w:rPr>
+              <w:t>italienne</w:t>
             </w:r>
           </w:p>
         </w:tc>
@@ -3124,23 +3245,32 @@
                 <w:szCs w:val="24"/>
                 <w:lang w:val="fr-CH"/>
               </w:rPr>
-              <w:t xml:space="preserve">Représentation des communautés linguistiques </w:t>
-            </w:r>
-            <w:r>
-              <w:rPr>
-                <w:rFonts w:ascii="Times New Roman" w:hAnsi="Times New Roman"/>
-                <w:szCs w:val="24"/>
-                <w:lang w:val="fr-CH"/>
-              </w:rPr>
-              <w:t>i</w:t>
-            </w:r>
-            <w:r>
-              <w:rPr>
-                <w:rFonts w:ascii="Times New Roman" w:hAnsi="Times New Roman"/>
-                <w:szCs w:val="24"/>
-                <w:lang w:val="fr-CH"/>
-              </w:rPr>
-              <w:t>taliennes</w:t>
+              <w:t xml:space="preserve">Représentation </w:t>
+            </w:r>
+            <w:r>
+              <w:rPr>
+                <w:rFonts w:ascii="Times New Roman" w:hAnsi="Times New Roman"/>
+                <w:bCs/>
+                <w:szCs w:val="24"/>
+                <w:lang w:val="fr-CH"/>
+              </w:rPr>
+              <w:t>de la communauté linguistique</w:t>
+            </w:r>
+            <w:r>
+              <w:rPr>
+                <w:rFonts w:ascii="Times New Roman" w:hAnsi="Times New Roman"/>
+                <w:szCs w:val="24"/>
+                <w:lang w:val="fr-CH"/>
+              </w:rPr>
+              <w:t xml:space="preserve"> </w:t>
+            </w:r>
+            <w:r>
+              <w:rPr>
+                <w:rFonts w:ascii="Times New Roman" w:hAnsi="Times New Roman"/>
+                <w:szCs w:val="24"/>
+                <w:lang w:val="fr-CH"/>
+              </w:rPr>
+              <w:t>italienne</w:t>
             </w:r>
           </w:p>
         </w:tc>
@@ -3742,6 +3872,349 @@
       <w:r>
         <w:rPr>
           <w:rFonts w:ascii="Times New Roman" w:hAnsi="Times New Roman"/>
+          <w:szCs w:val="24"/>
+          <w:lang w:val="en-US"/>
+        </w:rPr>
+        <w:t>&lt;&lt;/foreach&gt;&gt;</w:t>
+      </w:r>
+    </w:p>
+    <w:p>
+      <w:pPr>
+        <w:rPr>
+          <w:rFonts w:ascii="Times New Roman" w:eastAsia="Calibri" w:hAnsi="Times New Roman"/>
+          <w:sz w:val="22"/>
+          <w:szCs w:val="24"/>
+          <w:lang w:val="en-US"/>
+        </w:rPr>
+      </w:pPr>
+      <w:r>
+        <w:rPr>
+          <w:rFonts w:ascii="Times New Roman" w:hAnsi="Times New Roman"/>
+          <w:szCs w:val="24"/>
+          <w:lang w:val="en-US"/>
+        </w:rPr>
+        <w:br w:type="page"/>
+      </w:r>
+    </w:p>
+    <w:p>
+      <w:pPr>
+        <w:pStyle w:val="berschrift1"/>
+        <w:ind w:left="431" w:hanging="431"/>
+        <w:rPr>
+          <w:rFonts w:ascii="Times New Roman" w:hAnsi="Times New Roman" w:cs="Times New Roman"/>
+          <w:lang w:val="en-US"/>
+        </w:rPr>
+      </w:pPr>
+      <w:r>
+        <w:rPr>
+          <w:rFonts w:ascii="Times New Roman" w:hAnsi="Times New Roman" w:cs="Times New Roman"/>
+          <w:lang w:val="en-US"/>
+        </w:rPr>
+        <w:lastRenderedPageBreak/>
+        <w:t>Organes nouvellement créés</w:t>
+      </w:r>
+    </w:p>
+    <w:p>
+      <w:pPr>
+        <w:jc w:val="both"/>
+        <w:rPr>
+          <w:rFonts w:ascii="Times New Roman" w:hAnsi="Times New Roman"/>
+          <w:szCs w:val="24"/>
+          <w:lang w:val="en-US"/>
+        </w:rPr>
+      </w:pPr>
+      <w:r>
+        <w:rPr>
+          <w:rFonts w:ascii="Times New Roman" w:hAnsi="Times New Roman"/>
+          <w:szCs w:val="24"/>
+          <w:lang w:val="en-US"/>
+        </w:rPr>
+        <w:t>&lt;&lt;foreach [newCommittee in compareList.newCommittees]&gt;&gt;</w:t>
+      </w:r>
+    </w:p>
+    <w:p>
+      <w:pPr>
+        <w:rPr>
+          <w:rFonts w:ascii="Times New Roman" w:hAnsi="Times New Roman"/>
+          <w:lang w:val="en-US"/>
+        </w:rPr>
+      </w:pPr>
+    </w:p>
+    <w:p>
+      <w:pPr>
+        <w:pStyle w:val="berschrift2"/>
+        <w:rPr>
+          <w:rFonts w:ascii="Times New Roman" w:hAnsi="Times New Roman" w:cs="Times New Roman"/>
+        </w:rPr>
+      </w:pPr>
+      <w:r>
+        <w:rPr>
+          <w:rFonts w:ascii="Times New Roman" w:hAnsi="Times New Roman" w:cs="Times New Roman"/>
+        </w:rPr>
+        <w:t>&lt;&lt;[</w:t>
+      </w:r>
+      <w:r>
+        <w:rPr>
+          <w:rFonts w:ascii="Times New Roman" w:hAnsi="Times New Roman" w:cs="Times New Roman"/>
+          <w:lang w:val="en-US"/>
+        </w:rPr>
+        <w:t>newCommittee</w:t>
+      </w:r>
+      <w:r>
+        <w:rPr>
+          <w:rFonts w:ascii="Times New Roman" w:hAnsi="Times New Roman" w:cs="Times New Roman"/>
+        </w:rPr>
+        <w:t>.name]&gt;&gt;</w:t>
+      </w:r>
+    </w:p>
+    <w:p>
+      <w:pPr>
+        <w:jc w:val="both"/>
+        <w:rPr>
+          <w:rFonts w:ascii="Times New Roman" w:hAnsi="Times New Roman"/>
+          <w:szCs w:val="24"/>
+          <w:lang w:val="fr-CH"/>
+        </w:rPr>
+      </w:pPr>
+      <w:r>
+        <w:rPr>
+          <w:rFonts w:ascii="Times New Roman" w:hAnsi="Times New Roman"/>
+          <w:szCs w:val="24"/>
+          <w:lang w:val="fr-CH"/>
+        </w:rPr>
+        <w:t>Date de début: &lt;&lt;[newCommittee.startDate] :"dd.MM.yyyy"&gt;&gt;</w:t>
+      </w:r>
+    </w:p>
+    <w:p>
+      <w:pPr>
+        <w:pStyle w:val="Listenabsatz"/>
+        <w:ind w:left="0"/>
+        <w:jc w:val="both"/>
+        <w:rPr>
+          <w:rFonts w:ascii="Times New Roman" w:hAnsi="Times New Roman"/>
+          <w:sz w:val="24"/>
+          <w:szCs w:val="24"/>
+          <w:lang w:val="fr-CH"/>
+        </w:rPr>
+      </w:pPr>
+      <w:r>
+        <w:rPr>
+          <w:rFonts w:ascii="Times New Roman" w:hAnsi="Times New Roman"/>
+          <w:sz w:val="24"/>
+          <w:szCs w:val="24"/>
+          <w:lang w:val="fr-CH"/>
+        </w:rPr>
+        <w:t>Nombre de membres: &lt;&lt;[newCommittee.memberCount]&gt;&gt;</w:t>
+      </w:r>
+    </w:p>
+    <w:p>
+      <w:pPr>
+        <w:pStyle w:val="Listenabsatz"/>
+        <w:ind w:left="0"/>
+        <w:jc w:val="both"/>
+        <w:rPr>
+          <w:rFonts w:ascii="Times New Roman" w:hAnsi="Times New Roman"/>
+          <w:sz w:val="24"/>
+          <w:szCs w:val="24"/>
+          <w:lang w:val="fr-CH"/>
+        </w:rPr>
+      </w:pPr>
+      <w:r>
+        <w:rPr>
+          <w:rFonts w:ascii="Times New Roman" w:hAnsi="Times New Roman"/>
+          <w:sz w:val="24"/>
+          <w:szCs w:val="24"/>
+          <w:lang w:val="fr-CH"/>
+        </w:rPr>
+        <w:t>Représentation des sexes</w:t>
+      </w:r>
+      <w:r>
+        <w:rPr>
+          <w:rFonts w:ascii="Times New Roman" w:hAnsi="Times New Roman"/>
+          <w:sz w:val="24"/>
+          <w:szCs w:val="24"/>
+          <w:lang w:val="fr-CH"/>
+        </w:rPr>
+        <w:t>: &lt;&lt;[newCommittee.genderQuota]&gt;&gt;</w:t>
+      </w:r>
+    </w:p>
+    <w:p>
+      <w:pPr>
+        <w:pStyle w:val="Listenabsatz"/>
+        <w:ind w:left="0"/>
+        <w:jc w:val="both"/>
+        <w:rPr>
+          <w:rFonts w:ascii="Times New Roman" w:hAnsi="Times New Roman"/>
+          <w:sz w:val="24"/>
+          <w:szCs w:val="24"/>
+          <w:lang w:val="fr-CH"/>
+        </w:rPr>
+      </w:pPr>
+      <w:r>
+        <w:rPr>
+          <w:rFonts w:ascii="Times New Roman" w:hAnsi="Times New Roman"/>
+          <w:sz w:val="24"/>
+          <w:szCs w:val="24"/>
+          <w:lang w:val="fr-CH"/>
+        </w:rPr>
+        <w:t xml:space="preserve">Représentation des communautés </w:t>
+      </w:r>
+      <w:r>
+        <w:rPr>
+          <w:rFonts w:ascii="Times New Roman" w:hAnsi="Times New Roman"/>
+          <w:sz w:val="24"/>
+          <w:szCs w:val="24"/>
+          <w:lang w:val="fr-CH"/>
+        </w:rPr>
+        <w:t>linguistiques</w:t>
+      </w:r>
+      <w:r>
+        <w:rPr>
+          <w:rFonts w:ascii="Times New Roman" w:hAnsi="Times New Roman"/>
+          <w:sz w:val="24"/>
+          <w:szCs w:val="24"/>
+          <w:lang w:val="fr-CH"/>
+        </w:rPr>
+        <w:t>: &lt;&lt;[newCommittee.languageQuota]&gt;&gt;</w:t>
+      </w:r>
+    </w:p>
+    <w:p>
+      <w:pPr>
+        <w:pStyle w:val="Listenabsatz"/>
+        <w:ind w:left="0"/>
+        <w:jc w:val="both"/>
+        <w:rPr>
+          <w:rFonts w:ascii="Times New Roman" w:hAnsi="Times New Roman"/>
+          <w:sz w:val="24"/>
+          <w:szCs w:val="24"/>
+          <w:lang w:val="it-CH"/>
+        </w:rPr>
+      </w:pPr>
+      <w:r>
+        <w:rPr>
+          <w:rFonts w:ascii="Times New Roman" w:hAnsi="Times New Roman"/>
+          <w:sz w:val="24"/>
+          <w:szCs w:val="24"/>
+          <w:lang w:val="it-CH"/>
+        </w:rPr>
+        <w:t>&lt;&lt;/foreach&gt;&gt;</w:t>
+      </w:r>
+    </w:p>
+    <w:p>
+      <w:pPr>
+        <w:pStyle w:val="Listenabsatz"/>
+        <w:ind w:left="0"/>
+        <w:jc w:val="both"/>
+        <w:rPr>
+          <w:rFonts w:ascii="Times New Roman" w:hAnsi="Times New Roman"/>
+          <w:szCs w:val="24"/>
+          <w:lang w:val="it-CH"/>
+        </w:rPr>
+      </w:pPr>
+    </w:p>
+    <w:p>
+      <w:pPr>
+        <w:pStyle w:val="berschrift1"/>
+        <w:rPr>
+          <w:rFonts w:ascii="Times New Roman" w:hAnsi="Times New Roman" w:cs="Times New Roman"/>
+          <w:lang w:val="en-US"/>
+        </w:rPr>
+      </w:pPr>
+      <w:r>
+        <w:rPr>
+          <w:rFonts w:ascii="Times New Roman" w:hAnsi="Times New Roman" w:cs="Times New Roman"/>
+          <w:lang w:val="en-US"/>
+        </w:rPr>
+        <w:t>Organes dissous</w:t>
+      </w:r>
+    </w:p>
+    <w:p>
+      <w:pPr>
+        <w:jc w:val="both"/>
+        <w:rPr>
+          <w:rFonts w:ascii="Times New Roman" w:hAnsi="Times New Roman"/>
+          <w:szCs w:val="24"/>
+          <w:lang w:val="en-US"/>
+        </w:rPr>
+      </w:pPr>
+      <w:r>
+        <w:rPr>
+          <w:rFonts w:ascii="Times New Roman" w:hAnsi="Times New Roman"/>
+          <w:szCs w:val="24"/>
+          <w:lang w:val="en-US"/>
+        </w:rPr>
+        <w:t>&lt;&lt;foreach [formerCommittee in compareList.formerCommittees]&gt;&gt;</w:t>
+      </w:r>
+    </w:p>
+    <w:p>
+      <w:pPr>
+        <w:rPr>
+          <w:rFonts w:ascii="Times New Roman" w:hAnsi="Times New Roman"/>
+          <w:lang w:val="en-US"/>
+        </w:rPr>
+      </w:pPr>
+    </w:p>
+    <w:p>
+      <w:pPr>
+        <w:pStyle w:val="berschrift2"/>
+        <w:rPr>
+          <w:rFonts w:ascii="Times New Roman" w:hAnsi="Times New Roman" w:cs="Times New Roman"/>
+        </w:rPr>
+      </w:pPr>
+      <w:r>
+        <w:rPr>
+          <w:rFonts w:ascii="Times New Roman" w:hAnsi="Times New Roman" w:cs="Times New Roman"/>
+        </w:rPr>
+        <w:t>&lt;&lt;[</w:t>
+      </w:r>
+      <w:r>
+        <w:rPr>
+          <w:rFonts w:ascii="Times New Roman" w:hAnsi="Times New Roman" w:cs="Times New Roman"/>
+          <w:lang w:val="en-US"/>
+        </w:rPr>
+        <w:t>formerCommittee</w:t>
+      </w:r>
+      <w:r>
+        <w:rPr>
+          <w:rFonts w:ascii="Times New Roman" w:hAnsi="Times New Roman" w:cs="Times New Roman"/>
+        </w:rPr>
+        <w:t>.name]&gt;&gt;</w:t>
+      </w:r>
+    </w:p>
+    <w:p>
+      <w:pPr>
+        <w:jc w:val="both"/>
+        <w:rPr>
+          <w:rFonts w:ascii="Times New Roman" w:hAnsi="Times New Roman"/>
+          <w:szCs w:val="24"/>
+          <w:lang w:val="fr-CH"/>
+        </w:rPr>
+      </w:pPr>
+      <w:r>
+        <w:rPr>
+          <w:rFonts w:ascii="Times New Roman" w:hAnsi="Times New Roman"/>
+          <w:szCs w:val="24"/>
+          <w:lang w:val="fr-CH"/>
+        </w:rPr>
+        <w:t>Date de fin: &lt;&lt;[formerCommittee.endDate] :"dd.MM.yyyy"&gt;&gt;</w:t>
+      </w:r>
+    </w:p>
+    <w:p>
+      <w:pPr>
+        <w:pStyle w:val="Listenabsatz"/>
+        <w:ind w:left="0"/>
+        <w:jc w:val="both"/>
+        <w:rPr>
+          <w:rFonts w:ascii="Times New Roman" w:hAnsi="Times New Roman"/>
+          <w:sz w:val="24"/>
+          <w:szCs w:val="24"/>
+          <w:lang w:val="en-US"/>
+        </w:rPr>
+      </w:pPr>
+      <w:r>
+        <w:rPr>
+          <w:rFonts w:ascii="Times New Roman" w:hAnsi="Times New Roman"/>
+          <w:sz w:val="24"/>
           <w:szCs w:val="24"/>
           <w:lang w:val="en-US"/>
         </w:rPr>
@@ -6074,6 +6547,9 @@
   <w:num w:numId="41" w16cid:durableId="993143293">
     <w:abstractNumId w:val="3"/>
   </w:num>
+  <w:num w:numId="42" w16cid:durableId="869420019">
+    <w:abstractNumId w:val="5"/>
+  </w:num>
   <w:numIdMacAtCleanup w:val="10"/>
 </w:numbering>
 </file>
@@ -6410,7 +6886,6 @@
         <w:numId w:val="10"/>
       </w:numPr>
       <w:spacing w:line="340" w:lineRule="exact"/>
-      <w:ind w:left="431" w:hanging="431"/>
       <w:outlineLvl w:val="0"/>
     </w:pPr>
     <w:rPr>
@@ -6645,7 +7120,6 @@
   <w:style w:type="character" w:default="1" w:styleId="Absatz-Standardschriftart">
     <w:name w:val="Default Paragraph Font"/>
     <w:uiPriority w:val="1"/>
-    <w:semiHidden/>
     <w:unhideWhenUsed/>
   </w:style>
   <w:style w:type="table" w:default="1" w:styleId="NormaleTabelle">

</xml_diff>

<commit_message>
feat: fix data selection issues with compare list report #BKDO-4609
</commit_message>
<xml_diff>
--- a/src/Bk.APG.Api/Templates/Compare_List_French.docx
+++ b/src/Bk.APG.Api/Templates/Compare_List_French.docx
@@ -1,6 +1,6 @@
 
 <file path=word/document.xml><?xml version="1.0" encoding="utf-8"?>
-<w:document xmlns:wpc="http://schemas.microsoft.com/office/word/2010/wordprocessingCanvas" xmlns:cx="http://schemas.microsoft.com/office/drawing/2014/chartex" xmlns:cx1="http://schemas.microsoft.com/office/drawing/2015/9/8/chartex" xmlns:cx2="http://schemas.microsoft.com/office/drawing/2015/10/21/chartex" xmlns:cx3="http://schemas.microsoft.com/office/drawing/2016/5/9/chartex" xmlns:cx4="http://schemas.microsoft.com/office/drawing/2016/5/10/chartex" xmlns:cx5="http://schemas.microsoft.com/office/drawing/2016/5/11/chartex" xmlns:cx6="http://schemas.microsoft.com/office/drawing/2016/5/12/chartex" xmlns:cx7="http://schemas.microsoft.com/office/drawing/2016/5/13/chartex" xmlns:cx8="http://schemas.microsoft.com/office/drawing/2016/5/14/chartex" xmlns:mc="http://schemas.openxmlformats.org/markup-compatibility/2006" xmlns:aink="http://schemas.microsoft.com/office/drawing/2016/ink" xmlns:am3d="http://schemas.microsoft.com/office/drawing/2017/model3d" xmlns:o="urn:schemas-microsoft-com:office:office" xmlns:oel="http://schemas.microsoft.com/office/2019/extlst" xmlns:r="http://schemas.openxmlformats.org/officeDocument/2006/relationships" xmlns:m="http://schemas.openxmlformats.org/officeDocument/2006/math" xmlns:v="urn:schemas-microsoft-com:vml" xmlns:wp14="http://schemas.microsoft.com/office/word/2010/wordprocessingDrawing" xmlns:wp="http://schemas.openxmlformats.org/drawingml/2006/wordprocessingDrawing" xmlns:w10="urn:schemas-microsoft-com:office:word" xmlns:w="http://schemas.openxmlformats.org/wordprocessingml/2006/main" xmlns:w14="http://schemas.microsoft.com/office/word/2010/wordml" xmlns:w15="http://schemas.microsoft.com/office/word/2012/wordml" xmlns:w16cex="http://schemas.microsoft.com/office/word/2018/wordml/cex" xmlns:w16cid="http://schemas.microsoft.com/office/word/2016/wordml/cid" xmlns:w16="http://schemas.microsoft.com/office/word/2018/wordml" xmlns:w16du="http://schemas.microsoft.com/office/word/2023/wordml/word16du" xmlns:w16sdtdh="http://schemas.microsoft.com/office/word/2020/wordml/sdtdatahash" xmlns:w16sdtfl="http://schemas.microsoft.com/office/word/2024/wordml/sdtformatlock" xmlns:w16se="http://schemas.microsoft.com/office/word/2015/wordml/symex" xmlns:wpg="http://schemas.microsoft.com/office/word/2010/wordprocessingGroup" xmlns:wpi="http://schemas.microsoft.com/office/word/2010/wordprocessingInk" xmlns:wne="http://schemas.microsoft.com/office/word/2006/wordml" xmlns:wps="http://schemas.microsoft.com/office/word/2010/wordprocessingShape" mc:Ignorable="w14 w15 w16se w16cid w16 w16cex w16sdtdh w16sdtfl w16du wp14">
+<w:document xmlns:wpc="http://schemas.microsoft.com/office/word/2010/wordprocessingCanvas" xmlns:cx="http://schemas.microsoft.com/office/drawing/2014/chartex" xmlns:cx1="http://schemas.microsoft.com/office/drawing/2015/9/8/chartex" xmlns:cx2="http://schemas.microsoft.com/office/drawing/2015/10/21/chartex" xmlns:cx3="http://schemas.microsoft.com/office/drawing/2016/5/9/chartex" xmlns:cx4="http://schemas.microsoft.com/office/drawing/2016/5/10/chartex" xmlns:cx5="http://schemas.microsoft.com/office/drawing/2016/5/11/chartex" xmlns:cx6="http://schemas.microsoft.com/office/drawing/2016/5/12/chartex" xmlns:cx7="http://schemas.microsoft.com/office/drawing/2016/5/13/chartex" xmlns:cx8="http://schemas.microsoft.com/office/drawing/2016/5/14/chartex" xmlns:mc="http://schemas.openxmlformats.org/markup-compatibility/2006" xmlns:aink="http://schemas.microsoft.com/office/drawing/2016/ink" xmlns:am3d="http://schemas.microsoft.com/office/drawing/2017/model3d" xmlns:o="urn:schemas-microsoft-com:office:office" xmlns:oel="http://schemas.microsoft.com/office/2019/extlst" xmlns:r="http://schemas.openxmlformats.org/officeDocument/2006/relationships" xmlns:m="http://schemas.openxmlformats.org/officeDocument/2006/math" xmlns:v="urn:schemas-microsoft-com:vml" xmlns:wp14="http://schemas.microsoft.com/office/word/2010/wordprocessingDrawing" xmlns:wp="http://schemas.openxmlformats.org/drawingml/2006/wordprocessingDrawing" xmlns:w10="urn:schemas-microsoft-com:office:word" xmlns:w="http://schemas.openxmlformats.org/wordprocessingml/2006/main" xmlns:w14="http://schemas.microsoft.com/office/word/2010/wordml" xmlns:w15="http://schemas.microsoft.com/office/word/2012/wordml" xmlns:w16cei="http://schemas.microsoft.com/office/word/2026/wordml/cei" xmlns:w16cex="http://schemas.microsoft.com/office/word/2018/wordml/cex" xmlns:w16cid="http://schemas.microsoft.com/office/word/2016/wordml/cid" xmlns:w16="http://schemas.microsoft.com/office/word/2018/wordml" xmlns:w16du="http://schemas.microsoft.com/office/word/2023/wordml/word16du" xmlns:w16sdtdh="http://schemas.microsoft.com/office/word/2020/wordml/sdtdatahash" xmlns:w16sdtfl="http://schemas.microsoft.com/office/word/2024/wordml/sdtformatlock" xmlns:w16se="http://schemas.microsoft.com/office/word/2015/wordml/symex" xmlns:wpg="http://schemas.microsoft.com/office/word/2010/wordprocessingGroup" xmlns:wpi="http://schemas.microsoft.com/office/word/2010/wordprocessingInk" xmlns:wne="http://schemas.microsoft.com/office/word/2006/wordml" xmlns:wps="http://schemas.microsoft.com/office/word/2010/wordprocessingShape" mc:Ignorable="w14 w15 w16se w16cid w16 w16cex w16sdtdh w16sdtfl w16du wp14">
   <w:body>
     <w:p>
       <w:pPr>
@@ -53,7 +53,6 @@
         <w:rPr>
           <w:rFonts w:ascii="Times New Roman" w:hAnsi="Times New Roman"/>
           <w:szCs w:val="15"/>
-          <w:lang w:val="fr-CH"/>
         </w:rPr>
         <w:t>Chancellerie fédérale ChF</w:t>
       </w:r>
@@ -210,7 +209,7 @@
           <w:i/>
           <w:iCs/>
         </w:rPr>
-        <w:instrText xml:space="preserve"> TOC \o "1-2" \h \z \u </w:instrText>
+        <w:instrText xml:space="preserve"> TOC \o "1-</w:instrText>
       </w:r>
       <w:r>
         <w:rPr>
@@ -218,9 +217,25 @@
           <w:i/>
           <w:iCs/>
         </w:rPr>
+        <w:instrText>3</w:instrText>
+      </w:r>
+      <w:r>
+        <w:rPr>
+          <w:rFonts w:ascii="Times New Roman" w:hAnsi="Times New Roman" w:cs="Times New Roman"/>
+          <w:i/>
+          <w:iCs/>
+        </w:rPr>
+        <w:instrText xml:space="preserve">" \h \z \u </w:instrText>
+      </w:r>
+      <w:r>
+        <w:rPr>
+          <w:rFonts w:ascii="Times New Roman" w:hAnsi="Times New Roman" w:cs="Times New Roman"/>
+          <w:i/>
+          <w:iCs/>
+        </w:rPr>
         <w:fldChar w:fldCharType="separate"/>
       </w:r>
-      <w:hyperlink w:anchor="_Toc231973780" w:history="1">
+      <w:hyperlink w:anchor="_Toc238569175" w:history="1">
         <w:r>
           <w:rPr>
             <w:rStyle w:val="Hyperlink"/>
@@ -269,7 +284,7 @@
             <w:noProof/>
             <w:webHidden/>
           </w:rPr>
-          <w:instrText xml:space="preserve"> PAGEREF _Toc231973780 \h </w:instrText>
+          <w:instrText xml:space="preserve"> PAGEREF _Toc238569175 \h </w:instrText>
         </w:r>
         <w:r>
           <w:rPr>
@@ -318,12 +333,13 @@
           <w14:ligatures w14:val="standardContextual"/>
         </w:rPr>
       </w:pPr>
-      <w:hyperlink w:anchor="_Toc231973781" w:history="1">
+      <w:hyperlink w:anchor="_Toc238569176" w:history="1">
         <w:r>
           <w:rPr>
             <w:rStyle w:val="Hyperlink"/>
             <w:rFonts w:ascii="Times New Roman" w:hAnsi="Times New Roman" w:cs="Times New Roman"/>
             <w:noProof/>
+            <w:lang w:val="fr-CH"/>
           </w:rPr>
           <w:t>1.1</w:t>
         </w:r>
@@ -345,8 +361,9 @@
             <w:rStyle w:val="Hyperlink"/>
             <w:rFonts w:ascii="Times New Roman" w:hAnsi="Times New Roman" w:cs="Times New Roman"/>
             <w:noProof/>
+            <w:lang w:val="fr-CH"/>
           </w:rPr>
-          <w:t>Im Geschäftsbereich des &lt;&lt;[department.name]&gt;&gt;</w:t>
+          <w:t>Domaine de compétence du &lt;&lt;[department.name]&gt;&gt;</w:t>
         </w:r>
         <w:r>
           <w:rPr>
@@ -367,7 +384,7 @@
             <w:noProof/>
             <w:webHidden/>
           </w:rPr>
-          <w:instrText xml:space="preserve"> PAGEREF _Toc231973781 \h </w:instrText>
+          <w:instrText xml:space="preserve"> PAGEREF _Toc238569176 \h </w:instrText>
         </w:r>
         <w:r>
           <w:rPr>
@@ -400,6 +417,505 @@
     </w:p>
     <w:p>
       <w:pPr>
+        <w:pStyle w:val="Verzeichnis3"/>
+        <w:rPr>
+          <w:rFonts w:eastAsiaTheme="minorEastAsia"/>
+          <w:kern w:val="2"/>
+          <w:sz w:val="24"/>
+          <w:szCs w:val="24"/>
+          <w14:ligatures w14:val="standardContextual"/>
+        </w:rPr>
+      </w:pPr>
+      <w:hyperlink w:anchor="_Toc238569177" w:history="1">
+        <w:r>
+          <w:rPr>
+            <w:rStyle w:val="Hyperlink"/>
+          </w:rPr>
+          <w:t>1.1.1</w:t>
+        </w:r>
+        <w:r>
+          <w:rPr>
+            <w:rFonts w:eastAsiaTheme="minorEastAsia"/>
+            <w:kern w:val="2"/>
+            <w:sz w:val="24"/>
+            <w:szCs w:val="24"/>
+            <w14:ligatures w14:val="standardContextual"/>
+          </w:rPr>
+          <w:tab/>
+        </w:r>
+        <w:r>
+          <w:rPr>
+            <w:rStyle w:val="Hyperlink"/>
+          </w:rPr>
+          <w:t>&lt;&lt;[committee.name]&gt;&gt;</w:t>
+        </w:r>
+        <w:r>
+          <w:rPr>
+            <w:webHidden/>
+          </w:rPr>
+          <w:tab/>
+        </w:r>
+        <w:r>
+          <w:rPr>
+            <w:webHidden/>
+          </w:rPr>
+          <w:fldChar w:fldCharType="begin"/>
+        </w:r>
+        <w:r>
+          <w:rPr>
+            <w:webHidden/>
+          </w:rPr>
+          <w:instrText xml:space="preserve"> PAGEREF _Toc238569177 \h </w:instrText>
+        </w:r>
+        <w:r>
+          <w:rPr>
+            <w:webHidden/>
+          </w:rPr>
+        </w:r>
+        <w:r>
+          <w:rPr>
+            <w:webHidden/>
+          </w:rPr>
+          <w:fldChar w:fldCharType="separate"/>
+        </w:r>
+        <w:r>
+          <w:rPr>
+            <w:webHidden/>
+          </w:rPr>
+          <w:t>2</w:t>
+        </w:r>
+        <w:r>
+          <w:rPr>
+            <w:webHidden/>
+          </w:rPr>
+          <w:fldChar w:fldCharType="end"/>
+        </w:r>
+      </w:hyperlink>
+    </w:p>
+    <w:p>
+      <w:pPr>
+        <w:pStyle w:val="Verzeichnis1"/>
+        <w:rPr>
+          <w:rFonts w:eastAsiaTheme="minorEastAsia" w:cstheme="minorBidi"/>
+          <w:b w:val="0"/>
+          <w:bCs w:val="0"/>
+          <w:noProof/>
+          <w:kern w:val="2"/>
+          <w:sz w:val="24"/>
+          <w:szCs w:val="24"/>
+          <w14:ligatures w14:val="standardContextual"/>
+        </w:rPr>
+      </w:pPr>
+      <w:hyperlink w:anchor="_Toc238569178" w:history="1">
+        <w:r>
+          <w:rPr>
+            <w:rStyle w:val="Hyperlink"/>
+            <w:rFonts w:ascii="Times New Roman" w:hAnsi="Times New Roman" w:cs="Times New Roman"/>
+            <w:noProof/>
+            <w:lang w:val="en-US"/>
+          </w:rPr>
+          <w:t>2</w:t>
+        </w:r>
+        <w:r>
+          <w:rPr>
+            <w:rFonts w:eastAsiaTheme="minorEastAsia" w:cstheme="minorBidi"/>
+            <w:b w:val="0"/>
+            <w:bCs w:val="0"/>
+            <w:noProof/>
+            <w:kern w:val="2"/>
+            <w:sz w:val="24"/>
+            <w:szCs w:val="24"/>
+            <w14:ligatures w14:val="standardContextual"/>
+          </w:rPr>
+          <w:tab/>
+        </w:r>
+        <w:r>
+          <w:rPr>
+            <w:rStyle w:val="Hyperlink"/>
+            <w:rFonts w:ascii="Times New Roman" w:hAnsi="Times New Roman" w:cs="Times New Roman"/>
+            <w:noProof/>
+            <w:lang w:val="en-US"/>
+          </w:rPr>
+          <w:t>Organes nouvellement créés</w:t>
+        </w:r>
+        <w:r>
+          <w:rPr>
+            <w:noProof/>
+            <w:webHidden/>
+          </w:rPr>
+          <w:tab/>
+        </w:r>
+        <w:r>
+          <w:rPr>
+            <w:noProof/>
+            <w:webHidden/>
+          </w:rPr>
+          <w:fldChar w:fldCharType="begin"/>
+        </w:r>
+        <w:r>
+          <w:rPr>
+            <w:noProof/>
+            <w:webHidden/>
+          </w:rPr>
+          <w:instrText xml:space="preserve"> PAGEREF _Toc238569178 \h </w:instrText>
+        </w:r>
+        <w:r>
+          <w:rPr>
+            <w:noProof/>
+            <w:webHidden/>
+          </w:rPr>
+        </w:r>
+        <w:r>
+          <w:rPr>
+            <w:noProof/>
+            <w:webHidden/>
+          </w:rPr>
+          <w:fldChar w:fldCharType="separate"/>
+        </w:r>
+        <w:r>
+          <w:rPr>
+            <w:noProof/>
+            <w:webHidden/>
+          </w:rPr>
+          <w:t>4</w:t>
+        </w:r>
+        <w:r>
+          <w:rPr>
+            <w:noProof/>
+            <w:webHidden/>
+          </w:rPr>
+          <w:fldChar w:fldCharType="end"/>
+        </w:r>
+      </w:hyperlink>
+    </w:p>
+    <w:p>
+      <w:pPr>
+        <w:pStyle w:val="Verzeichnis2"/>
+        <w:tabs>
+          <w:tab w:val="left" w:pos="960"/>
+          <w:tab w:val="right" w:leader="dot" w:pos="9061"/>
+        </w:tabs>
+        <w:rPr>
+          <w:rFonts w:eastAsiaTheme="minorEastAsia" w:cstheme="minorBidi"/>
+          <w:i w:val="0"/>
+          <w:iCs w:val="0"/>
+          <w:noProof/>
+          <w:kern w:val="2"/>
+          <w:sz w:val="24"/>
+          <w:szCs w:val="24"/>
+          <w14:ligatures w14:val="standardContextual"/>
+        </w:rPr>
+      </w:pPr>
+      <w:hyperlink w:anchor="_Toc238569179" w:history="1">
+        <w:r>
+          <w:rPr>
+            <w:rStyle w:val="Hyperlink"/>
+            <w:rFonts w:ascii="Times New Roman" w:hAnsi="Times New Roman" w:cs="Times New Roman"/>
+            <w:noProof/>
+          </w:rPr>
+          <w:t>2.1</w:t>
+        </w:r>
+        <w:r>
+          <w:rPr>
+            <w:rFonts w:eastAsiaTheme="minorEastAsia" w:cstheme="minorBidi"/>
+            <w:i w:val="0"/>
+            <w:iCs w:val="0"/>
+            <w:noProof/>
+            <w:kern w:val="2"/>
+            <w:sz w:val="24"/>
+            <w:szCs w:val="24"/>
+            <w14:ligatures w14:val="standardContextual"/>
+          </w:rPr>
+          <w:tab/>
+        </w:r>
+        <w:r>
+          <w:rPr>
+            <w:rStyle w:val="Hyperlink"/>
+            <w:rFonts w:ascii="Times New Roman" w:hAnsi="Times New Roman" w:cs="Times New Roman"/>
+            <w:noProof/>
+          </w:rPr>
+          <w:t>&lt;&lt;[</w:t>
+        </w:r>
+        <w:r>
+          <w:rPr>
+            <w:rStyle w:val="Hyperlink"/>
+            <w:rFonts w:ascii="Times New Roman" w:hAnsi="Times New Roman" w:cs="Times New Roman"/>
+            <w:noProof/>
+            <w:lang w:val="en-US"/>
+          </w:rPr>
+          <w:t>newCommittee</w:t>
+        </w:r>
+        <w:r>
+          <w:rPr>
+            <w:rStyle w:val="Hyperlink"/>
+            <w:rFonts w:ascii="Times New Roman" w:hAnsi="Times New Roman" w:cs="Times New Roman"/>
+            <w:noProof/>
+          </w:rPr>
+          <w:t>.name]&gt;&gt;</w:t>
+        </w:r>
+        <w:r>
+          <w:rPr>
+            <w:noProof/>
+            <w:webHidden/>
+          </w:rPr>
+          <w:tab/>
+        </w:r>
+        <w:r>
+          <w:rPr>
+            <w:noProof/>
+            <w:webHidden/>
+          </w:rPr>
+          <w:fldChar w:fldCharType="begin"/>
+        </w:r>
+        <w:r>
+          <w:rPr>
+            <w:noProof/>
+            <w:webHidden/>
+          </w:rPr>
+          <w:instrText xml:space="preserve"> PAGEREF _Toc238569179 \h </w:instrText>
+        </w:r>
+        <w:r>
+          <w:rPr>
+            <w:noProof/>
+            <w:webHidden/>
+          </w:rPr>
+        </w:r>
+        <w:r>
+          <w:rPr>
+            <w:noProof/>
+            <w:webHidden/>
+          </w:rPr>
+          <w:fldChar w:fldCharType="separate"/>
+        </w:r>
+        <w:r>
+          <w:rPr>
+            <w:noProof/>
+            <w:webHidden/>
+          </w:rPr>
+          <w:t>4</w:t>
+        </w:r>
+        <w:r>
+          <w:rPr>
+            <w:noProof/>
+            <w:webHidden/>
+          </w:rPr>
+          <w:fldChar w:fldCharType="end"/>
+        </w:r>
+      </w:hyperlink>
+    </w:p>
+    <w:p>
+      <w:pPr>
+        <w:pStyle w:val="Verzeichnis1"/>
+        <w:rPr>
+          <w:rFonts w:eastAsiaTheme="minorEastAsia" w:cstheme="minorBidi"/>
+          <w:b w:val="0"/>
+          <w:bCs w:val="0"/>
+          <w:noProof/>
+          <w:kern w:val="2"/>
+          <w:sz w:val="24"/>
+          <w:szCs w:val="24"/>
+          <w14:ligatures w14:val="standardContextual"/>
+        </w:rPr>
+      </w:pPr>
+      <w:hyperlink w:anchor="_Toc238569180" w:history="1">
+        <w:r>
+          <w:rPr>
+            <w:rStyle w:val="Hyperlink"/>
+            <w:rFonts w:ascii="Times New Roman" w:hAnsi="Times New Roman" w:cs="Times New Roman"/>
+            <w:noProof/>
+            <w:lang w:val="en-US"/>
+          </w:rPr>
+          <w:t>3</w:t>
+        </w:r>
+        <w:r>
+          <w:rPr>
+            <w:rFonts w:eastAsiaTheme="minorEastAsia" w:cstheme="minorBidi"/>
+            <w:b w:val="0"/>
+            <w:bCs w:val="0"/>
+            <w:noProof/>
+            <w:kern w:val="2"/>
+            <w:sz w:val="24"/>
+            <w:szCs w:val="24"/>
+            <w14:ligatures w14:val="standardContextual"/>
+          </w:rPr>
+          <w:tab/>
+        </w:r>
+        <w:r>
+          <w:rPr>
+            <w:rStyle w:val="Hyperlink"/>
+            <w:rFonts w:ascii="Times New Roman" w:hAnsi="Times New Roman" w:cs="Times New Roman"/>
+            <w:noProof/>
+            <w:lang w:val="en-US"/>
+          </w:rPr>
+          <w:t>Organes dissous</w:t>
+        </w:r>
+        <w:r>
+          <w:rPr>
+            <w:noProof/>
+            <w:webHidden/>
+          </w:rPr>
+          <w:tab/>
+        </w:r>
+        <w:r>
+          <w:rPr>
+            <w:noProof/>
+            <w:webHidden/>
+          </w:rPr>
+          <w:fldChar w:fldCharType="begin"/>
+        </w:r>
+        <w:r>
+          <w:rPr>
+            <w:noProof/>
+            <w:webHidden/>
+          </w:rPr>
+          <w:instrText xml:space="preserve"> PAGEREF _Toc238569180 \h </w:instrText>
+        </w:r>
+        <w:r>
+          <w:rPr>
+            <w:noProof/>
+            <w:webHidden/>
+          </w:rPr>
+        </w:r>
+        <w:r>
+          <w:rPr>
+            <w:noProof/>
+            <w:webHidden/>
+          </w:rPr>
+          <w:fldChar w:fldCharType="separate"/>
+        </w:r>
+        <w:r>
+          <w:rPr>
+            <w:noProof/>
+            <w:webHidden/>
+          </w:rPr>
+          <w:t>4</w:t>
+        </w:r>
+        <w:r>
+          <w:rPr>
+            <w:noProof/>
+            <w:webHidden/>
+          </w:rPr>
+          <w:fldChar w:fldCharType="end"/>
+        </w:r>
+      </w:hyperlink>
+    </w:p>
+    <w:p>
+      <w:pPr>
+        <w:pStyle w:val="Verzeichnis2"/>
+        <w:tabs>
+          <w:tab w:val="left" w:pos="960"/>
+          <w:tab w:val="right" w:leader="dot" w:pos="9061"/>
+        </w:tabs>
+        <w:rPr>
+          <w:rFonts w:eastAsiaTheme="minorEastAsia" w:cstheme="minorBidi"/>
+          <w:i w:val="0"/>
+          <w:iCs w:val="0"/>
+          <w:noProof/>
+          <w:kern w:val="2"/>
+          <w:sz w:val="24"/>
+          <w:szCs w:val="24"/>
+          <w14:ligatures w14:val="standardContextual"/>
+        </w:rPr>
+      </w:pPr>
+      <w:hyperlink w:anchor="_Toc238569181" w:history="1">
+        <w:r>
+          <w:rPr>
+            <w:rStyle w:val="Hyperlink"/>
+            <w:rFonts w:ascii="Times New Roman" w:hAnsi="Times New Roman" w:cs="Times New Roman"/>
+            <w:noProof/>
+          </w:rPr>
+          <w:t>3.1</w:t>
+        </w:r>
+        <w:r>
+          <w:rPr>
+            <w:rFonts w:eastAsiaTheme="minorEastAsia" w:cstheme="minorBidi"/>
+            <w:i w:val="0"/>
+            <w:iCs w:val="0"/>
+            <w:noProof/>
+            <w:kern w:val="2"/>
+            <w:sz w:val="24"/>
+            <w:szCs w:val="24"/>
+            <w14:ligatures w14:val="standardContextual"/>
+          </w:rPr>
+          <w:tab/>
+        </w:r>
+        <w:r>
+          <w:rPr>
+            <w:rStyle w:val="Hyperlink"/>
+            <w:rFonts w:ascii="Times New Roman" w:hAnsi="Times New Roman" w:cs="Times New Roman"/>
+            <w:noProof/>
+          </w:rPr>
+          <w:t>&lt;&lt;[</w:t>
+        </w:r>
+        <w:r>
+          <w:rPr>
+            <w:rStyle w:val="Hyperlink"/>
+            <w:rFonts w:ascii="Times New Roman" w:hAnsi="Times New Roman" w:cs="Times New Roman"/>
+            <w:noProof/>
+            <w:lang w:val="en-US"/>
+          </w:rPr>
+          <w:t>formerCommittee</w:t>
+        </w:r>
+        <w:r>
+          <w:rPr>
+            <w:rStyle w:val="Hyperlink"/>
+            <w:rFonts w:ascii="Times New Roman" w:hAnsi="Times New Roman" w:cs="Times New Roman"/>
+            <w:noProof/>
+          </w:rPr>
+          <w:t>.name]&gt;&gt;</w:t>
+        </w:r>
+        <w:r>
+          <w:rPr>
+            <w:noProof/>
+            <w:webHidden/>
+          </w:rPr>
+          <w:tab/>
+        </w:r>
+        <w:r>
+          <w:rPr>
+            <w:noProof/>
+            <w:webHidden/>
+          </w:rPr>
+          <w:fldChar w:fldCharType="begin"/>
+        </w:r>
+        <w:r>
+          <w:rPr>
+            <w:noProof/>
+            <w:webHidden/>
+          </w:rPr>
+          <w:instrText xml:space="preserve"> PAGEREF _Toc238569181 \h </w:instrText>
+        </w:r>
+        <w:r>
+          <w:rPr>
+            <w:noProof/>
+            <w:webHidden/>
+          </w:rPr>
+        </w:r>
+        <w:r>
+          <w:rPr>
+            <w:noProof/>
+            <w:webHidden/>
+          </w:rPr>
+          <w:fldChar w:fldCharType="separate"/>
+        </w:r>
+        <w:r>
+          <w:rPr>
+            <w:noProof/>
+            <w:webHidden/>
+          </w:rPr>
+          <w:t>4</w:t>
+        </w:r>
+        <w:r>
+          <w:rPr>
+            <w:noProof/>
+            <w:webHidden/>
+          </w:rPr>
+          <w:fldChar w:fldCharType="end"/>
+        </w:r>
+      </w:hyperlink>
+    </w:p>
+    <w:p>
+      <w:pPr>
         <w:pStyle w:val="APKberschriftEbene1"/>
         <w:rPr>
           <w:rFonts w:ascii="Times New Roman" w:hAnsi="Times New Roman"/>
@@ -433,14 +949,16 @@
         <w:jc w:val="both"/>
         <w:rPr>
           <w:rFonts w:ascii="Times New Roman" w:hAnsi="Times New Roman"/>
-          <w:szCs w:val="24"/>
+          <w:sz w:val="22"/>
+          <w:szCs w:val="22"/>
           <w:lang w:val="en-US"/>
         </w:rPr>
       </w:pPr>
       <w:r>
         <w:rPr>
           <w:rFonts w:ascii="Times New Roman" w:hAnsi="Times New Roman"/>
-          <w:szCs w:val="24"/>
+          <w:sz w:val="22"/>
+          <w:szCs w:val="22"/>
           <w:lang w:val="en-US"/>
         </w:rPr>
         <w:lastRenderedPageBreak/>
@@ -449,7 +967,8 @@
       <w:r>
         <w:rPr>
           <w:rFonts w:ascii="Times New Roman" w:hAnsi="Times New Roman"/>
-          <w:szCs w:val="24"/>
+          <w:sz w:val="22"/>
+          <w:szCs w:val="22"/>
           <w:lang w:val="en-US"/>
         </w:rPr>
         <w:t>committeeType</w:t>
@@ -457,52 +976,12 @@
       <w:r>
         <w:rPr>
           <w:rFonts w:ascii="Times New Roman" w:hAnsi="Times New Roman"/>
-          <w:szCs w:val="24"/>
+          <w:sz w:val="22"/>
+          <w:szCs w:val="22"/>
           <w:lang w:val="en-US"/>
         </w:rPr>
-        <w:t xml:space="preserve"> in </w:t>
+        <w:t xml:space="preserve"> in compareList.committeeTypes]&gt;&gt;</w:t>
       </w:r>
-      <w:r>
-        <w:rPr>
-          <w:rFonts w:ascii="Times New Roman" w:hAnsi="Times New Roman"/>
-          <w:szCs w:val="24"/>
-          <w:lang w:val="en-US"/>
-        </w:rPr>
-        <w:t>compareList</w:t>
-      </w:r>
-      <w:r>
-        <w:rPr>
-          <w:rFonts w:ascii="Times New Roman" w:hAnsi="Times New Roman"/>
-          <w:szCs w:val="24"/>
-          <w:lang w:val="en-US"/>
-        </w:rPr>
-        <w:t>.</w:t>
-      </w:r>
-      <w:r>
-        <w:rPr>
-          <w:rFonts w:ascii="Times New Roman" w:hAnsi="Times New Roman"/>
-          <w:szCs w:val="24"/>
-          <w:lang w:val="en-US"/>
-        </w:rPr>
-        <w:t>c</w:t>
-      </w:r>
-      <w:r>
-        <w:rPr>
-          <w:rFonts w:ascii="Times New Roman" w:hAnsi="Times New Roman"/>
-          <w:szCs w:val="24"/>
-          <w:lang w:val="en-US"/>
-        </w:rPr>
-        <w:t>ommitteeTypes</w:t>
-      </w:r>
-      <w:r>
-        <w:rPr>
-          <w:rFonts w:ascii="Times New Roman" w:hAnsi="Times New Roman"/>
-          <w:szCs w:val="24"/>
-          <w:lang w:val="en-US"/>
-        </w:rPr>
-        <w:t>]&gt;&gt;</w:t>
-      </w:r>
-      <w:bookmarkStart w:id="1" w:name="_Toc231973780"/>
     </w:p>
     <w:p>
       <w:pPr>
@@ -518,6 +997,7 @@
           <w:rFonts w:ascii="Times New Roman" w:hAnsi="Times New Roman" w:cs="Times New Roman"/>
         </w:rPr>
       </w:pPr>
+      <w:bookmarkStart w:id="1" w:name="_Toc238569175"/>
       <w:r>
         <w:rPr>
           <w:rFonts w:ascii="Times New Roman" w:hAnsi="Times New Roman" w:cs="Times New Roman"/>
@@ -543,79 +1023,33 @@
         <w:jc w:val="both"/>
         <w:rPr>
           <w:rFonts w:ascii="Times New Roman" w:hAnsi="Times New Roman"/>
-          <w:szCs w:val="24"/>
+          <w:sz w:val="22"/>
+          <w:szCs w:val="22"/>
           <w:lang w:val="en-US"/>
         </w:rPr>
       </w:pPr>
       <w:r>
+        <w:rPr>
+          <w:rFonts w:ascii="Times New Roman" w:hAnsi="Times New Roman"/>
+          <w:sz w:val="22"/>
+          <w:szCs w:val="22"/>
+          <w:lang w:val="en-US"/>
+        </w:rPr>
+        <w:t>&lt;&lt;foreach [department in committeeType.departments]&gt;&gt;</w:t>
+      </w:r>
+    </w:p>
+    <w:p>
+      <w:pPr>
+        <w:jc w:val="both"/>
         <w:rPr>
           <w:rFonts w:ascii="Times New Roman" w:hAnsi="Times New Roman"/>
           <w:szCs w:val="24"/>
           <w:lang w:val="en-US"/>
         </w:rPr>
-        <w:t>&lt;&lt;foreach [</w:t>
-      </w:r>
-      <w:r>
-        <w:rPr>
-          <w:rFonts w:ascii="Times New Roman" w:hAnsi="Times New Roman"/>
-          <w:szCs w:val="24"/>
-          <w:lang w:val="en-US"/>
-        </w:rPr>
-        <w:t>department</w:t>
-      </w:r>
-      <w:r>
-        <w:rPr>
-          <w:rFonts w:ascii="Times New Roman" w:hAnsi="Times New Roman"/>
-          <w:szCs w:val="24"/>
-          <w:lang w:val="en-US"/>
-        </w:rPr>
-        <w:t xml:space="preserve"> in </w:t>
-      </w:r>
-      <w:r>
-        <w:rPr>
-          <w:rFonts w:ascii="Times New Roman" w:hAnsi="Times New Roman"/>
-          <w:szCs w:val="24"/>
-          <w:lang w:val="en-US"/>
-        </w:rPr>
-        <w:t>c</w:t>
-      </w:r>
-      <w:r>
-        <w:rPr>
-          <w:rFonts w:ascii="Times New Roman" w:hAnsi="Times New Roman"/>
-          <w:szCs w:val="24"/>
-          <w:lang w:val="en-US"/>
-        </w:rPr>
-        <w:t>ommitteeType</w:t>
-      </w:r>
-      <w:r>
-        <w:rPr>
-          <w:rFonts w:ascii="Times New Roman" w:hAnsi="Times New Roman"/>
-          <w:szCs w:val="24"/>
-          <w:lang w:val="en-US"/>
-        </w:rPr>
-        <w:t>.departments</w:t>
-      </w:r>
-      <w:r>
-        <w:rPr>
-          <w:rFonts w:ascii="Times New Roman" w:hAnsi="Times New Roman"/>
-          <w:szCs w:val="24"/>
-          <w:lang w:val="en-US"/>
-        </w:rPr>
-        <w:t>]&gt;&gt;</w:t>
-      </w:r>
+      </w:pPr>
     </w:p>
     <w:p>
       <w:pPr>
-        <w:jc w:val="both"/>
-        <w:rPr>
-          <w:rFonts w:ascii="Times New Roman" w:hAnsi="Times New Roman"/>
-          <w:szCs w:val="24"/>
-          <w:lang w:val="en-US"/>
-        </w:rPr>
-      </w:pPr>
-    </w:p>
-    <w:p>
-      <w:pPr>
         <w:pStyle w:val="berschrift2"/>
         <w:jc w:val="both"/>
         <w:rPr>
@@ -625,7 +1059,7 @@
       </w:pPr>
       <w:bookmarkStart w:id="2" w:name="_Toc209534232"/>
       <w:bookmarkStart w:id="3" w:name="_Toc229478946"/>
-      <w:bookmarkStart w:id="4" w:name="_Toc231973781"/>
+      <w:bookmarkStart w:id="4" w:name="_Toc238569176"/>
       <w:r>
         <w:rPr>
           <w:rFonts w:ascii="Times New Roman" w:hAnsi="Times New Roman" w:cs="Times New Roman"/>
@@ -665,14 +1099,16 @@
         <w:ind w:firstLine="284"/>
         <w:rPr>
           <w:rFonts w:ascii="Times New Roman" w:hAnsi="Times New Roman"/>
-          <w:szCs w:val="24"/>
+          <w:sz w:val="22"/>
+          <w:szCs w:val="22"/>
           <w:lang w:val="en-US" w:eastAsia="de-DE"/>
         </w:rPr>
       </w:pPr>
       <w:r>
         <w:rPr>
           <w:rFonts w:ascii="Times New Roman" w:hAnsi="Times New Roman"/>
-          <w:szCs w:val="24"/>
+          <w:sz w:val="22"/>
+          <w:szCs w:val="22"/>
           <w:lang w:val="en-US"/>
         </w:rPr>
         <w:t>&lt;&lt;if [!department.</w:t>
@@ -681,7 +1117,8 @@
         <w:rPr>
           <w:rFonts w:ascii="Times New Roman" w:hAnsi="Times New Roman"/>
           <w:bCs/>
-          <w:szCs w:val="24"/>
+          <w:sz w:val="22"/>
+          <w:szCs w:val="22"/>
           <w:lang w:val="en-US"/>
         </w:rPr>
         <w:t>committees.Any()</w:t>
@@ -689,7 +1126,8 @@
       <w:r>
         <w:rPr>
           <w:rFonts w:ascii="Times New Roman" w:hAnsi="Times New Roman"/>
-          <w:szCs w:val="24"/>
+          <w:sz w:val="22"/>
+          <w:szCs w:val="22"/>
           <w:lang w:val="en-US"/>
         </w:rPr>
         <w:t>]&gt;&gt;</w:t>
@@ -697,7 +1135,8 @@
       <w:r>
         <w:rPr>
           <w:rFonts w:ascii="Times New Roman" w:hAnsi="Times New Roman"/>
-          <w:szCs w:val="24"/>
+          <w:sz w:val="22"/>
+          <w:szCs w:val="22"/>
           <w:lang w:val="en-US"/>
         </w:rPr>
         <w:t xml:space="preserve">Aucune </w:t>
@@ -705,7 +1144,8 @@
       <w:r>
         <w:rPr>
           <w:rFonts w:ascii="Times New Roman" w:hAnsi="Times New Roman"/>
-          <w:szCs w:val="24"/>
+          <w:sz w:val="22"/>
+          <w:szCs w:val="22"/>
           <w:lang w:val="en-US" w:eastAsia="de-DE"/>
         </w:rPr>
         <w:t>c</w:t>
@@ -713,7 +1153,8 @@
       <w:r>
         <w:rPr>
           <w:rFonts w:ascii="Times New Roman" w:hAnsi="Times New Roman"/>
-          <w:szCs w:val="24"/>
+          <w:sz w:val="22"/>
+          <w:szCs w:val="22"/>
           <w:lang w:val="en-US"/>
         </w:rPr>
         <w:t>ommission&lt;&lt;/if&gt;&gt;</w:t>
@@ -725,7 +1166,8 @@
         <w:jc w:val="both"/>
         <w:rPr>
           <w:rFonts w:ascii="Times New Roman" w:hAnsi="Times New Roman"/>
-          <w:szCs w:val="24"/>
+          <w:sz w:val="22"/>
+          <w:szCs w:val="22"/>
           <w:lang w:val="en-US" w:eastAsia="de-DE"/>
         </w:rPr>
       </w:pPr>
@@ -733,7 +1175,8 @@
         <w:rPr>
           <w:rFonts w:ascii="Times New Roman" w:hAnsi="Times New Roman"/>
           <w:bCs/>
-          <w:szCs w:val="24"/>
+          <w:sz w:val="22"/>
+          <w:szCs w:val="22"/>
           <w:lang w:val="en-US"/>
         </w:rPr>
         <w:t>&lt;&lt;foreach [committee in department.committees]&gt;&gt;</w:t>
@@ -752,51 +1195,30 @@
     </w:p>
     <w:p>
       <w:pPr>
+        <w:pStyle w:val="berschrift3"/>
+        <w:rPr>
+          <w:sz w:val="22"/>
+          <w:szCs w:val="22"/>
+        </w:rPr>
+      </w:pPr>
+      <w:bookmarkStart w:id="5" w:name="_Toc238569177"/>
+      <w:r>
+        <w:rPr>
+          <w:sz w:val="22"/>
+          <w:szCs w:val="22"/>
+        </w:rPr>
+        <w:t>&lt;&lt;[committee.name]&gt;&gt;</w:t>
+      </w:r>
+      <w:bookmarkEnd w:id="5"/>
+    </w:p>
+    <w:p>
+      <w:pPr>
         <w:rPr>
           <w:rFonts w:ascii="Times New Roman" w:hAnsi="Times New Roman"/>
           <w:b/>
           <w:bCs/>
-          <w:szCs w:val="24"/>
-          <w:lang w:eastAsia="de-DE"/>
-        </w:rPr>
-      </w:pPr>
-      <w:r>
-        <w:rPr>
-          <w:rFonts w:ascii="Times New Roman" w:hAnsi="Times New Roman"/>
-          <w:b/>
-          <w:bCs/>
-          <w:szCs w:val="24"/>
-          <w:lang w:eastAsia="de-DE"/>
-        </w:rPr>
-        <w:t>&lt;&lt;[</w:t>
-      </w:r>
-      <w:r>
-        <w:rPr>
-          <w:rFonts w:ascii="Times New Roman" w:hAnsi="Times New Roman"/>
-          <w:b/>
-          <w:bCs/>
-          <w:szCs w:val="24"/>
-        </w:rPr>
-        <w:t>committee.</w:t>
-      </w:r>
-      <w:r>
-        <w:rPr>
-          <w:rFonts w:ascii="Times New Roman" w:hAnsi="Times New Roman"/>
-          <w:b/>
-          <w:bCs/>
-          <w:szCs w:val="24"/>
-          <w:lang w:eastAsia="de-DE"/>
-        </w:rPr>
-        <w:t>name]&gt;&gt;</w:t>
-      </w:r>
-    </w:p>
-    <w:p>
-      <w:pPr>
-        <w:rPr>
-          <w:rFonts w:ascii="Times New Roman" w:hAnsi="Times New Roman"/>
-          <w:b/>
-          <w:bCs/>
-          <w:szCs w:val="24"/>
+          <w:sz w:val="22"/>
+          <w:szCs w:val="22"/>
           <w:lang w:eastAsia="de-DE"/>
         </w:rPr>
       </w:pPr>
@@ -824,7 +1246,8 @@
                 <w:rFonts w:ascii="Times New Roman" w:hAnsi="Times New Roman"/>
                 <w:b/>
                 <w:bCs/>
-                <w:szCs w:val="24"/>
+                <w:sz w:val="22"/>
+                <w:szCs w:val="22"/>
               </w:rPr>
             </w:pPr>
             <w:r>
@@ -832,7 +1255,8 @@
                 <w:rFonts w:ascii="Times New Roman" w:hAnsi="Times New Roman"/>
                 <w:b/>
                 <w:bCs/>
-                <w:szCs w:val="24"/>
+                <w:sz w:val="22"/>
+                <w:szCs w:val="22"/>
               </w:rPr>
               <w:t>Comparaison de la composition</w:t>
             </w:r>
@@ -849,26 +1273,19 @@
                 <w:rFonts w:ascii="Times New Roman" w:hAnsi="Times New Roman"/>
                 <w:b/>
                 <w:bCs/>
-                <w:szCs w:val="24"/>
+                <w:sz w:val="22"/>
+                <w:szCs w:val="22"/>
               </w:rPr>
             </w:pPr>
             <w:r>
               <w:rPr>
                 <w:rFonts w:ascii="Times New Roman" w:hAnsi="Times New Roman"/>
                 <w:b/>
-                <w:szCs w:val="24"/>
-                <w:lang w:val="fr-CH"/>
-              </w:rPr>
-              <w:t>R</w:t>
-            </w:r>
-            <w:r>
-              <w:rPr>
-                <w:rFonts w:ascii="Times New Roman" w:hAnsi="Times New Roman"/>
-                <w:b/>
-                <w:szCs w:val="24"/>
-                <w:lang w:val="fr-CH"/>
-              </w:rPr>
-              <w:t xml:space="preserve">enouvellement intégral </w:t>
+                <w:sz w:val="22"/>
+                <w:szCs w:val="22"/>
+                <w:lang w:val="fr-CH"/>
+              </w:rPr>
+              <w:t xml:space="preserve">Renouvellement intégral </w:t>
             </w:r>
           </w:p>
         </w:tc>
@@ -883,26 +1300,19 @@
                 <w:rFonts w:ascii="Times New Roman" w:hAnsi="Times New Roman"/>
                 <w:b/>
                 <w:bCs/>
-                <w:szCs w:val="24"/>
+                <w:sz w:val="22"/>
+                <w:szCs w:val="22"/>
               </w:rPr>
             </w:pPr>
             <w:r>
               <w:rPr>
                 <w:rFonts w:ascii="Times New Roman" w:hAnsi="Times New Roman"/>
                 <w:b/>
-                <w:szCs w:val="24"/>
-                <w:lang w:val="fr-CH"/>
-              </w:rPr>
-              <w:t>Réexamen</w:t>
-            </w:r>
-            <w:r>
-              <w:rPr>
-                <w:rFonts w:ascii="Times New Roman" w:hAnsi="Times New Roman"/>
-                <w:b/>
-                <w:szCs w:val="24"/>
-                <w:lang w:val="fr-CH"/>
-              </w:rPr>
-              <w:t xml:space="preserve"> </w:t>
+                <w:sz w:val="22"/>
+                <w:szCs w:val="22"/>
+                <w:lang w:val="fr-CH"/>
+              </w:rPr>
+              <w:t xml:space="preserve">Réexamen </w:t>
             </w:r>
           </w:p>
         </w:tc>
@@ -916,13 +1326,15 @@
             <w:pPr>
               <w:rPr>
                 <w:rFonts w:ascii="Times New Roman" w:hAnsi="Times New Roman"/>
-                <w:szCs w:val="24"/>
+                <w:sz w:val="22"/>
+                <w:szCs w:val="22"/>
               </w:rPr>
             </w:pPr>
             <w:r>
               <w:rPr>
                 <w:rFonts w:ascii="Times New Roman" w:hAnsi="Times New Roman"/>
-                <w:szCs w:val="24"/>
+                <w:sz w:val="22"/>
+                <w:szCs w:val="22"/>
               </w:rPr>
               <w:t>Nombre de membres</w:t>
             </w:r>
@@ -936,13 +1348,15 @@
             <w:pPr>
               <w:rPr>
                 <w:rFonts w:ascii="Times New Roman" w:hAnsi="Times New Roman"/>
-                <w:szCs w:val="24"/>
+                <w:sz w:val="22"/>
+                <w:szCs w:val="22"/>
               </w:rPr>
             </w:pPr>
             <w:r>
               <w:rPr>
                 <w:rFonts w:ascii="Times New Roman" w:hAnsi="Times New Roman"/>
-                <w:szCs w:val="24"/>
+                <w:sz w:val="22"/>
+                <w:szCs w:val="22"/>
                 <w:lang w:eastAsia="de-DE"/>
               </w:rPr>
               <w:t>&lt;&lt;[</w:t>
@@ -950,28 +1364,24 @@
             <w:r>
               <w:rPr>
                 <w:rFonts w:ascii="Times New Roman" w:hAnsi="Times New Roman"/>
-                <w:szCs w:val="24"/>
-              </w:rPr>
-              <w:t>committee.</w:t>
-            </w:r>
-            <w:r>
-              <w:rPr>
-                <w:rFonts w:ascii="Times New Roman" w:hAnsi="Times New Roman"/>
-                <w:szCs w:val="24"/>
-              </w:rPr>
-              <w:t>memberCount</w:t>
-            </w:r>
-            <w:r>
-              <w:rPr>
-                <w:rFonts w:ascii="Times New Roman" w:hAnsi="Times New Roman"/>
-                <w:szCs w:val="24"/>
+                <w:sz w:val="22"/>
+                <w:szCs w:val="22"/>
+              </w:rPr>
+              <w:t>committee.memberCount</w:t>
+            </w:r>
+            <w:r>
+              <w:rPr>
+                <w:rFonts w:ascii="Times New Roman" w:hAnsi="Times New Roman"/>
+                <w:sz w:val="22"/>
+                <w:szCs w:val="22"/>
               </w:rPr>
               <w:t>Old</w:t>
             </w:r>
             <w:r>
               <w:rPr>
                 <w:rFonts w:ascii="Times New Roman" w:hAnsi="Times New Roman"/>
-                <w:szCs w:val="24"/>
+                <w:sz w:val="22"/>
+                <w:szCs w:val="22"/>
                 <w:lang w:eastAsia="de-DE"/>
               </w:rPr>
               <w:t>]&gt;&gt;</w:t>
@@ -986,13 +1396,15 @@
             <w:pPr>
               <w:rPr>
                 <w:rFonts w:ascii="Times New Roman" w:hAnsi="Times New Roman"/>
-                <w:szCs w:val="24"/>
+                <w:sz w:val="22"/>
+                <w:szCs w:val="22"/>
               </w:rPr>
             </w:pPr>
             <w:r>
               <w:rPr>
                 <w:rFonts w:ascii="Times New Roman" w:hAnsi="Times New Roman"/>
-                <w:szCs w:val="24"/>
+                <w:sz w:val="22"/>
+                <w:szCs w:val="22"/>
                 <w:lang w:eastAsia="de-DE"/>
               </w:rPr>
               <w:t>&lt;&lt;[</w:t>
@@ -1000,21 +1412,16 @@
             <w:r>
               <w:rPr>
                 <w:rFonts w:ascii="Times New Roman" w:hAnsi="Times New Roman"/>
-                <w:szCs w:val="24"/>
-              </w:rPr>
-              <w:t>committee.</w:t>
-            </w:r>
-            <w:r>
-              <w:rPr>
-                <w:rFonts w:ascii="Times New Roman" w:hAnsi="Times New Roman"/>
-                <w:szCs w:val="24"/>
-              </w:rPr>
-              <w:t>memberCountNew</w:t>
-            </w:r>
-            <w:r>
-              <w:rPr>
-                <w:rFonts w:ascii="Times New Roman" w:hAnsi="Times New Roman"/>
-                <w:szCs w:val="24"/>
+                <w:sz w:val="22"/>
+                <w:szCs w:val="22"/>
+              </w:rPr>
+              <w:t>committee.memberCountNew</w:t>
+            </w:r>
+            <w:r>
+              <w:rPr>
+                <w:rFonts w:ascii="Times New Roman" w:hAnsi="Times New Roman"/>
+                <w:sz w:val="22"/>
+                <w:szCs w:val="22"/>
                 <w:lang w:eastAsia="de-DE"/>
               </w:rPr>
               <w:t>]&gt;&gt;</w:t>
@@ -1031,14 +1438,16 @@
             <w:pPr>
               <w:rPr>
                 <w:rFonts w:ascii="Times New Roman" w:hAnsi="Times New Roman"/>
-                <w:szCs w:val="24"/>
+                <w:sz w:val="22"/>
+                <w:szCs w:val="22"/>
                 <w:lang w:val="fr-CH"/>
               </w:rPr>
             </w:pPr>
             <w:r>
               <w:rPr>
                 <w:rFonts w:ascii="Times New Roman" w:hAnsi="Times New Roman"/>
-                <w:szCs w:val="24"/>
+                <w:sz w:val="22"/>
+                <w:szCs w:val="22"/>
                 <w:lang w:val="fr-CH"/>
               </w:rPr>
               <w:t>&lt;&lt;if [</w:t>
@@ -1047,7 +1456,8 @@
               <w:rPr>
                 <w:rFonts w:ascii="Times New Roman" w:hAnsi="Times New Roman"/>
                 <w:bCs/>
-                <w:szCs w:val="24"/>
+                <w:sz w:val="22"/>
+                <w:szCs w:val="22"/>
                 <w:lang w:val="fr-CH"/>
               </w:rPr>
               <w:t>committee.federalDuty</w:t>
@@ -1056,7 +1466,8 @@
               <w:rPr>
                 <w:rFonts w:ascii="Times New Roman" w:hAnsi="Times New Roman"/>
                 <w:bCs/>
-                <w:szCs w:val="24"/>
+                <w:sz w:val="22"/>
+                <w:szCs w:val="22"/>
                 <w:lang w:val="fr-CH"/>
               </w:rPr>
               <w:t>Both</w:t>
@@ -1065,7 +1476,8 @@
               <w:rPr>
                 <w:rFonts w:ascii="Times New Roman" w:hAnsi="Times New Roman"/>
                 <w:bCs/>
-                <w:szCs w:val="24"/>
+                <w:sz w:val="22"/>
+                <w:szCs w:val="22"/>
                 <w:lang w:val="fr-CH"/>
               </w:rPr>
               <w:t>Display</w:t>
@@ -1073,7 +1485,8 @@
             <w:r>
               <w:rPr>
                 <w:rFonts w:ascii="Times New Roman" w:hAnsi="Times New Roman"/>
-                <w:szCs w:val="24"/>
+                <w:sz w:val="22"/>
+                <w:szCs w:val="22"/>
                 <w:lang w:val="fr-CH"/>
               </w:rPr>
               <w:t>]&gt;&gt;</w:t>
@@ -1081,7 +1494,8 @@
             <w:r>
               <w:rPr>
                 <w:rFonts w:ascii="Times New Roman" w:hAnsi="Times New Roman"/>
-                <w:szCs w:val="24"/>
+                <w:sz w:val="22"/>
+                <w:szCs w:val="22"/>
                 <w:lang w:val="fr-CH"/>
               </w:rPr>
               <w:t>Nombre de membres de l’administration fédérale</w:t>
@@ -1097,43 +1511,33 @@
             <w:pPr>
               <w:rPr>
                 <w:rFonts w:ascii="Times New Roman" w:hAnsi="Times New Roman"/>
-                <w:szCs w:val="24"/>
+                <w:sz w:val="22"/>
+                <w:szCs w:val="22"/>
               </w:rPr>
             </w:pPr>
             <w:r>
               <w:rPr>
                 <w:rFonts w:ascii="Times New Roman" w:hAnsi="Times New Roman"/>
-                <w:szCs w:val="24"/>
-              </w:rPr>
-              <w:t>&lt;&lt;[committee.</w:t>
-            </w:r>
-            <w:r>
-              <w:rPr>
-                <w:rFonts w:ascii="Times New Roman" w:hAnsi="Times New Roman"/>
-                <w:szCs w:val="24"/>
-              </w:rPr>
-              <w:t>federalDuty</w:t>
-            </w:r>
-            <w:r>
-              <w:rPr>
-                <w:rFonts w:ascii="Times New Roman" w:hAnsi="Times New Roman"/>
-                <w:szCs w:val="24"/>
+                <w:sz w:val="22"/>
+                <w:szCs w:val="22"/>
+              </w:rPr>
+              <w:t>&lt;&lt;[committee.federalDuty</w:t>
+            </w:r>
+            <w:r>
+              <w:rPr>
+                <w:rFonts w:ascii="Times New Roman" w:hAnsi="Times New Roman"/>
+                <w:sz w:val="22"/>
+                <w:szCs w:val="22"/>
               </w:rPr>
               <w:t>Count</w:t>
             </w:r>
             <w:r>
               <w:rPr>
                 <w:rFonts w:ascii="Times New Roman" w:hAnsi="Times New Roman"/>
-                <w:szCs w:val="24"/>
-              </w:rPr>
-              <w:t>Old</w:t>
-            </w:r>
-            <w:r>
-              <w:rPr>
-                <w:rFonts w:ascii="Times New Roman" w:hAnsi="Times New Roman"/>
-                <w:szCs w:val="24"/>
-              </w:rPr>
-              <w:t>]&gt;&gt;</w:t>
+                <w:sz w:val="22"/>
+                <w:szCs w:val="22"/>
+              </w:rPr>
+              <w:t>Old]&gt;&gt;</w:t>
             </w:r>
           </w:p>
         </w:tc>
@@ -1146,48 +1550,39 @@
             <w:pPr>
               <w:rPr>
                 <w:rFonts w:ascii="Times New Roman" w:hAnsi="Times New Roman"/>
-                <w:szCs w:val="24"/>
+                <w:sz w:val="22"/>
+                <w:szCs w:val="22"/>
               </w:rPr>
             </w:pPr>
             <w:r>
               <w:rPr>
                 <w:rFonts w:ascii="Times New Roman" w:hAnsi="Times New Roman"/>
-                <w:szCs w:val="24"/>
-              </w:rPr>
-              <w:t>&lt;&lt;[committee.</w:t>
-            </w:r>
-            <w:r>
-              <w:rPr>
-                <w:rFonts w:ascii="Times New Roman" w:hAnsi="Times New Roman"/>
-                <w:szCs w:val="24"/>
-              </w:rPr>
-              <w:t>federalDuty</w:t>
-            </w:r>
-            <w:r>
-              <w:rPr>
-                <w:rFonts w:ascii="Times New Roman" w:hAnsi="Times New Roman"/>
-                <w:szCs w:val="24"/>
+                <w:sz w:val="22"/>
+                <w:szCs w:val="22"/>
+              </w:rPr>
+              <w:t>&lt;&lt;[committee.federalDuty</w:t>
+            </w:r>
+            <w:r>
+              <w:rPr>
+                <w:rFonts w:ascii="Times New Roman" w:hAnsi="Times New Roman"/>
+                <w:sz w:val="22"/>
+                <w:szCs w:val="22"/>
               </w:rPr>
               <w:t>Count</w:t>
             </w:r>
             <w:r>
               <w:rPr>
                 <w:rFonts w:ascii="Times New Roman" w:hAnsi="Times New Roman"/>
-                <w:szCs w:val="24"/>
-              </w:rPr>
-              <w:t>New</w:t>
-            </w:r>
-            <w:r>
-              <w:rPr>
-                <w:rFonts w:ascii="Times New Roman" w:hAnsi="Times New Roman"/>
-                <w:szCs w:val="24"/>
-              </w:rPr>
-              <w:t>]&gt;&gt;</w:t>
-            </w:r>
-            <w:r>
-              <w:rPr>
-                <w:rFonts w:ascii="Times New Roman" w:hAnsi="Times New Roman"/>
-                <w:szCs w:val="24"/>
+                <w:sz w:val="22"/>
+                <w:szCs w:val="22"/>
+              </w:rPr>
+              <w:t>New]&gt;&gt;</w:t>
+            </w:r>
+            <w:r>
+              <w:rPr>
+                <w:rFonts w:ascii="Times New Roman" w:hAnsi="Times New Roman"/>
+                <w:sz w:val="22"/>
+                <w:szCs w:val="22"/>
                 <w:lang w:val="en-US"/>
               </w:rPr>
               <w:t>&lt;&lt;/if&gt;&gt;</w:t>
@@ -1204,14 +1599,16 @@
             <w:pPr>
               <w:rPr>
                 <w:rFonts w:ascii="Times New Roman" w:hAnsi="Times New Roman"/>
-                <w:szCs w:val="24"/>
+                <w:sz w:val="22"/>
+                <w:szCs w:val="22"/>
                 <w:lang w:val="fr-CH"/>
               </w:rPr>
             </w:pPr>
             <w:r>
               <w:rPr>
                 <w:rFonts w:ascii="Times New Roman" w:hAnsi="Times New Roman"/>
-                <w:szCs w:val="24"/>
+                <w:sz w:val="22"/>
+                <w:szCs w:val="22"/>
                 <w:lang w:val="fr-CH"/>
               </w:rPr>
               <w:t>&lt;&lt;if [</w:t>
@@ -1220,7 +1617,8 @@
               <w:rPr>
                 <w:rFonts w:ascii="Times New Roman" w:hAnsi="Times New Roman"/>
                 <w:bCs/>
-                <w:szCs w:val="24"/>
+                <w:sz w:val="22"/>
+                <w:szCs w:val="22"/>
                 <w:lang w:val="fr-CH"/>
               </w:rPr>
               <w:t>committee.federalDutyOldDisplay</w:t>
@@ -1228,7 +1626,8 @@
             <w:r>
               <w:rPr>
                 <w:rFonts w:ascii="Times New Roman" w:hAnsi="Times New Roman"/>
-                <w:szCs w:val="24"/>
+                <w:sz w:val="22"/>
+                <w:szCs w:val="22"/>
                 <w:lang w:val="fr-CH"/>
               </w:rPr>
               <w:t>]&gt;&gt;</w:t>
@@ -1236,7 +1635,8 @@
             <w:r>
               <w:rPr>
                 <w:rFonts w:ascii="Times New Roman" w:hAnsi="Times New Roman"/>
-                <w:szCs w:val="24"/>
+                <w:sz w:val="22"/>
+                <w:szCs w:val="22"/>
                 <w:lang w:val="fr-CH"/>
               </w:rPr>
               <w:t>Nombre de membres de l’administration fédérale</w:t>
@@ -1252,29 +1652,17 @@
             <w:pPr>
               <w:rPr>
                 <w:rFonts w:ascii="Times New Roman" w:hAnsi="Times New Roman"/>
-                <w:szCs w:val="24"/>
+                <w:sz w:val="22"/>
+                <w:szCs w:val="22"/>
               </w:rPr>
             </w:pPr>
             <w:r>
               <w:rPr>
                 <w:rFonts w:ascii="Times New Roman" w:hAnsi="Times New Roman"/>
-                <w:szCs w:val="24"/>
-              </w:rPr>
-              <w:t>&lt;&lt;[committee.</w:t>
-            </w:r>
-            <w:r>
-              <w:rPr>
-                <w:rFonts w:ascii="Times New Roman" w:hAnsi="Times New Roman"/>
-                <w:szCs w:val="24"/>
-              </w:rPr>
-              <w:t>federalDutyCountOld</w:t>
-            </w:r>
-            <w:r>
-              <w:rPr>
-                <w:rFonts w:ascii="Times New Roman" w:hAnsi="Times New Roman"/>
-                <w:szCs w:val="24"/>
-              </w:rPr>
-              <w:t>]&gt;&gt;</w:t>
+                <w:sz w:val="22"/>
+                <w:szCs w:val="22"/>
+              </w:rPr>
+              <w:t>&lt;&lt;[committee.federalDutyCountOld]&gt;&gt;</w:t>
             </w:r>
           </w:p>
         </w:tc>
@@ -1286,34 +1674,23 @@
             <w:pPr>
               <w:rPr>
                 <w:rFonts w:ascii="Times New Roman" w:hAnsi="Times New Roman"/>
-                <w:szCs w:val="24"/>
+                <w:sz w:val="22"/>
+                <w:szCs w:val="22"/>
               </w:rPr>
             </w:pPr>
             <w:r>
               <w:rPr>
                 <w:rFonts w:ascii="Times New Roman" w:hAnsi="Times New Roman"/>
-                <w:szCs w:val="24"/>
-              </w:rPr>
-              <w:t>&lt;&lt;[committee.</w:t>
-            </w:r>
-            <w:r>
-              <w:rPr>
-                <w:rFonts w:ascii="Times New Roman" w:hAnsi="Times New Roman"/>
-                <w:szCs w:val="24"/>
-              </w:rPr>
-              <w:t>federalDutyCountNew</w:t>
-            </w:r>
-            <w:r>
-              <w:rPr>
-                <w:rFonts w:ascii="Times New Roman" w:hAnsi="Times New Roman"/>
-                <w:szCs w:val="24"/>
-              </w:rPr>
-              <w:t>]&gt;&gt;</w:t>
-            </w:r>
-            <w:r>
-              <w:rPr>
-                <w:rFonts w:ascii="Times New Roman" w:hAnsi="Times New Roman"/>
-                <w:szCs w:val="24"/>
+                <w:sz w:val="22"/>
+                <w:szCs w:val="22"/>
+              </w:rPr>
+              <w:t>&lt;&lt;[committee.federalDutyCountNew]&gt;&gt;</w:t>
+            </w:r>
+            <w:r>
+              <w:rPr>
+                <w:rFonts w:ascii="Times New Roman" w:hAnsi="Times New Roman"/>
+                <w:sz w:val="22"/>
+                <w:szCs w:val="22"/>
                 <w:lang w:val="en-US"/>
               </w:rPr>
               <w:t>&lt;&lt;/if&gt;&gt;</w:t>
@@ -1330,14 +1707,16 @@
             <w:pPr>
               <w:rPr>
                 <w:rFonts w:ascii="Times New Roman" w:hAnsi="Times New Roman"/>
-                <w:szCs w:val="24"/>
+                <w:sz w:val="22"/>
+                <w:szCs w:val="22"/>
                 <w:lang w:val="fr-CH"/>
               </w:rPr>
             </w:pPr>
             <w:r>
               <w:rPr>
                 <w:rFonts w:ascii="Times New Roman" w:hAnsi="Times New Roman"/>
-                <w:szCs w:val="24"/>
+                <w:sz w:val="22"/>
+                <w:szCs w:val="22"/>
                 <w:lang w:val="fr-CH"/>
               </w:rPr>
               <w:t>&lt;&lt;if [</w:t>
@@ -1346,7 +1725,8 @@
               <w:rPr>
                 <w:rFonts w:ascii="Times New Roman" w:hAnsi="Times New Roman"/>
                 <w:bCs/>
-                <w:szCs w:val="24"/>
+                <w:sz w:val="22"/>
+                <w:szCs w:val="22"/>
                 <w:lang w:val="fr-CH"/>
               </w:rPr>
               <w:t>committee.federalDutyNewDisplay</w:t>
@@ -1354,7 +1734,8 @@
             <w:r>
               <w:rPr>
                 <w:rFonts w:ascii="Times New Roman" w:hAnsi="Times New Roman"/>
-                <w:szCs w:val="24"/>
+                <w:sz w:val="22"/>
+                <w:szCs w:val="22"/>
                 <w:lang w:val="fr-CH"/>
               </w:rPr>
               <w:t>]&gt;&gt;</w:t>
@@ -1362,7 +1743,8 @@
             <w:r>
               <w:rPr>
                 <w:rFonts w:ascii="Times New Roman" w:hAnsi="Times New Roman"/>
-                <w:szCs w:val="24"/>
+                <w:sz w:val="22"/>
+                <w:szCs w:val="22"/>
                 <w:lang w:val="fr-CH"/>
               </w:rPr>
               <w:t>Nombre de membres de l’administration fédérale</w:t>
@@ -1377,29 +1759,17 @@
             <w:pPr>
               <w:rPr>
                 <w:rFonts w:ascii="Times New Roman" w:hAnsi="Times New Roman"/>
-                <w:szCs w:val="24"/>
+                <w:sz w:val="22"/>
+                <w:szCs w:val="22"/>
               </w:rPr>
             </w:pPr>
             <w:r>
               <w:rPr>
                 <w:rFonts w:ascii="Times New Roman" w:hAnsi="Times New Roman"/>
-                <w:szCs w:val="24"/>
-              </w:rPr>
-              <w:t>&lt;&lt;[committee.</w:t>
-            </w:r>
-            <w:r>
-              <w:rPr>
-                <w:rFonts w:ascii="Times New Roman" w:hAnsi="Times New Roman"/>
-                <w:szCs w:val="24"/>
-              </w:rPr>
-              <w:t>federalDutyCountOld</w:t>
-            </w:r>
-            <w:r>
-              <w:rPr>
-                <w:rFonts w:ascii="Times New Roman" w:hAnsi="Times New Roman"/>
-                <w:szCs w:val="24"/>
-              </w:rPr>
-              <w:t>]&gt;&gt;</w:t>
+                <w:sz w:val="22"/>
+                <w:szCs w:val="22"/>
+              </w:rPr>
+              <w:t>&lt;&lt;[committee.federalDutyCountOld]&gt;&gt;</w:t>
             </w:r>
           </w:p>
         </w:tc>
@@ -1412,34 +1782,23 @@
             <w:pPr>
               <w:rPr>
                 <w:rFonts w:ascii="Times New Roman" w:hAnsi="Times New Roman"/>
-                <w:szCs w:val="24"/>
+                <w:sz w:val="22"/>
+                <w:szCs w:val="22"/>
               </w:rPr>
             </w:pPr>
             <w:r>
               <w:rPr>
                 <w:rFonts w:ascii="Times New Roman" w:hAnsi="Times New Roman"/>
-                <w:szCs w:val="24"/>
-              </w:rPr>
-              <w:t>&lt;&lt;[committee.</w:t>
-            </w:r>
-            <w:r>
-              <w:rPr>
-                <w:rFonts w:ascii="Times New Roman" w:hAnsi="Times New Roman"/>
-                <w:szCs w:val="24"/>
-              </w:rPr>
-              <w:t>federalDutyCountNew</w:t>
-            </w:r>
-            <w:r>
-              <w:rPr>
-                <w:rFonts w:ascii="Times New Roman" w:hAnsi="Times New Roman"/>
-                <w:szCs w:val="24"/>
-              </w:rPr>
-              <w:t>]&gt;&gt;</w:t>
-            </w:r>
-            <w:r>
-              <w:rPr>
-                <w:rFonts w:ascii="Times New Roman" w:hAnsi="Times New Roman"/>
-                <w:szCs w:val="24"/>
+                <w:sz w:val="22"/>
+                <w:szCs w:val="22"/>
+              </w:rPr>
+              <w:t>&lt;&lt;[committee.federalDutyCountNew]&gt;&gt;</w:t>
+            </w:r>
+            <w:r>
+              <w:rPr>
+                <w:rFonts w:ascii="Times New Roman" w:hAnsi="Times New Roman"/>
+                <w:sz w:val="22"/>
+                <w:szCs w:val="22"/>
                 <w:lang w:val="en-US"/>
               </w:rPr>
               <w:t>&lt;&lt;/if&gt;&gt;</w:t>
@@ -1456,14 +1815,16 @@
             <w:pPr>
               <w:rPr>
                 <w:rFonts w:ascii="Times New Roman" w:hAnsi="Times New Roman"/>
-                <w:szCs w:val="24"/>
+                <w:sz w:val="22"/>
+                <w:szCs w:val="22"/>
                 <w:lang w:val="fr-CH"/>
               </w:rPr>
             </w:pPr>
             <w:r>
               <w:rPr>
                 <w:rFonts w:ascii="Times New Roman" w:hAnsi="Times New Roman"/>
-                <w:szCs w:val="24"/>
+                <w:sz w:val="22"/>
+                <w:szCs w:val="22"/>
                 <w:lang w:val="fr-CH"/>
               </w:rPr>
               <w:t>&lt;&lt;if [c</w:t>
@@ -1472,7 +1833,8 @@
               <w:rPr>
                 <w:rFonts w:ascii="Times New Roman" w:hAnsi="Times New Roman"/>
                 <w:bCs/>
-                <w:szCs w:val="24"/>
+                <w:sz w:val="22"/>
+                <w:szCs w:val="22"/>
                 <w:lang w:val="fr-CH"/>
               </w:rPr>
               <w:t>ommittee.federalAssembly</w:t>
@@ -1481,7 +1843,8 @@
               <w:rPr>
                 <w:rFonts w:ascii="Times New Roman" w:hAnsi="Times New Roman"/>
                 <w:bCs/>
-                <w:szCs w:val="24"/>
+                <w:sz w:val="22"/>
+                <w:szCs w:val="22"/>
                 <w:lang w:val="fr-CH"/>
               </w:rPr>
               <w:t>Both</w:t>
@@ -1490,7 +1853,8 @@
               <w:rPr>
                 <w:rFonts w:ascii="Times New Roman" w:hAnsi="Times New Roman"/>
                 <w:bCs/>
-                <w:szCs w:val="24"/>
+                <w:sz w:val="22"/>
+                <w:szCs w:val="22"/>
                 <w:lang w:val="fr-CH"/>
               </w:rPr>
               <w:t>Display</w:t>
@@ -1498,7 +1862,8 @@
             <w:r>
               <w:rPr>
                 <w:rFonts w:ascii="Times New Roman" w:hAnsi="Times New Roman"/>
-                <w:szCs w:val="24"/>
+                <w:sz w:val="22"/>
+                <w:szCs w:val="22"/>
                 <w:lang w:val="fr-CH"/>
               </w:rPr>
               <w:t>]&gt;&gt;</w:t>
@@ -1506,7 +1871,8 @@
             <w:r>
               <w:rPr>
                 <w:rFonts w:ascii="Times New Roman" w:hAnsi="Times New Roman"/>
-                <w:szCs w:val="24"/>
+                <w:sz w:val="22"/>
+                <w:szCs w:val="22"/>
                 <w:lang w:val="fr-CH"/>
               </w:rPr>
               <w:t>Nombre de membres de l’Assemblée fédérale</w:t>
@@ -1522,29 +1888,17 @@
             <w:pPr>
               <w:rPr>
                 <w:rFonts w:ascii="Times New Roman" w:hAnsi="Times New Roman"/>
-                <w:szCs w:val="24"/>
+                <w:sz w:val="22"/>
+                <w:szCs w:val="22"/>
               </w:rPr>
             </w:pPr>
             <w:r>
               <w:rPr>
                 <w:rFonts w:ascii="Times New Roman" w:hAnsi="Times New Roman"/>
-                <w:szCs w:val="24"/>
-              </w:rPr>
-              <w:t>&lt;&lt;[committee.</w:t>
-            </w:r>
-            <w:r>
-              <w:rPr>
-                <w:rFonts w:ascii="Times New Roman" w:hAnsi="Times New Roman"/>
-                <w:szCs w:val="24"/>
-              </w:rPr>
-              <w:t>federalAssemblyCountOld</w:t>
-            </w:r>
-            <w:r>
-              <w:rPr>
-                <w:rFonts w:ascii="Times New Roman" w:hAnsi="Times New Roman"/>
-                <w:szCs w:val="24"/>
-              </w:rPr>
-              <w:t>]&gt;&gt;</w:t>
+                <w:sz w:val="22"/>
+                <w:szCs w:val="22"/>
+              </w:rPr>
+              <w:t>&lt;&lt;[committee.federalAssemblyCountOld]&gt;&gt;</w:t>
             </w:r>
           </w:p>
         </w:tc>
@@ -1557,34 +1911,23 @@
             <w:pPr>
               <w:rPr>
                 <w:rFonts w:ascii="Times New Roman" w:hAnsi="Times New Roman"/>
-                <w:szCs w:val="24"/>
+                <w:sz w:val="22"/>
+                <w:szCs w:val="22"/>
               </w:rPr>
             </w:pPr>
             <w:r>
               <w:rPr>
                 <w:rFonts w:ascii="Times New Roman" w:hAnsi="Times New Roman"/>
-                <w:szCs w:val="24"/>
-              </w:rPr>
-              <w:t>&lt;&lt;[committee.</w:t>
-            </w:r>
-            <w:r>
-              <w:rPr>
-                <w:rFonts w:ascii="Times New Roman" w:hAnsi="Times New Roman"/>
-                <w:szCs w:val="24"/>
-              </w:rPr>
-              <w:t>federalAssemblyCountNew</w:t>
-            </w:r>
-            <w:r>
-              <w:rPr>
-                <w:rFonts w:ascii="Times New Roman" w:hAnsi="Times New Roman"/>
-                <w:szCs w:val="24"/>
-              </w:rPr>
-              <w:t>]&gt;&gt;</w:t>
-            </w:r>
-            <w:r>
-              <w:rPr>
-                <w:rFonts w:ascii="Times New Roman" w:hAnsi="Times New Roman"/>
-                <w:szCs w:val="24"/>
+                <w:sz w:val="22"/>
+                <w:szCs w:val="22"/>
+              </w:rPr>
+              <w:t>&lt;&lt;[committee.federalAssemblyCountNew]&gt;&gt;</w:t>
+            </w:r>
+            <w:r>
+              <w:rPr>
+                <w:rFonts w:ascii="Times New Roman" w:hAnsi="Times New Roman"/>
+                <w:sz w:val="22"/>
+                <w:szCs w:val="22"/>
                 <w:lang w:val="en-US"/>
               </w:rPr>
               <w:t>&lt;&lt;/if&gt;&gt;</w:t>
@@ -1601,14 +1944,16 @@
             <w:pPr>
               <w:rPr>
                 <w:rFonts w:ascii="Times New Roman" w:hAnsi="Times New Roman"/>
-                <w:szCs w:val="24"/>
+                <w:sz w:val="22"/>
+                <w:szCs w:val="22"/>
                 <w:lang w:val="fr-CH"/>
               </w:rPr>
             </w:pPr>
             <w:r>
               <w:rPr>
                 <w:rFonts w:ascii="Times New Roman" w:hAnsi="Times New Roman"/>
-                <w:szCs w:val="24"/>
+                <w:sz w:val="22"/>
+                <w:szCs w:val="22"/>
                 <w:lang w:val="fr-CH"/>
               </w:rPr>
               <w:t>&lt;&lt;if [c</w:t>
@@ -1617,7 +1962,8 @@
               <w:rPr>
                 <w:rFonts w:ascii="Times New Roman" w:hAnsi="Times New Roman"/>
                 <w:bCs/>
-                <w:szCs w:val="24"/>
+                <w:sz w:val="22"/>
+                <w:szCs w:val="22"/>
                 <w:lang w:val="fr-CH"/>
               </w:rPr>
               <w:t>ommittee.federalAssembly</w:t>
@@ -1626,7 +1972,8 @@
               <w:rPr>
                 <w:rFonts w:ascii="Times New Roman" w:hAnsi="Times New Roman"/>
                 <w:bCs/>
-                <w:szCs w:val="24"/>
+                <w:sz w:val="22"/>
+                <w:szCs w:val="22"/>
                 <w:lang w:val="fr-CH"/>
               </w:rPr>
               <w:t>Old</w:t>
@@ -1635,7 +1982,8 @@
               <w:rPr>
                 <w:rFonts w:ascii="Times New Roman" w:hAnsi="Times New Roman"/>
                 <w:bCs/>
-                <w:szCs w:val="24"/>
+                <w:sz w:val="22"/>
+                <w:szCs w:val="22"/>
                 <w:lang w:val="fr-CH"/>
               </w:rPr>
               <w:t>Display</w:t>
@@ -1643,7 +1991,8 @@
             <w:r>
               <w:rPr>
                 <w:rFonts w:ascii="Times New Roman" w:hAnsi="Times New Roman"/>
-                <w:szCs w:val="24"/>
+                <w:sz w:val="22"/>
+                <w:szCs w:val="22"/>
                 <w:lang w:val="fr-CH"/>
               </w:rPr>
               <w:t>]&gt;&gt;</w:t>
@@ -1651,7 +2000,8 @@
             <w:r>
               <w:rPr>
                 <w:rFonts w:ascii="Times New Roman" w:hAnsi="Times New Roman"/>
-                <w:szCs w:val="24"/>
+                <w:sz w:val="22"/>
+                <w:szCs w:val="22"/>
                 <w:lang w:val="fr-CH"/>
               </w:rPr>
               <w:t>Nombre de membres de l’Assemblée fédérale</w:t>
@@ -1667,29 +2017,17 @@
             <w:pPr>
               <w:rPr>
                 <w:rFonts w:ascii="Times New Roman" w:hAnsi="Times New Roman"/>
-                <w:szCs w:val="24"/>
+                <w:sz w:val="22"/>
+                <w:szCs w:val="22"/>
               </w:rPr>
             </w:pPr>
             <w:r>
               <w:rPr>
                 <w:rFonts w:ascii="Times New Roman" w:hAnsi="Times New Roman"/>
-                <w:szCs w:val="24"/>
-              </w:rPr>
-              <w:t>&lt;&lt;[committee.</w:t>
-            </w:r>
-            <w:r>
-              <w:rPr>
-                <w:rFonts w:ascii="Times New Roman" w:hAnsi="Times New Roman"/>
-                <w:szCs w:val="24"/>
-              </w:rPr>
-              <w:t>federalAssemblyCountOld</w:t>
-            </w:r>
-            <w:r>
-              <w:rPr>
-                <w:rFonts w:ascii="Times New Roman" w:hAnsi="Times New Roman"/>
-                <w:szCs w:val="24"/>
-              </w:rPr>
-              <w:t>]&gt;&gt;</w:t>
+                <w:sz w:val="22"/>
+                <w:szCs w:val="22"/>
+              </w:rPr>
+              <w:t>&lt;&lt;[committee.federalAssemblyCountOld]&gt;&gt;</w:t>
             </w:r>
           </w:p>
         </w:tc>
@@ -1701,34 +2039,23 @@
             <w:pPr>
               <w:rPr>
                 <w:rFonts w:ascii="Times New Roman" w:hAnsi="Times New Roman"/>
-                <w:szCs w:val="24"/>
+                <w:sz w:val="22"/>
+                <w:szCs w:val="22"/>
               </w:rPr>
             </w:pPr>
             <w:r>
               <w:rPr>
                 <w:rFonts w:ascii="Times New Roman" w:hAnsi="Times New Roman"/>
-                <w:szCs w:val="24"/>
-              </w:rPr>
-              <w:t>&lt;&lt;[committee.</w:t>
-            </w:r>
-            <w:r>
-              <w:rPr>
-                <w:rFonts w:ascii="Times New Roman" w:hAnsi="Times New Roman"/>
-                <w:szCs w:val="24"/>
-              </w:rPr>
-              <w:t>federalAssemblyCountNew</w:t>
-            </w:r>
-            <w:r>
-              <w:rPr>
-                <w:rFonts w:ascii="Times New Roman" w:hAnsi="Times New Roman"/>
-                <w:szCs w:val="24"/>
-              </w:rPr>
-              <w:t>]&gt;&gt;</w:t>
-            </w:r>
-            <w:r>
-              <w:rPr>
-                <w:rFonts w:ascii="Times New Roman" w:hAnsi="Times New Roman"/>
-                <w:szCs w:val="24"/>
+                <w:sz w:val="22"/>
+                <w:szCs w:val="22"/>
+              </w:rPr>
+              <w:t>&lt;&lt;[committee.federalAssemblyCountNew]&gt;&gt;</w:t>
+            </w:r>
+            <w:r>
+              <w:rPr>
+                <w:rFonts w:ascii="Times New Roman" w:hAnsi="Times New Roman"/>
+                <w:sz w:val="22"/>
+                <w:szCs w:val="22"/>
                 <w:lang w:val="en-US"/>
               </w:rPr>
               <w:t>&lt;&lt;/if&gt;&gt;</w:t>
@@ -1745,14 +2072,16 @@
             <w:pPr>
               <w:rPr>
                 <w:rFonts w:ascii="Times New Roman" w:hAnsi="Times New Roman"/>
-                <w:szCs w:val="24"/>
+                <w:sz w:val="22"/>
+                <w:szCs w:val="22"/>
                 <w:lang w:val="fr-CH"/>
               </w:rPr>
             </w:pPr>
             <w:r>
               <w:rPr>
                 <w:rFonts w:ascii="Times New Roman" w:hAnsi="Times New Roman"/>
-                <w:szCs w:val="24"/>
+                <w:sz w:val="22"/>
+                <w:szCs w:val="22"/>
                 <w:lang w:val="fr-CH"/>
               </w:rPr>
               <w:t>&lt;&lt;if [</w:t>
@@ -1760,7 +2089,8 @@
             <w:r>
               <w:rPr>
                 <w:rFonts w:ascii="Times New Roman" w:hAnsi="Times New Roman"/>
-                <w:szCs w:val="24"/>
+                <w:sz w:val="22"/>
+                <w:szCs w:val="22"/>
                 <w:lang w:val="fr-CH"/>
               </w:rPr>
               <w:t>c</w:t>
@@ -1769,7 +2099,8 @@
               <w:rPr>
                 <w:rFonts w:ascii="Times New Roman" w:hAnsi="Times New Roman"/>
                 <w:bCs/>
-                <w:szCs w:val="24"/>
+                <w:sz w:val="22"/>
+                <w:szCs w:val="22"/>
                 <w:lang w:val="fr-CH"/>
               </w:rPr>
               <w:t>ommittee.federalAssembly</w:t>
@@ -1778,7 +2109,8 @@
               <w:rPr>
                 <w:rFonts w:ascii="Times New Roman" w:hAnsi="Times New Roman"/>
                 <w:bCs/>
-                <w:szCs w:val="24"/>
+                <w:sz w:val="22"/>
+                <w:szCs w:val="22"/>
                 <w:lang w:val="fr-CH"/>
               </w:rPr>
               <w:t>New</w:t>
@@ -1787,7 +2119,8 @@
               <w:rPr>
                 <w:rFonts w:ascii="Times New Roman" w:hAnsi="Times New Roman"/>
                 <w:bCs/>
-                <w:szCs w:val="24"/>
+                <w:sz w:val="22"/>
+                <w:szCs w:val="22"/>
                 <w:lang w:val="fr-CH"/>
               </w:rPr>
               <w:t>Display</w:t>
@@ -1795,7 +2128,8 @@
             <w:r>
               <w:rPr>
                 <w:rFonts w:ascii="Times New Roman" w:hAnsi="Times New Roman"/>
-                <w:szCs w:val="24"/>
+                <w:sz w:val="22"/>
+                <w:szCs w:val="22"/>
                 <w:lang w:val="fr-CH"/>
               </w:rPr>
               <w:t>]&gt;&gt;</w:t>
@@ -1803,7 +2137,8 @@
             <w:r>
               <w:rPr>
                 <w:rFonts w:ascii="Times New Roman" w:hAnsi="Times New Roman"/>
-                <w:szCs w:val="24"/>
+                <w:sz w:val="22"/>
+                <w:szCs w:val="22"/>
                 <w:lang w:val="fr-CH"/>
               </w:rPr>
               <w:t>Nombre de membres de l’Assemblée fédérale</w:t>
@@ -1818,43 +2153,33 @@
             <w:pPr>
               <w:rPr>
                 <w:rFonts w:ascii="Times New Roman" w:hAnsi="Times New Roman"/>
-                <w:szCs w:val="24"/>
+                <w:sz w:val="22"/>
+                <w:szCs w:val="22"/>
               </w:rPr>
             </w:pPr>
             <w:r>
               <w:rPr>
                 <w:rFonts w:ascii="Times New Roman" w:hAnsi="Times New Roman"/>
-                <w:szCs w:val="24"/>
-              </w:rPr>
-              <w:t>&lt;&lt;[committee.</w:t>
-            </w:r>
-            <w:r>
-              <w:rPr>
-                <w:rFonts w:ascii="Times New Roman" w:hAnsi="Times New Roman"/>
-                <w:szCs w:val="24"/>
-              </w:rPr>
-              <w:t>federalAssembly</w:t>
-            </w:r>
-            <w:r>
-              <w:rPr>
-                <w:rFonts w:ascii="Times New Roman" w:hAnsi="Times New Roman"/>
-                <w:szCs w:val="24"/>
+                <w:sz w:val="22"/>
+                <w:szCs w:val="22"/>
+              </w:rPr>
+              <w:t>&lt;&lt;[committee.federalAssembly</w:t>
+            </w:r>
+            <w:r>
+              <w:rPr>
+                <w:rFonts w:ascii="Times New Roman" w:hAnsi="Times New Roman"/>
+                <w:sz w:val="22"/>
+                <w:szCs w:val="22"/>
               </w:rPr>
               <w:t>Count</w:t>
             </w:r>
             <w:r>
               <w:rPr>
                 <w:rFonts w:ascii="Times New Roman" w:hAnsi="Times New Roman"/>
-                <w:szCs w:val="24"/>
-              </w:rPr>
-              <w:t>Old</w:t>
-            </w:r>
-            <w:r>
-              <w:rPr>
-                <w:rFonts w:ascii="Times New Roman" w:hAnsi="Times New Roman"/>
-                <w:szCs w:val="24"/>
-              </w:rPr>
-              <w:t>]&gt;&gt;</w:t>
+                <w:sz w:val="22"/>
+                <w:szCs w:val="22"/>
+              </w:rPr>
+              <w:t>Old]&gt;&gt;</w:t>
             </w:r>
           </w:p>
         </w:tc>
@@ -1867,48 +2192,39 @@
             <w:pPr>
               <w:rPr>
                 <w:rFonts w:ascii="Times New Roman" w:hAnsi="Times New Roman"/>
-                <w:szCs w:val="24"/>
+                <w:sz w:val="22"/>
+                <w:szCs w:val="22"/>
               </w:rPr>
             </w:pPr>
             <w:r>
               <w:rPr>
                 <w:rFonts w:ascii="Times New Roman" w:hAnsi="Times New Roman"/>
-                <w:szCs w:val="24"/>
-              </w:rPr>
-              <w:t>&lt;&lt;[committee.</w:t>
-            </w:r>
-            <w:r>
-              <w:rPr>
-                <w:rFonts w:ascii="Times New Roman" w:hAnsi="Times New Roman"/>
-                <w:szCs w:val="24"/>
-              </w:rPr>
-              <w:t>federalAssembly</w:t>
-            </w:r>
-            <w:r>
-              <w:rPr>
-                <w:rFonts w:ascii="Times New Roman" w:hAnsi="Times New Roman"/>
-                <w:szCs w:val="24"/>
+                <w:sz w:val="22"/>
+                <w:szCs w:val="22"/>
+              </w:rPr>
+              <w:t>&lt;&lt;[committee.federalAssembly</w:t>
+            </w:r>
+            <w:r>
+              <w:rPr>
+                <w:rFonts w:ascii="Times New Roman" w:hAnsi="Times New Roman"/>
+                <w:sz w:val="22"/>
+                <w:szCs w:val="22"/>
               </w:rPr>
               <w:t>Count</w:t>
             </w:r>
             <w:r>
               <w:rPr>
                 <w:rFonts w:ascii="Times New Roman" w:hAnsi="Times New Roman"/>
-                <w:szCs w:val="24"/>
-              </w:rPr>
-              <w:t>New</w:t>
-            </w:r>
-            <w:r>
-              <w:rPr>
-                <w:rFonts w:ascii="Times New Roman" w:hAnsi="Times New Roman"/>
-                <w:szCs w:val="24"/>
-              </w:rPr>
-              <w:t>]&gt;&gt;</w:t>
-            </w:r>
-            <w:r>
-              <w:rPr>
-                <w:rFonts w:ascii="Times New Roman" w:hAnsi="Times New Roman"/>
-                <w:szCs w:val="24"/>
+                <w:sz w:val="22"/>
+                <w:szCs w:val="22"/>
+              </w:rPr>
+              <w:t>New]&gt;&gt;</w:t>
+            </w:r>
+            <w:r>
+              <w:rPr>
+                <w:rFonts w:ascii="Times New Roman" w:hAnsi="Times New Roman"/>
+                <w:sz w:val="22"/>
+                <w:szCs w:val="22"/>
                 <w:lang w:val="en-US"/>
               </w:rPr>
               <w:t>&lt;&lt;/if&gt;&gt;</w:t>
@@ -1928,14 +2244,16 @@
             <w:pPr>
               <w:rPr>
                 <w:rFonts w:ascii="Times New Roman" w:hAnsi="Times New Roman"/>
-                <w:szCs w:val="24"/>
+                <w:sz w:val="22"/>
+                <w:szCs w:val="22"/>
                 <w:lang w:val="fr-CH"/>
               </w:rPr>
             </w:pPr>
             <w:r>
               <w:rPr>
                 <w:rFonts w:ascii="Times New Roman" w:hAnsi="Times New Roman"/>
-                <w:szCs w:val="24"/>
+                <w:sz w:val="22"/>
+                <w:szCs w:val="22"/>
                 <w:lang w:val="fr-CH"/>
               </w:rPr>
               <w:t>&lt;&lt;if [c</w:t>
@@ -1944,7 +2262,8 @@
               <w:rPr>
                 <w:rFonts w:ascii="Times New Roman" w:hAnsi="Times New Roman"/>
                 <w:bCs/>
-                <w:szCs w:val="24"/>
+                <w:sz w:val="22"/>
+                <w:szCs w:val="22"/>
                 <w:lang w:val="fr-CH"/>
               </w:rPr>
               <w:t>ommittee.germanBothDisplay</w:t>
@@ -1952,7 +2271,8 @@
             <w:r>
               <w:rPr>
                 <w:rFonts w:ascii="Times New Roman" w:hAnsi="Times New Roman"/>
-                <w:szCs w:val="24"/>
+                <w:sz w:val="22"/>
+                <w:szCs w:val="22"/>
                 <w:lang w:val="fr-CH"/>
               </w:rPr>
               <w:t>]&gt;&gt;</w:t>
@@ -1960,7 +2280,8 @@
             <w:r>
               <w:rPr>
                 <w:rFonts w:ascii="Times New Roman" w:hAnsi="Times New Roman"/>
-                <w:szCs w:val="24"/>
+                <w:sz w:val="22"/>
+                <w:szCs w:val="22"/>
                 <w:lang w:val="fr-CH"/>
               </w:rPr>
               <w:t>Représentation de</w:t>
@@ -1968,7 +2289,8 @@
             <w:r>
               <w:rPr>
                 <w:rFonts w:ascii="Times New Roman" w:hAnsi="Times New Roman"/>
-                <w:szCs w:val="24"/>
+                <w:sz w:val="22"/>
+                <w:szCs w:val="22"/>
                 <w:lang w:val="fr-CH"/>
               </w:rPr>
               <w:t xml:space="preserve"> la</w:t>
@@ -1976,7 +2298,8 @@
             <w:r>
               <w:rPr>
                 <w:rFonts w:ascii="Times New Roman" w:hAnsi="Times New Roman"/>
-                <w:szCs w:val="24"/>
+                <w:sz w:val="22"/>
+                <w:szCs w:val="22"/>
                 <w:lang w:val="fr-CH"/>
               </w:rPr>
               <w:t xml:space="preserve"> communauté linguistique</w:t>
@@ -1984,7 +2307,8 @@
             <w:r>
               <w:rPr>
                 <w:rFonts w:ascii="Times New Roman" w:hAnsi="Times New Roman"/>
-                <w:szCs w:val="24"/>
+                <w:sz w:val="22"/>
+                <w:szCs w:val="22"/>
                 <w:lang w:val="fr-CH"/>
               </w:rPr>
               <w:t xml:space="preserve"> </w:t>
@@ -1992,7 +2316,8 @@
             <w:r>
               <w:rPr>
                 <w:rFonts w:ascii="Times New Roman" w:hAnsi="Times New Roman"/>
-                <w:szCs w:val="24"/>
+                <w:sz w:val="22"/>
+                <w:szCs w:val="22"/>
                 <w:lang w:val="fr-CH"/>
               </w:rPr>
               <w:t>allemande</w:t>
@@ -2008,43 +2333,33 @@
             <w:pPr>
               <w:rPr>
                 <w:rFonts w:ascii="Times New Roman" w:hAnsi="Times New Roman"/>
-                <w:szCs w:val="24"/>
+                <w:sz w:val="22"/>
+                <w:szCs w:val="22"/>
               </w:rPr>
             </w:pPr>
             <w:r>
               <w:rPr>
                 <w:rFonts w:ascii="Times New Roman" w:hAnsi="Times New Roman"/>
-                <w:szCs w:val="24"/>
-              </w:rPr>
-              <w:t>&lt;&lt;[committee.</w:t>
-            </w:r>
-            <w:r>
-              <w:rPr>
-                <w:rFonts w:ascii="Times New Roman" w:hAnsi="Times New Roman"/>
-                <w:szCs w:val="24"/>
-              </w:rPr>
-              <w:t>german</w:t>
-            </w:r>
-            <w:r>
-              <w:rPr>
-                <w:rFonts w:ascii="Times New Roman" w:hAnsi="Times New Roman"/>
-                <w:szCs w:val="24"/>
+                <w:sz w:val="22"/>
+                <w:szCs w:val="22"/>
+              </w:rPr>
+              <w:t>&lt;&lt;[committee.german</w:t>
+            </w:r>
+            <w:r>
+              <w:rPr>
+                <w:rFonts w:ascii="Times New Roman" w:hAnsi="Times New Roman"/>
+                <w:sz w:val="22"/>
+                <w:szCs w:val="22"/>
               </w:rPr>
               <w:t>Text</w:t>
             </w:r>
             <w:r>
               <w:rPr>
                 <w:rFonts w:ascii="Times New Roman" w:hAnsi="Times New Roman"/>
-                <w:szCs w:val="24"/>
-              </w:rPr>
-              <w:t>Old</w:t>
-            </w:r>
-            <w:r>
-              <w:rPr>
-                <w:rFonts w:ascii="Times New Roman" w:hAnsi="Times New Roman"/>
-                <w:szCs w:val="24"/>
-              </w:rPr>
-              <w:t>]&gt;&gt;</w:t>
+                <w:sz w:val="22"/>
+                <w:szCs w:val="22"/>
+              </w:rPr>
+              <w:t>Old]&gt;&gt;</w:t>
             </w:r>
           </w:p>
         </w:tc>
@@ -2057,41 +2372,39 @@
             <w:pPr>
               <w:rPr>
                 <w:rFonts w:ascii="Times New Roman" w:hAnsi="Times New Roman"/>
-                <w:szCs w:val="24"/>
+                <w:sz w:val="22"/>
+                <w:szCs w:val="22"/>
               </w:rPr>
             </w:pPr>
             <w:r>
               <w:rPr>
                 <w:rFonts w:ascii="Times New Roman" w:hAnsi="Times New Roman"/>
-                <w:szCs w:val="24"/>
+                <w:sz w:val="22"/>
+                <w:szCs w:val="22"/>
               </w:rPr>
               <w:t>&lt;&lt;[committee.</w:t>
             </w:r>
             <w:r>
               <w:rPr>
                 <w:rFonts w:ascii="Times New Roman" w:hAnsi="Times New Roman"/>
-                <w:szCs w:val="24"/>
+                <w:sz w:val="22"/>
+                <w:szCs w:val="22"/>
               </w:rPr>
               <w:t>germanText</w:t>
             </w:r>
             <w:r>
               <w:rPr>
                 <w:rFonts w:ascii="Times New Roman" w:hAnsi="Times New Roman"/>
-                <w:szCs w:val="24"/>
-              </w:rPr>
-              <w:t>New</w:t>
-            </w:r>
-            <w:r>
-              <w:rPr>
-                <w:rFonts w:ascii="Times New Roman" w:hAnsi="Times New Roman"/>
-                <w:szCs w:val="24"/>
-              </w:rPr>
-              <w:t>]&gt;&gt;</w:t>
-            </w:r>
-            <w:r>
-              <w:rPr>
-                <w:rFonts w:ascii="Times New Roman" w:hAnsi="Times New Roman"/>
-                <w:szCs w:val="24"/>
+                <w:sz w:val="22"/>
+                <w:szCs w:val="22"/>
+              </w:rPr>
+              <w:t>New]&gt;&gt;</w:t>
+            </w:r>
+            <w:r>
+              <w:rPr>
+                <w:rFonts w:ascii="Times New Roman" w:hAnsi="Times New Roman"/>
+                <w:sz w:val="22"/>
+                <w:szCs w:val="22"/>
                 <w:lang w:val="en-US"/>
               </w:rPr>
               <w:t xml:space="preserve"> &lt;&lt;/if&gt;&gt;</w:t>
@@ -2111,24 +2424,26 @@
             <w:pPr>
               <w:rPr>
                 <w:rFonts w:ascii="Times New Roman" w:hAnsi="Times New Roman"/>
-                <w:szCs w:val="24"/>
+                <w:sz w:val="22"/>
+                <w:szCs w:val="22"/>
                 <w:lang w:val="fr-CH"/>
               </w:rPr>
             </w:pPr>
             <w:r>
               <w:rPr>
                 <w:rFonts w:ascii="Times New Roman" w:hAnsi="Times New Roman"/>
-                <w:szCs w:val="24"/>
-                <w:lang w:val="fr-CH"/>
-              </w:rPr>
-              <w:lastRenderedPageBreak/>
+                <w:sz w:val="22"/>
+                <w:szCs w:val="22"/>
+                <w:lang w:val="fr-CH"/>
+              </w:rPr>
               <w:t>&lt;&lt;if [c</w:t>
             </w:r>
             <w:r>
               <w:rPr>
                 <w:rFonts w:ascii="Times New Roman" w:hAnsi="Times New Roman"/>
                 <w:bCs/>
-                <w:szCs w:val="24"/>
+                <w:sz w:val="22"/>
+                <w:szCs w:val="22"/>
                 <w:lang w:val="fr-CH"/>
               </w:rPr>
               <w:t>ommittee.germanOldDisplay</w:t>
@@ -2136,7 +2451,8 @@
             <w:r>
               <w:rPr>
                 <w:rFonts w:ascii="Times New Roman" w:hAnsi="Times New Roman"/>
-                <w:szCs w:val="24"/>
+                <w:sz w:val="22"/>
+                <w:szCs w:val="22"/>
                 <w:lang w:val="fr-CH"/>
               </w:rPr>
               <w:t>]&gt;&gt;</w:t>
@@ -2144,7 +2460,8 @@
             <w:r>
               <w:rPr>
                 <w:rFonts w:ascii="Times New Roman" w:hAnsi="Times New Roman"/>
-                <w:szCs w:val="24"/>
+                <w:sz w:val="22"/>
+                <w:szCs w:val="22"/>
                 <w:lang w:val="fr-CH"/>
               </w:rPr>
               <w:t xml:space="preserve">Représentation </w:t>
@@ -2152,34 +2469,11 @@
             <w:r>
               <w:rPr>
                 <w:rFonts w:ascii="Times New Roman" w:hAnsi="Times New Roman"/>
-                <w:szCs w:val="24"/>
-                <w:lang w:val="fr-CH"/>
-              </w:rPr>
-              <w:t>de</w:t>
-            </w:r>
-            <w:r>
-              <w:rPr>
-                <w:rFonts w:ascii="Times New Roman" w:hAnsi="Times New Roman"/>
-                <w:szCs w:val="24"/>
-                <w:lang w:val="fr-CH"/>
-              </w:rPr>
-              <w:t xml:space="preserve"> la</w:t>
-            </w:r>
-            <w:r>
-              <w:rPr>
-                <w:rFonts w:ascii="Times New Roman" w:hAnsi="Times New Roman"/>
-                <w:szCs w:val="24"/>
-                <w:lang w:val="fr-CH"/>
-              </w:rPr>
-              <w:t xml:space="preserve"> communauté linguistique </w:t>
-            </w:r>
-            <w:r>
-              <w:rPr>
-                <w:rFonts w:ascii="Times New Roman" w:hAnsi="Times New Roman"/>
-                <w:szCs w:val="24"/>
-                <w:lang w:val="fr-CH"/>
-              </w:rPr>
-              <w:t>allemande</w:t>
+                <w:sz w:val="22"/>
+                <w:szCs w:val="22"/>
+                <w:lang w:val="fr-CH"/>
+              </w:rPr>
+              <w:t>de la communauté linguistique allemande</w:t>
             </w:r>
           </w:p>
         </w:tc>
@@ -2192,29 +2486,17 @@
             <w:pPr>
               <w:rPr>
                 <w:rFonts w:ascii="Times New Roman" w:hAnsi="Times New Roman"/>
-                <w:szCs w:val="24"/>
+                <w:sz w:val="22"/>
+                <w:szCs w:val="22"/>
               </w:rPr>
             </w:pPr>
             <w:r>
               <w:rPr>
                 <w:rFonts w:ascii="Times New Roman" w:hAnsi="Times New Roman"/>
-                <w:szCs w:val="24"/>
-              </w:rPr>
-              <w:t>&lt;&lt;[committee.</w:t>
-            </w:r>
-            <w:r>
-              <w:rPr>
-                <w:rFonts w:ascii="Times New Roman" w:hAnsi="Times New Roman"/>
-                <w:szCs w:val="24"/>
-              </w:rPr>
-              <w:t>germanTextOld</w:t>
-            </w:r>
-            <w:r>
-              <w:rPr>
-                <w:rFonts w:ascii="Times New Roman" w:hAnsi="Times New Roman"/>
-                <w:szCs w:val="24"/>
-              </w:rPr>
-              <w:t>]&gt;&gt;</w:t>
+                <w:sz w:val="22"/>
+                <w:szCs w:val="22"/>
+              </w:rPr>
+              <w:t>&lt;&lt;[committee.germanTextOld]&gt;&gt;</w:t>
             </w:r>
           </w:p>
         </w:tc>
@@ -2226,34 +2508,23 @@
             <w:pPr>
               <w:rPr>
                 <w:rFonts w:ascii="Times New Roman" w:hAnsi="Times New Roman"/>
-                <w:szCs w:val="24"/>
+                <w:sz w:val="22"/>
+                <w:szCs w:val="22"/>
               </w:rPr>
             </w:pPr>
             <w:r>
               <w:rPr>
                 <w:rFonts w:ascii="Times New Roman" w:hAnsi="Times New Roman"/>
-                <w:szCs w:val="24"/>
-              </w:rPr>
-              <w:t>&lt;&lt;[committee.</w:t>
-            </w:r>
-            <w:r>
-              <w:rPr>
-                <w:rFonts w:ascii="Times New Roman" w:hAnsi="Times New Roman"/>
-                <w:szCs w:val="24"/>
-              </w:rPr>
-              <w:t>germanTextNew</w:t>
-            </w:r>
-            <w:r>
-              <w:rPr>
-                <w:rFonts w:ascii="Times New Roman" w:hAnsi="Times New Roman"/>
-                <w:szCs w:val="24"/>
-              </w:rPr>
-              <w:t>]&gt;&gt;</w:t>
-            </w:r>
-            <w:r>
-              <w:rPr>
-                <w:rFonts w:ascii="Times New Roman" w:hAnsi="Times New Roman"/>
-                <w:szCs w:val="24"/>
+                <w:sz w:val="22"/>
+                <w:szCs w:val="22"/>
+              </w:rPr>
+              <w:t>&lt;&lt;[committee.germanTextNew]&gt;&gt;</w:t>
+            </w:r>
+            <w:r>
+              <w:rPr>
+                <w:rFonts w:ascii="Times New Roman" w:hAnsi="Times New Roman"/>
+                <w:sz w:val="22"/>
+                <w:szCs w:val="22"/>
                 <w:lang w:val="en-US"/>
               </w:rPr>
               <w:t xml:space="preserve"> &lt;&lt;/if&gt;&gt;</w:t>
@@ -2273,23 +2544,27 @@
             <w:pPr>
               <w:rPr>
                 <w:rFonts w:ascii="Times New Roman" w:hAnsi="Times New Roman"/>
-                <w:szCs w:val="24"/>
+                <w:sz w:val="22"/>
+                <w:szCs w:val="22"/>
                 <w:lang w:val="fr-CH"/>
               </w:rPr>
             </w:pPr>
             <w:r>
               <w:rPr>
                 <w:rFonts w:ascii="Times New Roman" w:hAnsi="Times New Roman"/>
-                <w:szCs w:val="24"/>
-                <w:lang w:val="fr-CH"/>
-              </w:rPr>
+                <w:sz w:val="22"/>
+                <w:szCs w:val="22"/>
+                <w:lang w:val="fr-CH"/>
+              </w:rPr>
+              <w:lastRenderedPageBreak/>
               <w:t>&lt;&lt;if [c</w:t>
             </w:r>
             <w:r>
               <w:rPr>
                 <w:rFonts w:ascii="Times New Roman" w:hAnsi="Times New Roman"/>
                 <w:bCs/>
-                <w:szCs w:val="24"/>
+                <w:sz w:val="22"/>
+                <w:szCs w:val="22"/>
                 <w:lang w:val="fr-CH"/>
               </w:rPr>
               <w:t>ommittee.germanNewDisplay</w:t>
@@ -2297,7 +2572,8 @@
             <w:r>
               <w:rPr>
                 <w:rFonts w:ascii="Times New Roman" w:hAnsi="Times New Roman"/>
-                <w:szCs w:val="24"/>
+                <w:sz w:val="22"/>
+                <w:szCs w:val="22"/>
                 <w:lang w:val="fr-CH"/>
               </w:rPr>
               <w:t>]&gt;&gt;</w:t>
@@ -2305,7 +2581,8 @@
             <w:r>
               <w:rPr>
                 <w:rFonts w:ascii="Times New Roman" w:hAnsi="Times New Roman"/>
-                <w:szCs w:val="24"/>
+                <w:sz w:val="22"/>
+                <w:szCs w:val="22"/>
                 <w:lang w:val="fr-CH"/>
               </w:rPr>
               <w:t xml:space="preserve">Représentation </w:t>
@@ -2313,34 +2590,11 @@
             <w:r>
               <w:rPr>
                 <w:rFonts w:ascii="Times New Roman" w:hAnsi="Times New Roman"/>
-                <w:szCs w:val="24"/>
-                <w:lang w:val="fr-CH"/>
-              </w:rPr>
-              <w:t>de</w:t>
-            </w:r>
-            <w:r>
-              <w:rPr>
-                <w:rFonts w:ascii="Times New Roman" w:hAnsi="Times New Roman"/>
-                <w:szCs w:val="24"/>
-                <w:lang w:val="fr-CH"/>
-              </w:rPr>
-              <w:t xml:space="preserve"> la</w:t>
-            </w:r>
-            <w:r>
-              <w:rPr>
-                <w:rFonts w:ascii="Times New Roman" w:hAnsi="Times New Roman"/>
-                <w:szCs w:val="24"/>
-                <w:lang w:val="fr-CH"/>
-              </w:rPr>
-              <w:t xml:space="preserve"> communauté linguistique </w:t>
-            </w:r>
-            <w:r>
-              <w:rPr>
-                <w:rFonts w:ascii="Times New Roman" w:hAnsi="Times New Roman"/>
-                <w:szCs w:val="24"/>
-                <w:lang w:val="fr-CH"/>
-              </w:rPr>
-              <w:t>allemande</w:t>
+                <w:sz w:val="22"/>
+                <w:szCs w:val="22"/>
+                <w:lang w:val="fr-CH"/>
+              </w:rPr>
+              <w:t>de la communauté linguistique allemande</w:t>
             </w:r>
           </w:p>
         </w:tc>
@@ -2352,29 +2606,17 @@
             <w:pPr>
               <w:rPr>
                 <w:rFonts w:ascii="Times New Roman" w:hAnsi="Times New Roman"/>
-                <w:szCs w:val="24"/>
+                <w:sz w:val="22"/>
+                <w:szCs w:val="22"/>
               </w:rPr>
             </w:pPr>
             <w:r>
               <w:rPr>
                 <w:rFonts w:ascii="Times New Roman" w:hAnsi="Times New Roman"/>
-                <w:szCs w:val="24"/>
-              </w:rPr>
-              <w:t>&lt;&lt;[committee.</w:t>
-            </w:r>
-            <w:r>
-              <w:rPr>
-                <w:rFonts w:ascii="Times New Roman" w:hAnsi="Times New Roman"/>
-                <w:szCs w:val="24"/>
-              </w:rPr>
-              <w:t>germanTextOld</w:t>
-            </w:r>
-            <w:r>
-              <w:rPr>
-                <w:rFonts w:ascii="Times New Roman" w:hAnsi="Times New Roman"/>
-                <w:szCs w:val="24"/>
-              </w:rPr>
-              <w:t>]&gt;&gt;</w:t>
+                <w:sz w:val="22"/>
+                <w:szCs w:val="22"/>
+              </w:rPr>
+              <w:t>&lt;&lt;[committee.germanTextOld]&gt;&gt;</w:t>
             </w:r>
           </w:p>
         </w:tc>
@@ -2387,34 +2629,23 @@
             <w:pPr>
               <w:rPr>
                 <w:rFonts w:ascii="Times New Roman" w:hAnsi="Times New Roman"/>
-                <w:szCs w:val="24"/>
+                <w:sz w:val="22"/>
+                <w:szCs w:val="22"/>
               </w:rPr>
             </w:pPr>
             <w:r>
               <w:rPr>
                 <w:rFonts w:ascii="Times New Roman" w:hAnsi="Times New Roman"/>
-                <w:szCs w:val="24"/>
-              </w:rPr>
-              <w:t>&lt;&lt;[committee.</w:t>
-            </w:r>
-            <w:r>
-              <w:rPr>
-                <w:rFonts w:ascii="Times New Roman" w:hAnsi="Times New Roman"/>
-                <w:szCs w:val="24"/>
-              </w:rPr>
-              <w:t>germanTextNew</w:t>
-            </w:r>
-            <w:r>
-              <w:rPr>
-                <w:rFonts w:ascii="Times New Roman" w:hAnsi="Times New Roman"/>
-                <w:szCs w:val="24"/>
-              </w:rPr>
-              <w:t>]&gt;&gt;</w:t>
-            </w:r>
-            <w:r>
-              <w:rPr>
-                <w:rFonts w:ascii="Times New Roman" w:hAnsi="Times New Roman"/>
-                <w:szCs w:val="24"/>
+                <w:sz w:val="22"/>
+                <w:szCs w:val="22"/>
+              </w:rPr>
+              <w:t>&lt;&lt;[committee.germanTextNew]&gt;&gt;</w:t>
+            </w:r>
+            <w:r>
+              <w:rPr>
+                <w:rFonts w:ascii="Times New Roman" w:hAnsi="Times New Roman"/>
+                <w:sz w:val="22"/>
+                <w:szCs w:val="22"/>
                 <w:lang w:val="en-US"/>
               </w:rPr>
               <w:t xml:space="preserve"> &lt;&lt;/if&gt;&gt;</w:t>
@@ -2434,14 +2665,16 @@
             <w:pPr>
               <w:rPr>
                 <w:rFonts w:ascii="Times New Roman" w:hAnsi="Times New Roman"/>
-                <w:szCs w:val="24"/>
+                <w:sz w:val="22"/>
+                <w:szCs w:val="22"/>
                 <w:lang w:val="fr-CH"/>
               </w:rPr>
             </w:pPr>
             <w:r>
               <w:rPr>
                 <w:rFonts w:ascii="Times New Roman" w:hAnsi="Times New Roman"/>
-                <w:szCs w:val="24"/>
+                <w:sz w:val="22"/>
+                <w:szCs w:val="22"/>
                 <w:lang w:val="fr-CH"/>
               </w:rPr>
               <w:t>&lt;&lt;if [c</w:t>
@@ -2450,7 +2683,8 @@
               <w:rPr>
                 <w:rFonts w:ascii="Times New Roman" w:hAnsi="Times New Roman"/>
                 <w:bCs/>
-                <w:szCs w:val="24"/>
+                <w:sz w:val="22"/>
+                <w:szCs w:val="22"/>
                 <w:lang w:val="fr-CH"/>
               </w:rPr>
               <w:t>ommittee.frenchBothDisplay</w:t>
@@ -2458,7 +2692,8 @@
             <w:r>
               <w:rPr>
                 <w:rFonts w:ascii="Times New Roman" w:hAnsi="Times New Roman"/>
-                <w:szCs w:val="24"/>
+                <w:sz w:val="22"/>
+                <w:szCs w:val="22"/>
                 <w:lang w:val="fr-CH"/>
               </w:rPr>
               <w:t>]&gt;&gt;</w:t>
@@ -2467,7 +2702,8 @@
               <w:rPr>
                 <w:rFonts w:ascii="Times New Roman" w:hAnsi="Times New Roman"/>
                 <w:bCs/>
-                <w:szCs w:val="24"/>
+                <w:sz w:val="22"/>
+                <w:szCs w:val="22"/>
                 <w:lang w:val="fr-CH"/>
               </w:rPr>
               <w:t>Représentation de</w:t>
@@ -2476,19 +2712,11 @@
               <w:rPr>
                 <w:rFonts w:ascii="Times New Roman" w:hAnsi="Times New Roman"/>
                 <w:bCs/>
-                <w:szCs w:val="24"/>
-                <w:lang w:val="fr-CH"/>
-              </w:rPr>
-              <w:t xml:space="preserve"> la communauté linguistique </w:t>
-            </w:r>
-            <w:r>
-              <w:rPr>
-                <w:rFonts w:ascii="Times New Roman" w:hAnsi="Times New Roman"/>
-                <w:bCs/>
-                <w:szCs w:val="24"/>
-                <w:lang w:val="fr-CH"/>
-              </w:rPr>
-              <w:t>française</w:t>
+                <w:sz w:val="22"/>
+                <w:szCs w:val="22"/>
+                <w:lang w:val="fr-CH"/>
+              </w:rPr>
+              <w:t xml:space="preserve"> la communauté linguistique française</w:t>
             </w:r>
           </w:p>
         </w:tc>
@@ -2501,13 +2729,15 @@
             <w:pPr>
               <w:rPr>
                 <w:rFonts w:ascii="Times New Roman" w:hAnsi="Times New Roman"/>
-                <w:szCs w:val="24"/>
+                <w:sz w:val="22"/>
+                <w:szCs w:val="22"/>
               </w:rPr>
             </w:pPr>
             <w:r>
               <w:rPr>
                 <w:rFonts w:ascii="Times New Roman" w:hAnsi="Times New Roman"/>
-                <w:szCs w:val="24"/>
+                <w:sz w:val="22"/>
+                <w:szCs w:val="22"/>
               </w:rPr>
               <w:t>&lt;&lt;[committee.</w:t>
             </w:r>
@@ -2515,23 +2745,18 @@
               <w:rPr>
                 <w:rFonts w:ascii="Times New Roman" w:hAnsi="Times New Roman"/>
                 <w:bCs/>
-                <w:szCs w:val="24"/>
+                <w:sz w:val="22"/>
+                <w:szCs w:val="22"/>
               </w:rPr>
               <w:t>french</w:t>
             </w:r>
             <w:r>
               <w:rPr>
                 <w:rFonts w:ascii="Times New Roman" w:hAnsi="Times New Roman"/>
-                <w:szCs w:val="24"/>
-              </w:rPr>
-              <w:t>TextOld</w:t>
-            </w:r>
-            <w:r>
-              <w:rPr>
-                <w:rFonts w:ascii="Times New Roman" w:hAnsi="Times New Roman"/>
-                <w:szCs w:val="24"/>
-              </w:rPr>
-              <w:t>]&gt;&gt;</w:t>
+                <w:sz w:val="22"/>
+                <w:szCs w:val="22"/>
+              </w:rPr>
+              <w:t>TextOld]&gt;&gt;</w:t>
             </w:r>
           </w:p>
         </w:tc>
@@ -2544,34 +2769,23 @@
             <w:pPr>
               <w:rPr>
                 <w:rFonts w:ascii="Times New Roman" w:hAnsi="Times New Roman"/>
-                <w:szCs w:val="24"/>
+                <w:sz w:val="22"/>
+                <w:szCs w:val="22"/>
               </w:rPr>
             </w:pPr>
             <w:r>
               <w:rPr>
                 <w:rFonts w:ascii="Times New Roman" w:hAnsi="Times New Roman"/>
-                <w:szCs w:val="24"/>
-              </w:rPr>
-              <w:t>&lt;&lt;[committee.</w:t>
-            </w:r>
-            <w:r>
-              <w:rPr>
-                <w:rFonts w:ascii="Times New Roman" w:hAnsi="Times New Roman"/>
-                <w:szCs w:val="24"/>
-              </w:rPr>
-              <w:t>frenchTextNew</w:t>
-            </w:r>
-            <w:r>
-              <w:rPr>
-                <w:rFonts w:ascii="Times New Roman" w:hAnsi="Times New Roman"/>
-                <w:szCs w:val="24"/>
-              </w:rPr>
-              <w:t>]&gt;&gt;</w:t>
-            </w:r>
-            <w:r>
-              <w:rPr>
-                <w:rFonts w:ascii="Times New Roman" w:hAnsi="Times New Roman"/>
-                <w:szCs w:val="24"/>
+                <w:sz w:val="22"/>
+                <w:szCs w:val="22"/>
+              </w:rPr>
+              <w:t>&lt;&lt;[committee.frenchTextNew]&gt;&gt;</w:t>
+            </w:r>
+            <w:r>
+              <w:rPr>
+                <w:rFonts w:ascii="Times New Roman" w:hAnsi="Times New Roman"/>
+                <w:sz w:val="22"/>
+                <w:szCs w:val="22"/>
                 <w:lang w:val="en-US"/>
               </w:rPr>
               <w:t xml:space="preserve"> &lt;&lt;/if&gt;&gt;</w:t>
@@ -2591,14 +2805,16 @@
             <w:pPr>
               <w:rPr>
                 <w:rFonts w:ascii="Times New Roman" w:hAnsi="Times New Roman"/>
-                <w:szCs w:val="24"/>
+                <w:sz w:val="22"/>
+                <w:szCs w:val="22"/>
                 <w:lang w:val="fr-CH"/>
               </w:rPr>
             </w:pPr>
             <w:r>
               <w:rPr>
                 <w:rFonts w:ascii="Times New Roman" w:hAnsi="Times New Roman"/>
-                <w:szCs w:val="24"/>
+                <w:sz w:val="22"/>
+                <w:szCs w:val="22"/>
                 <w:lang w:val="fr-CH"/>
               </w:rPr>
               <w:t>&lt;&lt;if [c</w:t>
@@ -2607,7 +2823,8 @@
               <w:rPr>
                 <w:rFonts w:ascii="Times New Roman" w:hAnsi="Times New Roman"/>
                 <w:bCs/>
-                <w:szCs w:val="24"/>
+                <w:sz w:val="22"/>
+                <w:szCs w:val="22"/>
                 <w:lang w:val="fr-CH"/>
               </w:rPr>
               <w:t>ommittee.frenchOldDisplay</w:t>
@@ -2615,7 +2832,8 @@
             <w:r>
               <w:rPr>
                 <w:rFonts w:ascii="Times New Roman" w:hAnsi="Times New Roman"/>
-                <w:szCs w:val="24"/>
+                <w:sz w:val="22"/>
+                <w:szCs w:val="22"/>
                 <w:lang w:val="fr-CH"/>
               </w:rPr>
               <w:t>]&gt;&gt;</w:t>
@@ -2623,7 +2841,8 @@
             <w:r>
               <w:rPr>
                 <w:rFonts w:ascii="Times New Roman" w:hAnsi="Times New Roman"/>
-                <w:szCs w:val="24"/>
+                <w:sz w:val="22"/>
+                <w:szCs w:val="22"/>
                 <w:lang w:val="fr-CH"/>
               </w:rPr>
               <w:t xml:space="preserve">Représentation </w:t>
@@ -2632,19 +2851,11 @@
               <w:rPr>
                 <w:rFonts w:ascii="Times New Roman" w:hAnsi="Times New Roman"/>
                 <w:bCs/>
-                <w:szCs w:val="24"/>
-                <w:lang w:val="fr-CH"/>
-              </w:rPr>
-              <w:t xml:space="preserve">de la communauté linguistique </w:t>
-            </w:r>
-            <w:r>
-              <w:rPr>
-                <w:rFonts w:ascii="Times New Roman" w:hAnsi="Times New Roman"/>
-                <w:bCs/>
-                <w:szCs w:val="24"/>
-                <w:lang w:val="fr-CH"/>
-              </w:rPr>
-              <w:t>française</w:t>
+                <w:sz w:val="22"/>
+                <w:szCs w:val="22"/>
+                <w:lang w:val="fr-CH"/>
+              </w:rPr>
+              <w:t>de la communauté linguistique française</w:t>
             </w:r>
           </w:p>
         </w:tc>
@@ -2657,29 +2868,17 @@
             <w:pPr>
               <w:rPr>
                 <w:rFonts w:ascii="Times New Roman" w:hAnsi="Times New Roman"/>
-                <w:szCs w:val="24"/>
+                <w:sz w:val="22"/>
+                <w:szCs w:val="22"/>
               </w:rPr>
             </w:pPr>
             <w:r>
               <w:rPr>
                 <w:rFonts w:ascii="Times New Roman" w:hAnsi="Times New Roman"/>
-                <w:szCs w:val="24"/>
-              </w:rPr>
-              <w:t>&lt;&lt;[committee.</w:t>
-            </w:r>
-            <w:r>
-              <w:rPr>
-                <w:rFonts w:ascii="Times New Roman" w:hAnsi="Times New Roman"/>
-                <w:szCs w:val="24"/>
-              </w:rPr>
-              <w:t>frenchTextOld</w:t>
-            </w:r>
-            <w:r>
-              <w:rPr>
-                <w:rFonts w:ascii="Times New Roman" w:hAnsi="Times New Roman"/>
-                <w:szCs w:val="24"/>
-              </w:rPr>
-              <w:t>]&gt;&gt;</w:t>
+                <w:sz w:val="22"/>
+                <w:szCs w:val="22"/>
+              </w:rPr>
+              <w:t>&lt;&lt;[committee.frenchTextOld]&gt;&gt;</w:t>
             </w:r>
           </w:p>
         </w:tc>
@@ -2691,34 +2890,23 @@
             <w:pPr>
               <w:rPr>
                 <w:rFonts w:ascii="Times New Roman" w:hAnsi="Times New Roman"/>
-                <w:szCs w:val="24"/>
+                <w:sz w:val="22"/>
+                <w:szCs w:val="22"/>
               </w:rPr>
             </w:pPr>
             <w:r>
               <w:rPr>
                 <w:rFonts w:ascii="Times New Roman" w:hAnsi="Times New Roman"/>
-                <w:szCs w:val="24"/>
-              </w:rPr>
-              <w:t>&lt;&lt;[committee.</w:t>
-            </w:r>
-            <w:r>
-              <w:rPr>
-                <w:rFonts w:ascii="Times New Roman" w:hAnsi="Times New Roman"/>
-                <w:szCs w:val="24"/>
-              </w:rPr>
-              <w:t>frenchTextNew</w:t>
-            </w:r>
-            <w:r>
-              <w:rPr>
-                <w:rFonts w:ascii="Times New Roman" w:hAnsi="Times New Roman"/>
-                <w:szCs w:val="24"/>
-              </w:rPr>
-              <w:t>]&gt;&gt;</w:t>
-            </w:r>
-            <w:r>
-              <w:rPr>
-                <w:rFonts w:ascii="Times New Roman" w:hAnsi="Times New Roman"/>
-                <w:szCs w:val="24"/>
+                <w:sz w:val="22"/>
+                <w:szCs w:val="22"/>
+              </w:rPr>
+              <w:t>&lt;&lt;[committee.frenchTextNew]&gt;&gt;</w:t>
+            </w:r>
+            <w:r>
+              <w:rPr>
+                <w:rFonts w:ascii="Times New Roman" w:hAnsi="Times New Roman"/>
+                <w:sz w:val="22"/>
+                <w:szCs w:val="22"/>
                 <w:lang w:val="en-US"/>
               </w:rPr>
               <w:t xml:space="preserve"> &lt;&lt;/if&gt;&gt;</w:t>
@@ -2738,14 +2926,16 @@
             <w:pPr>
               <w:rPr>
                 <w:rFonts w:ascii="Times New Roman" w:hAnsi="Times New Roman"/>
-                <w:szCs w:val="24"/>
+                <w:sz w:val="22"/>
+                <w:szCs w:val="22"/>
                 <w:lang w:val="fr-CH"/>
               </w:rPr>
             </w:pPr>
             <w:r>
               <w:rPr>
                 <w:rFonts w:ascii="Times New Roman" w:hAnsi="Times New Roman"/>
-                <w:szCs w:val="24"/>
+                <w:sz w:val="22"/>
+                <w:szCs w:val="22"/>
                 <w:lang w:val="fr-CH"/>
               </w:rPr>
               <w:t>&lt;&lt;if [c</w:t>
@@ -2754,7 +2944,8 @@
               <w:rPr>
                 <w:rFonts w:ascii="Times New Roman" w:hAnsi="Times New Roman"/>
                 <w:bCs/>
-                <w:szCs w:val="24"/>
+                <w:sz w:val="22"/>
+                <w:szCs w:val="22"/>
                 <w:lang w:val="fr-CH"/>
               </w:rPr>
               <w:t>ommittee.frenchNewDisplay</w:t>
@@ -2762,7 +2953,8 @@
             <w:r>
               <w:rPr>
                 <w:rFonts w:ascii="Times New Roman" w:hAnsi="Times New Roman"/>
-                <w:szCs w:val="24"/>
+                <w:sz w:val="22"/>
+                <w:szCs w:val="22"/>
                 <w:lang w:val="fr-CH"/>
               </w:rPr>
               <w:t>]&gt;&gt;</w:t>
@@ -2770,7 +2962,8 @@
             <w:r>
               <w:rPr>
                 <w:rFonts w:ascii="Times New Roman" w:hAnsi="Times New Roman"/>
-                <w:szCs w:val="24"/>
+                <w:sz w:val="22"/>
+                <w:szCs w:val="22"/>
                 <w:lang w:val="fr-CH"/>
               </w:rPr>
               <w:t xml:space="preserve">Représentation </w:t>
@@ -2779,19 +2972,11 @@
               <w:rPr>
                 <w:rFonts w:ascii="Times New Roman" w:hAnsi="Times New Roman"/>
                 <w:bCs/>
-                <w:szCs w:val="24"/>
-                <w:lang w:val="fr-CH"/>
-              </w:rPr>
-              <w:t xml:space="preserve">de la communauté linguistique </w:t>
-            </w:r>
-            <w:r>
-              <w:rPr>
-                <w:rFonts w:ascii="Times New Roman" w:hAnsi="Times New Roman"/>
-                <w:bCs/>
-                <w:szCs w:val="24"/>
-                <w:lang w:val="fr-CH"/>
-              </w:rPr>
-              <w:t>française</w:t>
+                <w:sz w:val="22"/>
+                <w:szCs w:val="22"/>
+                <w:lang w:val="fr-CH"/>
+              </w:rPr>
+              <w:t>de la communauté linguistique française</w:t>
             </w:r>
           </w:p>
         </w:tc>
@@ -2803,29 +2988,17 @@
             <w:pPr>
               <w:rPr>
                 <w:rFonts w:ascii="Times New Roman" w:hAnsi="Times New Roman"/>
-                <w:szCs w:val="24"/>
+                <w:sz w:val="22"/>
+                <w:szCs w:val="22"/>
               </w:rPr>
             </w:pPr>
             <w:r>
               <w:rPr>
                 <w:rFonts w:ascii="Times New Roman" w:hAnsi="Times New Roman"/>
-                <w:szCs w:val="24"/>
-              </w:rPr>
-              <w:t>&lt;&lt;[committee.</w:t>
-            </w:r>
-            <w:r>
-              <w:rPr>
-                <w:rFonts w:ascii="Times New Roman" w:hAnsi="Times New Roman"/>
-                <w:szCs w:val="24"/>
-              </w:rPr>
-              <w:t>frenchTextOld</w:t>
-            </w:r>
-            <w:r>
-              <w:rPr>
-                <w:rFonts w:ascii="Times New Roman" w:hAnsi="Times New Roman"/>
-                <w:szCs w:val="24"/>
-              </w:rPr>
-              <w:t>]&gt;&gt;</w:t>
+                <w:sz w:val="22"/>
+                <w:szCs w:val="22"/>
+              </w:rPr>
+              <w:t>&lt;&lt;[committee.frenchTextOld]&gt;&gt;</w:t>
             </w:r>
           </w:p>
         </w:tc>
@@ -2838,34 +3011,23 @@
             <w:pPr>
               <w:rPr>
                 <w:rFonts w:ascii="Times New Roman" w:hAnsi="Times New Roman"/>
-                <w:szCs w:val="24"/>
+                <w:sz w:val="22"/>
+                <w:szCs w:val="22"/>
               </w:rPr>
             </w:pPr>
             <w:r>
               <w:rPr>
                 <w:rFonts w:ascii="Times New Roman" w:hAnsi="Times New Roman"/>
-                <w:szCs w:val="24"/>
-              </w:rPr>
-              <w:t>&lt;&lt;[committee.</w:t>
-            </w:r>
-            <w:r>
-              <w:rPr>
-                <w:rFonts w:ascii="Times New Roman" w:hAnsi="Times New Roman"/>
-                <w:szCs w:val="24"/>
-              </w:rPr>
-              <w:t>frenchTextNew</w:t>
-            </w:r>
-            <w:r>
-              <w:rPr>
-                <w:rFonts w:ascii="Times New Roman" w:hAnsi="Times New Roman"/>
-                <w:szCs w:val="24"/>
-              </w:rPr>
-              <w:t>]&gt;&gt;</w:t>
-            </w:r>
-            <w:r>
-              <w:rPr>
-                <w:rFonts w:ascii="Times New Roman" w:hAnsi="Times New Roman"/>
-                <w:szCs w:val="24"/>
+                <w:sz w:val="22"/>
+                <w:szCs w:val="22"/>
+              </w:rPr>
+              <w:t>&lt;&lt;[committee.frenchTextNew]&gt;&gt;</w:t>
+            </w:r>
+            <w:r>
+              <w:rPr>
+                <w:rFonts w:ascii="Times New Roman" w:hAnsi="Times New Roman"/>
+                <w:sz w:val="22"/>
+                <w:szCs w:val="22"/>
                 <w:lang w:val="en-US"/>
               </w:rPr>
               <w:t xml:space="preserve"> &lt;&lt;/if&gt;&gt;</w:t>
@@ -2885,14 +3047,16 @@
             <w:pPr>
               <w:rPr>
                 <w:rFonts w:ascii="Times New Roman" w:hAnsi="Times New Roman"/>
-                <w:szCs w:val="24"/>
+                <w:sz w:val="22"/>
+                <w:szCs w:val="22"/>
                 <w:lang w:val="fr-CH"/>
               </w:rPr>
             </w:pPr>
             <w:r>
               <w:rPr>
                 <w:rFonts w:ascii="Times New Roman" w:hAnsi="Times New Roman"/>
-                <w:szCs w:val="24"/>
+                <w:sz w:val="22"/>
+                <w:szCs w:val="22"/>
                 <w:lang w:val="fr-CH"/>
               </w:rPr>
               <w:t>&lt;&lt;if [c</w:t>
@@ -2901,7 +3065,8 @@
               <w:rPr>
                 <w:rFonts w:ascii="Times New Roman" w:hAnsi="Times New Roman"/>
                 <w:bCs/>
-                <w:szCs w:val="24"/>
+                <w:sz w:val="22"/>
+                <w:szCs w:val="22"/>
                 <w:lang w:val="fr-CH"/>
               </w:rPr>
               <w:t>ommittee.italianBothDisplay</w:t>
@@ -2909,7 +3074,8 @@
             <w:r>
               <w:rPr>
                 <w:rFonts w:ascii="Times New Roman" w:hAnsi="Times New Roman"/>
-                <w:szCs w:val="24"/>
+                <w:sz w:val="22"/>
+                <w:szCs w:val="22"/>
                 <w:lang w:val="fr-CH"/>
               </w:rPr>
               <w:t>]&gt;&gt;</w:t>
@@ -2917,7 +3083,8 @@
             <w:r>
               <w:rPr>
                 <w:rFonts w:ascii="Times New Roman" w:hAnsi="Times New Roman"/>
-                <w:szCs w:val="24"/>
+                <w:sz w:val="22"/>
+                <w:szCs w:val="22"/>
                 <w:lang w:val="fr-CH"/>
               </w:rPr>
               <w:t xml:space="preserve">Représentation </w:t>
@@ -2926,7 +3093,8 @@
               <w:rPr>
                 <w:rFonts w:ascii="Times New Roman" w:hAnsi="Times New Roman"/>
                 <w:bCs/>
-                <w:szCs w:val="24"/>
+                <w:sz w:val="22"/>
+                <w:szCs w:val="22"/>
                 <w:lang w:val="fr-CH"/>
               </w:rPr>
               <w:t>de la communauté linguistique</w:t>
@@ -2934,7 +3102,8 @@
             <w:r>
               <w:rPr>
                 <w:rFonts w:ascii="Times New Roman" w:hAnsi="Times New Roman"/>
-                <w:szCs w:val="24"/>
+                <w:sz w:val="22"/>
+                <w:szCs w:val="22"/>
                 <w:lang w:val="fr-CH"/>
               </w:rPr>
               <w:t xml:space="preserve"> </w:t>
@@ -2942,7 +3111,8 @@
             <w:r>
               <w:rPr>
                 <w:rFonts w:ascii="Times New Roman" w:hAnsi="Times New Roman"/>
-                <w:szCs w:val="24"/>
+                <w:sz w:val="22"/>
+                <w:szCs w:val="22"/>
                 <w:lang w:val="fr-CH"/>
               </w:rPr>
               <w:t>italienne</w:t>
@@ -2958,13 +3128,15 @@
             <w:pPr>
               <w:rPr>
                 <w:rFonts w:ascii="Times New Roman" w:hAnsi="Times New Roman"/>
-                <w:szCs w:val="24"/>
+                <w:sz w:val="22"/>
+                <w:szCs w:val="22"/>
               </w:rPr>
             </w:pPr>
             <w:r>
               <w:rPr>
                 <w:rFonts w:ascii="Times New Roman" w:hAnsi="Times New Roman"/>
-                <w:szCs w:val="24"/>
+                <w:sz w:val="22"/>
+                <w:szCs w:val="22"/>
               </w:rPr>
               <w:t>&lt;&lt;[committee.</w:t>
             </w:r>
@@ -2972,23 +3144,18 @@
               <w:rPr>
                 <w:rFonts w:ascii="Times New Roman" w:hAnsi="Times New Roman"/>
                 <w:bCs/>
-                <w:szCs w:val="24"/>
+                <w:sz w:val="22"/>
+                <w:szCs w:val="22"/>
               </w:rPr>
               <w:t>italian</w:t>
             </w:r>
             <w:r>
               <w:rPr>
                 <w:rFonts w:ascii="Times New Roman" w:hAnsi="Times New Roman"/>
-                <w:szCs w:val="24"/>
-              </w:rPr>
-              <w:t>TextOld</w:t>
-            </w:r>
-            <w:r>
-              <w:rPr>
-                <w:rFonts w:ascii="Times New Roman" w:hAnsi="Times New Roman"/>
-                <w:szCs w:val="24"/>
-              </w:rPr>
-              <w:t>]&gt;&gt;</w:t>
+                <w:sz w:val="22"/>
+                <w:szCs w:val="22"/>
+              </w:rPr>
+              <w:t>TextOld]&gt;&gt;</w:t>
             </w:r>
           </w:p>
         </w:tc>
@@ -3001,13 +3168,15 @@
             <w:pPr>
               <w:rPr>
                 <w:rFonts w:ascii="Times New Roman" w:hAnsi="Times New Roman"/>
-                <w:szCs w:val="24"/>
+                <w:sz w:val="22"/>
+                <w:szCs w:val="22"/>
               </w:rPr>
             </w:pPr>
             <w:r>
               <w:rPr>
                 <w:rFonts w:ascii="Times New Roman" w:hAnsi="Times New Roman"/>
-                <w:szCs w:val="24"/>
+                <w:sz w:val="22"/>
+                <w:szCs w:val="22"/>
               </w:rPr>
               <w:t>&lt;&lt;[committee.</w:t>
             </w:r>
@@ -3015,28 +3184,24 @@
               <w:rPr>
                 <w:rFonts w:ascii="Times New Roman" w:hAnsi="Times New Roman"/>
                 <w:bCs/>
-                <w:szCs w:val="24"/>
+                <w:sz w:val="22"/>
+                <w:szCs w:val="22"/>
               </w:rPr>
               <w:t>italian</w:t>
             </w:r>
             <w:r>
               <w:rPr>
                 <w:rFonts w:ascii="Times New Roman" w:hAnsi="Times New Roman"/>
-                <w:szCs w:val="24"/>
-              </w:rPr>
-              <w:t>TextNew</w:t>
-            </w:r>
-            <w:r>
-              <w:rPr>
-                <w:rFonts w:ascii="Times New Roman" w:hAnsi="Times New Roman"/>
-                <w:szCs w:val="24"/>
-              </w:rPr>
-              <w:t>]&gt;&gt;</w:t>
-            </w:r>
-            <w:r>
-              <w:rPr>
-                <w:rFonts w:ascii="Times New Roman" w:hAnsi="Times New Roman"/>
-                <w:szCs w:val="24"/>
+                <w:sz w:val="22"/>
+                <w:szCs w:val="22"/>
+              </w:rPr>
+              <w:t>TextNew]&gt;&gt;</w:t>
+            </w:r>
+            <w:r>
+              <w:rPr>
+                <w:rFonts w:ascii="Times New Roman" w:hAnsi="Times New Roman"/>
+                <w:sz w:val="22"/>
+                <w:szCs w:val="22"/>
                 <w:lang w:val="en-US"/>
               </w:rPr>
               <w:t xml:space="preserve"> &lt;&lt;/if&gt;&gt;</w:t>
@@ -3056,14 +3221,16 @@
             <w:pPr>
               <w:rPr>
                 <w:rFonts w:ascii="Times New Roman" w:hAnsi="Times New Roman"/>
-                <w:szCs w:val="24"/>
+                <w:sz w:val="22"/>
+                <w:szCs w:val="22"/>
                 <w:lang w:val="fr-CH"/>
               </w:rPr>
             </w:pPr>
             <w:r>
               <w:rPr>
                 <w:rFonts w:ascii="Times New Roman" w:hAnsi="Times New Roman"/>
-                <w:szCs w:val="24"/>
+                <w:sz w:val="22"/>
+                <w:szCs w:val="22"/>
                 <w:lang w:val="fr-CH"/>
               </w:rPr>
               <w:t>&lt;&lt;if [c</w:t>
@@ -3072,7 +3239,8 @@
               <w:rPr>
                 <w:rFonts w:ascii="Times New Roman" w:hAnsi="Times New Roman"/>
                 <w:bCs/>
-                <w:szCs w:val="24"/>
+                <w:sz w:val="22"/>
+                <w:szCs w:val="22"/>
                 <w:lang w:val="fr-CH"/>
               </w:rPr>
               <w:t>ommittee.italianOldDisplay</w:t>
@@ -3080,7 +3248,8 @@
             <w:r>
               <w:rPr>
                 <w:rFonts w:ascii="Times New Roman" w:hAnsi="Times New Roman"/>
-                <w:szCs w:val="24"/>
+                <w:sz w:val="22"/>
+                <w:szCs w:val="22"/>
                 <w:lang w:val="fr-CH"/>
               </w:rPr>
               <w:t>]&gt;&gt;</w:t>
@@ -3088,7 +3257,8 @@
             <w:r>
               <w:rPr>
                 <w:rFonts w:ascii="Times New Roman" w:hAnsi="Times New Roman"/>
-                <w:szCs w:val="24"/>
+                <w:sz w:val="22"/>
+                <w:szCs w:val="22"/>
                 <w:lang w:val="fr-CH"/>
               </w:rPr>
               <w:t xml:space="preserve">Représentation </w:t>
@@ -3097,7 +3267,8 @@
               <w:rPr>
                 <w:rFonts w:ascii="Times New Roman" w:hAnsi="Times New Roman"/>
                 <w:bCs/>
-                <w:szCs w:val="24"/>
+                <w:sz w:val="22"/>
+                <w:szCs w:val="22"/>
                 <w:lang w:val="fr-CH"/>
               </w:rPr>
               <w:t>de la communauté linguistique</w:t>
@@ -3105,18 +3276,11 @@
             <w:r>
               <w:rPr>
                 <w:rFonts w:ascii="Times New Roman" w:hAnsi="Times New Roman"/>
-                <w:szCs w:val="24"/>
-                <w:lang w:val="fr-CH"/>
-              </w:rPr>
-              <w:t xml:space="preserve"> </w:t>
-            </w:r>
-            <w:r>
-              <w:rPr>
-                <w:rFonts w:ascii="Times New Roman" w:hAnsi="Times New Roman"/>
-                <w:szCs w:val="24"/>
-                <w:lang w:val="fr-CH"/>
-              </w:rPr>
-              <w:t>italienne</w:t>
+                <w:sz w:val="22"/>
+                <w:szCs w:val="22"/>
+                <w:lang w:val="fr-CH"/>
+              </w:rPr>
+              <w:t xml:space="preserve"> italienne</w:t>
             </w:r>
           </w:p>
         </w:tc>
@@ -3129,29 +3293,17 @@
             <w:pPr>
               <w:rPr>
                 <w:rFonts w:ascii="Times New Roman" w:hAnsi="Times New Roman"/>
-                <w:szCs w:val="24"/>
+                <w:sz w:val="22"/>
+                <w:szCs w:val="22"/>
               </w:rPr>
             </w:pPr>
             <w:r>
               <w:rPr>
                 <w:rFonts w:ascii="Times New Roman" w:hAnsi="Times New Roman"/>
-                <w:szCs w:val="24"/>
-              </w:rPr>
-              <w:t>&lt;&lt;[committee.</w:t>
-            </w:r>
-            <w:r>
-              <w:rPr>
-                <w:rFonts w:ascii="Times New Roman" w:hAnsi="Times New Roman"/>
-                <w:szCs w:val="24"/>
-              </w:rPr>
-              <w:t>italianTextOld</w:t>
-            </w:r>
-            <w:r>
-              <w:rPr>
-                <w:rFonts w:ascii="Times New Roman" w:hAnsi="Times New Roman"/>
-                <w:szCs w:val="24"/>
-              </w:rPr>
-              <w:t>]&gt;&gt;</w:t>
+                <w:sz w:val="22"/>
+                <w:szCs w:val="22"/>
+              </w:rPr>
+              <w:t>&lt;&lt;[committee.italianTextOld]&gt;&gt;</w:t>
             </w:r>
           </w:p>
         </w:tc>
@@ -3163,34 +3315,23 @@
             <w:pPr>
               <w:rPr>
                 <w:rFonts w:ascii="Times New Roman" w:hAnsi="Times New Roman"/>
-                <w:szCs w:val="24"/>
+                <w:sz w:val="22"/>
+                <w:szCs w:val="22"/>
               </w:rPr>
             </w:pPr>
             <w:r>
               <w:rPr>
                 <w:rFonts w:ascii="Times New Roman" w:hAnsi="Times New Roman"/>
-                <w:szCs w:val="24"/>
-              </w:rPr>
-              <w:t>&lt;&lt;[committee.</w:t>
-            </w:r>
-            <w:r>
-              <w:rPr>
-                <w:rFonts w:ascii="Times New Roman" w:hAnsi="Times New Roman"/>
-                <w:szCs w:val="24"/>
-              </w:rPr>
-              <w:t>italianTextNew</w:t>
-            </w:r>
-            <w:r>
-              <w:rPr>
-                <w:rFonts w:ascii="Times New Roman" w:hAnsi="Times New Roman"/>
-                <w:szCs w:val="24"/>
-              </w:rPr>
-              <w:t>]&gt;&gt;</w:t>
-            </w:r>
-            <w:r>
-              <w:rPr>
-                <w:rFonts w:ascii="Times New Roman" w:hAnsi="Times New Roman"/>
-                <w:szCs w:val="24"/>
+                <w:sz w:val="22"/>
+                <w:szCs w:val="22"/>
+              </w:rPr>
+              <w:t>&lt;&lt;[committee.italianTextNew]&gt;&gt;</w:t>
+            </w:r>
+            <w:r>
+              <w:rPr>
+                <w:rFonts w:ascii="Times New Roman" w:hAnsi="Times New Roman"/>
+                <w:sz w:val="22"/>
+                <w:szCs w:val="22"/>
                 <w:lang w:val="en-US"/>
               </w:rPr>
               <w:t xml:space="preserve"> &lt;&lt;/if&gt;&gt;</w:t>
@@ -3210,14 +3351,16 @@
             <w:pPr>
               <w:rPr>
                 <w:rFonts w:ascii="Times New Roman" w:hAnsi="Times New Roman"/>
-                <w:szCs w:val="24"/>
+                <w:sz w:val="22"/>
+                <w:szCs w:val="22"/>
                 <w:lang w:val="fr-CH"/>
               </w:rPr>
             </w:pPr>
             <w:r>
               <w:rPr>
                 <w:rFonts w:ascii="Times New Roman" w:hAnsi="Times New Roman"/>
-                <w:szCs w:val="24"/>
+                <w:sz w:val="22"/>
+                <w:szCs w:val="22"/>
                 <w:lang w:val="fr-CH"/>
               </w:rPr>
               <w:t>&lt;&lt;if [c</w:t>
@@ -3226,7 +3369,8 @@
               <w:rPr>
                 <w:rFonts w:ascii="Times New Roman" w:hAnsi="Times New Roman"/>
                 <w:bCs/>
-                <w:szCs w:val="24"/>
+                <w:sz w:val="22"/>
+                <w:szCs w:val="22"/>
                 <w:lang w:val="fr-CH"/>
               </w:rPr>
               <w:t>ommittee.italianNewDisplay</w:t>
@@ -3234,7 +3378,8 @@
             <w:r>
               <w:rPr>
                 <w:rFonts w:ascii="Times New Roman" w:hAnsi="Times New Roman"/>
-                <w:szCs w:val="24"/>
+                <w:sz w:val="22"/>
+                <w:szCs w:val="22"/>
                 <w:lang w:val="fr-CH"/>
               </w:rPr>
               <w:t>]&gt;&gt;</w:t>
@@ -3242,7 +3387,8 @@
             <w:r>
               <w:rPr>
                 <w:rFonts w:ascii="Times New Roman" w:hAnsi="Times New Roman"/>
-                <w:szCs w:val="24"/>
+                <w:sz w:val="22"/>
+                <w:szCs w:val="22"/>
                 <w:lang w:val="fr-CH"/>
               </w:rPr>
               <w:t xml:space="preserve">Représentation </w:t>
@@ -3251,7 +3397,8 @@
               <w:rPr>
                 <w:rFonts w:ascii="Times New Roman" w:hAnsi="Times New Roman"/>
                 <w:bCs/>
-                <w:szCs w:val="24"/>
+                <w:sz w:val="22"/>
+                <w:szCs w:val="22"/>
                 <w:lang w:val="fr-CH"/>
               </w:rPr>
               <w:t>de la communauté linguistique</w:t>
@@ -3259,18 +3406,11 @@
             <w:r>
               <w:rPr>
                 <w:rFonts w:ascii="Times New Roman" w:hAnsi="Times New Roman"/>
-                <w:szCs w:val="24"/>
-                <w:lang w:val="fr-CH"/>
-              </w:rPr>
-              <w:t xml:space="preserve"> </w:t>
-            </w:r>
-            <w:r>
-              <w:rPr>
-                <w:rFonts w:ascii="Times New Roman" w:hAnsi="Times New Roman"/>
-                <w:szCs w:val="24"/>
-                <w:lang w:val="fr-CH"/>
-              </w:rPr>
-              <w:t>italienne</w:t>
+                <w:sz w:val="22"/>
+                <w:szCs w:val="22"/>
+                <w:lang w:val="fr-CH"/>
+              </w:rPr>
+              <w:t xml:space="preserve"> italienne</w:t>
             </w:r>
           </w:p>
         </w:tc>
@@ -3282,29 +3422,17 @@
             <w:pPr>
               <w:rPr>
                 <w:rFonts w:ascii="Times New Roman" w:hAnsi="Times New Roman"/>
-                <w:szCs w:val="24"/>
+                <w:sz w:val="22"/>
+                <w:szCs w:val="22"/>
               </w:rPr>
             </w:pPr>
             <w:r>
               <w:rPr>
                 <w:rFonts w:ascii="Times New Roman" w:hAnsi="Times New Roman"/>
-                <w:szCs w:val="24"/>
-              </w:rPr>
-              <w:t>&lt;&lt;[committee.</w:t>
-            </w:r>
-            <w:r>
-              <w:rPr>
-                <w:rFonts w:ascii="Times New Roman" w:hAnsi="Times New Roman"/>
-                <w:szCs w:val="24"/>
-              </w:rPr>
-              <w:t>italianTextOld</w:t>
-            </w:r>
-            <w:r>
-              <w:rPr>
-                <w:rFonts w:ascii="Times New Roman" w:hAnsi="Times New Roman"/>
-                <w:szCs w:val="24"/>
-              </w:rPr>
-              <w:t>]&gt;&gt;</w:t>
+                <w:sz w:val="22"/>
+                <w:szCs w:val="22"/>
+              </w:rPr>
+              <w:t>&lt;&lt;[committee.italianTextOld]&gt;&gt;</w:t>
             </w:r>
           </w:p>
         </w:tc>
@@ -3317,34 +3445,23 @@
             <w:pPr>
               <w:rPr>
                 <w:rFonts w:ascii="Times New Roman" w:hAnsi="Times New Roman"/>
-                <w:szCs w:val="24"/>
+                <w:sz w:val="22"/>
+                <w:szCs w:val="22"/>
               </w:rPr>
             </w:pPr>
             <w:r>
               <w:rPr>
                 <w:rFonts w:ascii="Times New Roman" w:hAnsi="Times New Roman"/>
-                <w:szCs w:val="24"/>
-              </w:rPr>
-              <w:t>&lt;&lt;[committee.</w:t>
-            </w:r>
-            <w:r>
-              <w:rPr>
-                <w:rFonts w:ascii="Times New Roman" w:hAnsi="Times New Roman"/>
-                <w:szCs w:val="24"/>
-              </w:rPr>
-              <w:t>italianTextNew</w:t>
-            </w:r>
-            <w:r>
-              <w:rPr>
-                <w:rFonts w:ascii="Times New Roman" w:hAnsi="Times New Roman"/>
-                <w:szCs w:val="24"/>
-              </w:rPr>
-              <w:t>]&gt;&gt;</w:t>
-            </w:r>
-            <w:r>
-              <w:rPr>
-                <w:rFonts w:ascii="Times New Roman" w:hAnsi="Times New Roman"/>
-                <w:szCs w:val="24"/>
+                <w:sz w:val="22"/>
+                <w:szCs w:val="22"/>
+              </w:rPr>
+              <w:t>&lt;&lt;[committee.italianTextNew]&gt;&gt;</w:t>
+            </w:r>
+            <w:r>
+              <w:rPr>
+                <w:rFonts w:ascii="Times New Roman" w:hAnsi="Times New Roman"/>
+                <w:sz w:val="22"/>
+                <w:szCs w:val="22"/>
                 <w:lang w:val="en-US"/>
               </w:rPr>
               <w:t xml:space="preserve"> &lt;&lt;/if&gt;&gt;</w:t>
@@ -3361,50 +3478,45 @@
             <w:pPr>
               <w:rPr>
                 <w:rFonts w:ascii="Times New Roman" w:hAnsi="Times New Roman"/>
-                <w:szCs w:val="24"/>
+                <w:sz w:val="22"/>
+                <w:szCs w:val="22"/>
+                <w:lang w:val="fr-CH"/>
               </w:rPr>
             </w:pPr>
             <w:r>
               <w:rPr>
                 <w:rFonts w:ascii="Times New Roman" w:hAnsi="Times New Roman"/>
-                <w:szCs w:val="24"/>
-              </w:rPr>
-              <w:t>&lt;&lt;if [</w:t>
-            </w:r>
-            <w:r>
-              <w:rPr>
-                <w:rFonts w:ascii="Times New Roman" w:hAnsi="Times New Roman"/>
-                <w:szCs w:val="24"/>
-              </w:rPr>
-              <w:t>c</w:t>
+                <w:sz w:val="22"/>
+                <w:szCs w:val="22"/>
+                <w:lang w:val="fr-CH"/>
+              </w:rPr>
+              <w:t>&lt;&lt;if [c</w:t>
             </w:r>
             <w:r>
               <w:rPr>
                 <w:rFonts w:ascii="Times New Roman" w:hAnsi="Times New Roman"/>
                 <w:bCs/>
-                <w:szCs w:val="24"/>
-              </w:rPr>
-              <w:t>ommittee.</w:t>
-            </w:r>
-            <w:r>
-              <w:rPr>
-                <w:rFonts w:ascii="Times New Roman" w:hAnsi="Times New Roman"/>
-                <w:bCs/>
-                <w:szCs w:val="24"/>
-              </w:rPr>
-              <w:t>GenderBothDisplay</w:t>
-            </w:r>
-            <w:r>
-              <w:rPr>
-                <w:rFonts w:ascii="Times New Roman" w:hAnsi="Times New Roman"/>
-                <w:szCs w:val="24"/>
+                <w:sz w:val="22"/>
+                <w:szCs w:val="22"/>
+                <w:lang w:val="fr-CH"/>
+              </w:rPr>
+              <w:t>ommittee.GenderBothDisplay</w:t>
+            </w:r>
+            <w:r>
+              <w:rPr>
+                <w:rFonts w:ascii="Times New Roman" w:hAnsi="Times New Roman"/>
+                <w:sz w:val="22"/>
+                <w:szCs w:val="22"/>
+                <w:lang w:val="fr-CH"/>
               </w:rPr>
               <w:t>]&gt;&gt;</w:t>
             </w:r>
             <w:r>
               <w:rPr>
                 <w:rFonts w:ascii="Times New Roman" w:hAnsi="Times New Roman"/>
-                <w:szCs w:val="24"/>
+                <w:sz w:val="22"/>
+                <w:szCs w:val="22"/>
+                <w:lang w:val="fr-CH"/>
               </w:rPr>
               <w:t>Représentation des sexes</w:t>
             </w:r>
@@ -3419,34 +3531,39 @@
             <w:pPr>
               <w:rPr>
                 <w:rFonts w:ascii="Times New Roman" w:hAnsi="Times New Roman"/>
-                <w:szCs w:val="24"/>
+                <w:sz w:val="22"/>
+                <w:szCs w:val="22"/>
               </w:rPr>
             </w:pPr>
             <w:r>
               <w:rPr>
                 <w:rFonts w:ascii="Times New Roman" w:hAnsi="Times New Roman"/>
-                <w:szCs w:val="24"/>
+                <w:sz w:val="22"/>
+                <w:szCs w:val="22"/>
               </w:rPr>
               <w:t>&lt;&lt;[committee.</w:t>
             </w:r>
             <w:r>
               <w:rPr>
                 <w:rFonts w:ascii="Times New Roman" w:hAnsi="Times New Roman"/>
-                <w:szCs w:val="24"/>
+                <w:sz w:val="22"/>
+                <w:szCs w:val="22"/>
               </w:rPr>
               <w:t>genderText</w:t>
             </w:r>
             <w:r>
               <w:rPr>
                 <w:rFonts w:ascii="Times New Roman" w:hAnsi="Times New Roman"/>
-                <w:szCs w:val="24"/>
+                <w:sz w:val="22"/>
+                <w:szCs w:val="22"/>
               </w:rPr>
               <w:t>Old</w:t>
             </w:r>
             <w:r>
               <w:rPr>
                 <w:rFonts w:ascii="Times New Roman" w:hAnsi="Times New Roman"/>
-                <w:szCs w:val="24"/>
+                <w:sz w:val="22"/>
+                <w:szCs w:val="22"/>
               </w:rPr>
               <w:t>]&gt;&gt;</w:t>
             </w:r>
@@ -3461,35 +3578,24 @@
             <w:pPr>
               <w:rPr>
                 <w:rFonts w:ascii="Times New Roman" w:hAnsi="Times New Roman"/>
-                <w:szCs w:val="24"/>
+                <w:sz w:val="22"/>
+                <w:szCs w:val="22"/>
                 <w:lang w:val="en-US"/>
               </w:rPr>
             </w:pPr>
             <w:r>
               <w:rPr>
                 <w:rFonts w:ascii="Times New Roman" w:hAnsi="Times New Roman"/>
-                <w:szCs w:val="24"/>
-              </w:rPr>
-              <w:t>&lt;&lt;[committee.</w:t>
-            </w:r>
-            <w:r>
-              <w:rPr>
-                <w:rFonts w:ascii="Times New Roman" w:hAnsi="Times New Roman"/>
-                <w:szCs w:val="24"/>
-              </w:rPr>
-              <w:t>genderTextNew</w:t>
-            </w:r>
-            <w:r>
-              <w:rPr>
-                <w:rFonts w:ascii="Times New Roman" w:hAnsi="Times New Roman"/>
-                <w:szCs w:val="24"/>
-              </w:rPr>
-              <w:t>]&gt;&gt;</w:t>
-            </w:r>
-            <w:r>
-              <w:rPr>
-                <w:rFonts w:ascii="Times New Roman" w:hAnsi="Times New Roman"/>
-                <w:szCs w:val="24"/>
+                <w:sz w:val="22"/>
+                <w:szCs w:val="22"/>
+              </w:rPr>
+              <w:t>&lt;&lt;[committee.genderTextNew]&gt;&gt;</w:t>
+            </w:r>
+            <w:r>
+              <w:rPr>
+                <w:rFonts w:ascii="Times New Roman" w:hAnsi="Times New Roman"/>
+                <w:sz w:val="22"/>
+                <w:szCs w:val="22"/>
                 <w:lang w:val="en-US"/>
               </w:rPr>
               <w:t>&lt;&lt;/if&gt;&gt;</w:t>
@@ -3506,50 +3612,45 @@
             <w:pPr>
               <w:rPr>
                 <w:rFonts w:ascii="Times New Roman" w:hAnsi="Times New Roman"/>
-                <w:szCs w:val="24"/>
+                <w:sz w:val="22"/>
+                <w:szCs w:val="22"/>
+                <w:lang w:val="fr-CH"/>
               </w:rPr>
             </w:pPr>
             <w:r>
               <w:rPr>
                 <w:rFonts w:ascii="Times New Roman" w:hAnsi="Times New Roman"/>
-                <w:szCs w:val="24"/>
-              </w:rPr>
-              <w:t>&lt;&lt;if [</w:t>
-            </w:r>
-            <w:r>
-              <w:rPr>
-                <w:rFonts w:ascii="Times New Roman" w:hAnsi="Times New Roman"/>
-                <w:szCs w:val="24"/>
-              </w:rPr>
-              <w:t>c</w:t>
+                <w:sz w:val="22"/>
+                <w:szCs w:val="22"/>
+                <w:lang w:val="fr-CH"/>
+              </w:rPr>
+              <w:t>&lt;&lt;if [c</w:t>
             </w:r>
             <w:r>
               <w:rPr>
                 <w:rFonts w:ascii="Times New Roman" w:hAnsi="Times New Roman"/>
                 <w:bCs/>
-                <w:szCs w:val="24"/>
-              </w:rPr>
-              <w:t>ommittee.</w:t>
-            </w:r>
-            <w:r>
-              <w:rPr>
-                <w:rFonts w:ascii="Times New Roman" w:hAnsi="Times New Roman"/>
-                <w:bCs/>
-                <w:szCs w:val="24"/>
-              </w:rPr>
-              <w:t>GenderOldDisplay</w:t>
-            </w:r>
-            <w:r>
-              <w:rPr>
-                <w:rFonts w:ascii="Times New Roman" w:hAnsi="Times New Roman"/>
-                <w:szCs w:val="24"/>
+                <w:sz w:val="22"/>
+                <w:szCs w:val="22"/>
+                <w:lang w:val="fr-CH"/>
+              </w:rPr>
+              <w:t>ommittee.GenderOldDisplay</w:t>
+            </w:r>
+            <w:r>
+              <w:rPr>
+                <w:rFonts w:ascii="Times New Roman" w:hAnsi="Times New Roman"/>
+                <w:sz w:val="22"/>
+                <w:szCs w:val="22"/>
+                <w:lang w:val="fr-CH"/>
               </w:rPr>
               <w:t>]&gt;&gt;</w:t>
             </w:r>
             <w:r>
               <w:rPr>
                 <w:rFonts w:ascii="Times New Roman" w:hAnsi="Times New Roman"/>
-                <w:szCs w:val="24"/>
+                <w:sz w:val="22"/>
+                <w:szCs w:val="22"/>
+                <w:lang w:val="fr-CH"/>
               </w:rPr>
               <w:t>Représentation des sexes</w:t>
             </w:r>
@@ -3564,29 +3665,17 @@
             <w:pPr>
               <w:rPr>
                 <w:rFonts w:ascii="Times New Roman" w:hAnsi="Times New Roman"/>
-                <w:szCs w:val="24"/>
+                <w:sz w:val="22"/>
+                <w:szCs w:val="22"/>
               </w:rPr>
             </w:pPr>
             <w:r>
               <w:rPr>
                 <w:rFonts w:ascii="Times New Roman" w:hAnsi="Times New Roman"/>
-                <w:szCs w:val="24"/>
-              </w:rPr>
-              <w:t>&lt;&lt;[committee.</w:t>
-            </w:r>
-            <w:r>
-              <w:rPr>
-                <w:rFonts w:ascii="Times New Roman" w:hAnsi="Times New Roman"/>
-                <w:szCs w:val="24"/>
-              </w:rPr>
-              <w:t>genderTextOld</w:t>
-            </w:r>
-            <w:r>
-              <w:rPr>
-                <w:rFonts w:ascii="Times New Roman" w:hAnsi="Times New Roman"/>
-                <w:szCs w:val="24"/>
-              </w:rPr>
-              <w:t>]&gt;&gt;</w:t>
+                <w:sz w:val="22"/>
+                <w:szCs w:val="22"/>
+              </w:rPr>
+              <w:t>&lt;&lt;[committee.genderTextOld]&gt;&gt;</w:t>
             </w:r>
           </w:p>
         </w:tc>
@@ -3598,35 +3687,24 @@
             <w:pPr>
               <w:rPr>
                 <w:rFonts w:ascii="Times New Roman" w:hAnsi="Times New Roman"/>
-                <w:szCs w:val="24"/>
+                <w:sz w:val="22"/>
+                <w:szCs w:val="22"/>
                 <w:lang w:val="en-US"/>
               </w:rPr>
             </w:pPr>
             <w:r>
               <w:rPr>
                 <w:rFonts w:ascii="Times New Roman" w:hAnsi="Times New Roman"/>
-                <w:szCs w:val="24"/>
-              </w:rPr>
-              <w:t>&lt;&lt;[committee.</w:t>
-            </w:r>
-            <w:r>
-              <w:rPr>
-                <w:rFonts w:ascii="Times New Roman" w:hAnsi="Times New Roman"/>
-                <w:szCs w:val="24"/>
-              </w:rPr>
-              <w:t>genderTextNew</w:t>
-            </w:r>
-            <w:r>
-              <w:rPr>
-                <w:rFonts w:ascii="Times New Roman" w:hAnsi="Times New Roman"/>
-                <w:szCs w:val="24"/>
-              </w:rPr>
-              <w:t>]&gt;&gt;</w:t>
-            </w:r>
-            <w:r>
-              <w:rPr>
-                <w:rFonts w:ascii="Times New Roman" w:hAnsi="Times New Roman"/>
-                <w:szCs w:val="24"/>
+                <w:sz w:val="22"/>
+                <w:szCs w:val="22"/>
+              </w:rPr>
+              <w:t>&lt;&lt;[committee.genderTextNew]&gt;&gt;</w:t>
+            </w:r>
+            <w:r>
+              <w:rPr>
+                <w:rFonts w:ascii="Times New Roman" w:hAnsi="Times New Roman"/>
+                <w:sz w:val="22"/>
+                <w:szCs w:val="22"/>
                 <w:lang w:val="en-US"/>
               </w:rPr>
               <w:t>&lt;&lt;/if&gt;&gt;</w:t>
@@ -3643,50 +3721,45 @@
             <w:pPr>
               <w:rPr>
                 <w:rFonts w:ascii="Times New Roman" w:hAnsi="Times New Roman"/>
-                <w:szCs w:val="24"/>
+                <w:sz w:val="22"/>
+                <w:szCs w:val="22"/>
+                <w:lang w:val="fr-CH"/>
               </w:rPr>
             </w:pPr>
             <w:r>
               <w:rPr>
                 <w:rFonts w:ascii="Times New Roman" w:hAnsi="Times New Roman"/>
-                <w:szCs w:val="24"/>
-              </w:rPr>
-              <w:t>&lt;&lt;if [</w:t>
-            </w:r>
-            <w:r>
-              <w:rPr>
-                <w:rFonts w:ascii="Times New Roman" w:hAnsi="Times New Roman"/>
-                <w:szCs w:val="24"/>
-              </w:rPr>
-              <w:t>c</w:t>
+                <w:sz w:val="22"/>
+                <w:szCs w:val="22"/>
+                <w:lang w:val="fr-CH"/>
+              </w:rPr>
+              <w:t>&lt;&lt;if [c</w:t>
             </w:r>
             <w:r>
               <w:rPr>
                 <w:rFonts w:ascii="Times New Roman" w:hAnsi="Times New Roman"/>
                 <w:bCs/>
-                <w:szCs w:val="24"/>
-              </w:rPr>
-              <w:t>ommittee.</w:t>
-            </w:r>
-            <w:r>
-              <w:rPr>
-                <w:rFonts w:ascii="Times New Roman" w:hAnsi="Times New Roman"/>
-                <w:bCs/>
-                <w:szCs w:val="24"/>
-              </w:rPr>
-              <w:t>GenderNewDisplay</w:t>
-            </w:r>
-            <w:r>
-              <w:rPr>
-                <w:rFonts w:ascii="Times New Roman" w:hAnsi="Times New Roman"/>
-                <w:szCs w:val="24"/>
+                <w:sz w:val="22"/>
+                <w:szCs w:val="22"/>
+                <w:lang w:val="fr-CH"/>
+              </w:rPr>
+              <w:t>ommittee.GenderNewDisplay</w:t>
+            </w:r>
+            <w:r>
+              <w:rPr>
+                <w:rFonts w:ascii="Times New Roman" w:hAnsi="Times New Roman"/>
+                <w:sz w:val="22"/>
+                <w:szCs w:val="22"/>
+                <w:lang w:val="fr-CH"/>
               </w:rPr>
               <w:t>]&gt;&gt;</w:t>
             </w:r>
             <w:r>
               <w:rPr>
                 <w:rFonts w:ascii="Times New Roman" w:hAnsi="Times New Roman"/>
-                <w:szCs w:val="24"/>
+                <w:sz w:val="22"/>
+                <w:szCs w:val="22"/>
+                <w:lang w:val="fr-CH"/>
               </w:rPr>
               <w:t>Représentation des sexes</w:t>
             </w:r>
@@ -3700,29 +3773,17 @@
             <w:pPr>
               <w:rPr>
                 <w:rFonts w:ascii="Times New Roman" w:hAnsi="Times New Roman"/>
-                <w:szCs w:val="24"/>
+                <w:sz w:val="22"/>
+                <w:szCs w:val="22"/>
               </w:rPr>
             </w:pPr>
             <w:r>
               <w:rPr>
                 <w:rFonts w:ascii="Times New Roman" w:hAnsi="Times New Roman"/>
-                <w:szCs w:val="24"/>
-              </w:rPr>
-              <w:t>&lt;&lt;[committee.</w:t>
-            </w:r>
-            <w:r>
-              <w:rPr>
-                <w:rFonts w:ascii="Times New Roman" w:hAnsi="Times New Roman"/>
-                <w:szCs w:val="24"/>
-              </w:rPr>
-              <w:t>genderTextOld</w:t>
-            </w:r>
-            <w:r>
-              <w:rPr>
-                <w:rFonts w:ascii="Times New Roman" w:hAnsi="Times New Roman"/>
-                <w:szCs w:val="24"/>
-              </w:rPr>
-              <w:t>]&gt;&gt;</w:t>
+                <w:sz w:val="22"/>
+                <w:szCs w:val="22"/>
+              </w:rPr>
+              <w:t>&lt;&lt;[committee.genderTextOld]&gt;&gt;</w:t>
             </w:r>
           </w:p>
         </w:tc>
@@ -3735,35 +3796,24 @@
             <w:pPr>
               <w:rPr>
                 <w:rFonts w:ascii="Times New Roman" w:hAnsi="Times New Roman"/>
-                <w:szCs w:val="24"/>
+                <w:sz w:val="22"/>
+                <w:szCs w:val="22"/>
                 <w:lang w:val="en-US"/>
               </w:rPr>
             </w:pPr>
             <w:r>
               <w:rPr>
                 <w:rFonts w:ascii="Times New Roman" w:hAnsi="Times New Roman"/>
-                <w:szCs w:val="24"/>
-              </w:rPr>
-              <w:t>&lt;&lt;[committee.</w:t>
-            </w:r>
-            <w:r>
-              <w:rPr>
-                <w:rFonts w:ascii="Times New Roman" w:hAnsi="Times New Roman"/>
-                <w:szCs w:val="24"/>
-              </w:rPr>
-              <w:t>genderTextNew</w:t>
-            </w:r>
-            <w:r>
-              <w:rPr>
-                <w:rFonts w:ascii="Times New Roman" w:hAnsi="Times New Roman"/>
-                <w:szCs w:val="24"/>
-              </w:rPr>
-              <w:t>]&gt;&gt;</w:t>
-            </w:r>
-            <w:r>
-              <w:rPr>
-                <w:rFonts w:ascii="Times New Roman" w:hAnsi="Times New Roman"/>
-                <w:szCs w:val="24"/>
+                <w:sz w:val="22"/>
+                <w:szCs w:val="22"/>
+              </w:rPr>
+              <w:t>&lt;&lt;[committee.genderTextNew]&gt;&gt;</w:t>
+            </w:r>
+            <w:r>
+              <w:rPr>
+                <w:rFonts w:ascii="Times New Roman" w:hAnsi="Times New Roman"/>
+                <w:sz w:val="22"/>
+                <w:szCs w:val="22"/>
                 <w:lang w:val="en-US"/>
               </w:rPr>
               <w:t>&lt;&lt;/if&gt;&gt;</w:t>
@@ -3780,13 +3830,15 @@
             <w:pPr>
               <w:rPr>
                 <w:rFonts w:ascii="Times New Roman" w:hAnsi="Times New Roman"/>
-                <w:szCs w:val="24"/>
+                <w:sz w:val="22"/>
+                <w:szCs w:val="22"/>
               </w:rPr>
             </w:pPr>
             <w:r>
               <w:rPr>
                 <w:rFonts w:ascii="Times New Roman" w:hAnsi="Times New Roman"/>
-                <w:szCs w:val="24"/>
+                <w:sz w:val="22"/>
+                <w:szCs w:val="22"/>
               </w:rPr>
               <w:t>Justification</w:t>
             </w:r>
@@ -3801,13 +3853,15 @@
             <w:pPr>
               <w:rPr>
                 <w:rFonts w:ascii="Times New Roman" w:hAnsi="Times New Roman"/>
-                <w:szCs w:val="24"/>
+                <w:sz w:val="22"/>
+                <w:szCs w:val="22"/>
               </w:rPr>
             </w:pPr>
             <w:r>
               <w:rPr>
                 <w:rFonts w:ascii="Times New Roman" w:hAnsi="Times New Roman"/>
-                <w:szCs w:val="24"/>
+                <w:sz w:val="22"/>
+                <w:szCs w:val="22"/>
                 <w:lang w:eastAsia="de-DE"/>
               </w:rPr>
               <w:t>&lt;&lt;[</w:t>
@@ -3815,21 +3869,16 @@
             <w:r>
               <w:rPr>
                 <w:rFonts w:ascii="Times New Roman" w:hAnsi="Times New Roman"/>
-                <w:szCs w:val="24"/>
-              </w:rPr>
-              <w:t>committee.</w:t>
-            </w:r>
-            <w:r>
-              <w:rPr>
-                <w:rFonts w:ascii="Times New Roman" w:hAnsi="Times New Roman"/>
-                <w:szCs w:val="24"/>
-              </w:rPr>
-              <w:t>justification</w:t>
-            </w:r>
-            <w:r>
-              <w:rPr>
-                <w:rFonts w:ascii="Times New Roman" w:hAnsi="Times New Roman"/>
-                <w:szCs w:val="24"/>
+                <w:sz w:val="22"/>
+                <w:szCs w:val="22"/>
+              </w:rPr>
+              <w:t>committee.justification</w:t>
+            </w:r>
+            <w:r>
+              <w:rPr>
+                <w:rFonts w:ascii="Times New Roman" w:hAnsi="Times New Roman"/>
+                <w:sz w:val="22"/>
+                <w:szCs w:val="22"/>
                 <w:lang w:eastAsia="de-DE"/>
               </w:rPr>
               <w:t>]&gt;&gt;</w:t>
@@ -3845,7 +3894,6 @@
         <w:jc w:val="both"/>
         <w:rPr>
           <w:rFonts w:ascii="Times New Roman" w:hAnsi="Times New Roman"/>
-          <w:szCs w:val="24"/>
           <w:lang w:val="en-US"/>
         </w:rPr>
       </w:pPr>
@@ -3853,8 +3901,6 @@
         <w:rPr>
           <w:rFonts w:ascii="Times New Roman" w:eastAsia="Times New Roman" w:hAnsi="Times New Roman"/>
           <w:b/>
-          <w:sz w:val="24"/>
-          <w:szCs w:val="24"/>
           <w:lang w:val="en-US" w:eastAsia="de-DE"/>
         </w:rPr>
         <w:t>&lt;&lt;/foreach&gt;&gt;</w:t>
@@ -3863,8 +3909,6 @@
         <w:rPr>
           <w:rFonts w:ascii="Times New Roman" w:eastAsia="Times New Roman" w:hAnsi="Times New Roman"/>
           <w:b/>
-          <w:sz w:val="24"/>
-          <w:szCs w:val="24"/>
           <w:lang w:val="en-US" w:eastAsia="de-DE"/>
         </w:rPr>
         <w:t>&lt;&lt;/foreach&gt;&gt;</w:t>
@@ -3872,7 +3916,6 @@
       <w:r>
         <w:rPr>
           <w:rFonts w:ascii="Times New Roman" w:hAnsi="Times New Roman"/>
-          <w:szCs w:val="24"/>
           <w:lang w:val="en-US"/>
         </w:rPr>
         <w:t>&lt;&lt;/foreach&gt;&gt;</w:t>
@@ -3905,6 +3948,7 @@
           <w:lang w:val="en-US"/>
         </w:rPr>
       </w:pPr>
+      <w:bookmarkStart w:id="6" w:name="_Toc238569178"/>
       <w:r>
         <w:rPr>
           <w:rFonts w:ascii="Times New Roman" w:hAnsi="Times New Roman" w:cs="Times New Roman"/>
@@ -3913,20 +3957,23 @@
         <w:lastRenderedPageBreak/>
         <w:t>Organes nouvellement créés</w:t>
       </w:r>
+      <w:bookmarkEnd w:id="6"/>
     </w:p>
     <w:p>
       <w:pPr>
         <w:jc w:val="both"/>
         <w:rPr>
           <w:rFonts w:ascii="Times New Roman" w:hAnsi="Times New Roman"/>
-          <w:szCs w:val="24"/>
+          <w:sz w:val="22"/>
+          <w:szCs w:val="22"/>
           <w:lang w:val="en-US"/>
         </w:rPr>
       </w:pPr>
       <w:r>
         <w:rPr>
           <w:rFonts w:ascii="Times New Roman" w:hAnsi="Times New Roman"/>
-          <w:szCs w:val="24"/>
+          <w:sz w:val="22"/>
+          <w:szCs w:val="22"/>
           <w:lang w:val="en-US"/>
         </w:rPr>
         <w:t>&lt;&lt;foreach [newCommittee in compareList.newCommittees]&gt;&gt;</w:t>
@@ -3947,6 +3994,7 @@
           <w:rFonts w:ascii="Times New Roman" w:hAnsi="Times New Roman" w:cs="Times New Roman"/>
         </w:rPr>
       </w:pPr>
+      <w:bookmarkStart w:id="7" w:name="_Toc238569179"/>
       <w:r>
         <w:rPr>
           <w:rFonts w:ascii="Times New Roman" w:hAnsi="Times New Roman" w:cs="Times New Roman"/>
@@ -3966,20 +4014,24 @@
         </w:rPr>
         <w:t>.name]&gt;&gt;</w:t>
       </w:r>
+      <w:bookmarkEnd w:id="7"/>
     </w:p>
     <w:p>
       <w:pPr>
+        <w:ind w:left="567"/>
         <w:jc w:val="both"/>
         <w:rPr>
           <w:rFonts w:ascii="Times New Roman" w:hAnsi="Times New Roman"/>
-          <w:szCs w:val="24"/>
+          <w:sz w:val="22"/>
+          <w:szCs w:val="22"/>
           <w:lang w:val="fr-CH"/>
         </w:rPr>
       </w:pPr>
       <w:r>
         <w:rPr>
           <w:rFonts w:ascii="Times New Roman" w:hAnsi="Times New Roman"/>
-          <w:szCs w:val="24"/>
+          <w:sz w:val="22"/>
+          <w:szCs w:val="22"/>
           <w:lang w:val="fr-CH"/>
         </w:rPr>
         <w:t>Date de début: &lt;&lt;[newCommittee.startDate] :"dd.MM.yyyy"&gt;&gt;</w:t>
@@ -3988,20 +4040,16 @@
     <w:p>
       <w:pPr>
         <w:pStyle w:val="Listenabsatz"/>
-        <w:ind w:left="0"/>
+        <w:ind w:left="567"/>
         <w:jc w:val="both"/>
         <w:rPr>
           <w:rFonts w:ascii="Times New Roman" w:hAnsi="Times New Roman"/>
-          <w:sz w:val="24"/>
-          <w:szCs w:val="24"/>
           <w:lang w:val="fr-CH"/>
         </w:rPr>
       </w:pPr>
       <w:r>
         <w:rPr>
           <w:rFonts w:ascii="Times New Roman" w:hAnsi="Times New Roman"/>
-          <w:sz w:val="24"/>
-          <w:szCs w:val="24"/>
           <w:lang w:val="fr-CH"/>
         </w:rPr>
         <w:t>Nombre de membres: &lt;&lt;[newCommittee.memberCount]&gt;&gt;</w:t>
@@ -4010,20 +4058,16 @@
     <w:p>
       <w:pPr>
         <w:pStyle w:val="Listenabsatz"/>
-        <w:ind w:left="0"/>
+        <w:ind w:left="567"/>
         <w:jc w:val="both"/>
         <w:rPr>
           <w:rFonts w:ascii="Times New Roman" w:hAnsi="Times New Roman"/>
-          <w:sz w:val="24"/>
-          <w:szCs w:val="24"/>
           <w:lang w:val="fr-CH"/>
         </w:rPr>
       </w:pPr>
       <w:r>
         <w:rPr>
           <w:rFonts w:ascii="Times New Roman" w:hAnsi="Times New Roman"/>
-          <w:sz w:val="24"/>
-          <w:szCs w:val="24"/>
           <w:lang w:val="fr-CH"/>
         </w:rPr>
         <w:t>Représentation des sexes</w:t>
@@ -4031,8 +4075,6 @@
       <w:r>
         <w:rPr>
           <w:rFonts w:ascii="Times New Roman" w:hAnsi="Times New Roman"/>
-          <w:sz w:val="24"/>
-          <w:szCs w:val="24"/>
           <w:lang w:val="fr-CH"/>
         </w:rPr>
         <w:t>: &lt;&lt;[newCommittee.genderQuota]&gt;&gt;</w:t>
@@ -4041,38 +4083,23 @@
     <w:p>
       <w:pPr>
         <w:pStyle w:val="Listenabsatz"/>
-        <w:ind w:left="0"/>
+        <w:ind w:left="567"/>
         <w:jc w:val="both"/>
         <w:rPr>
           <w:rFonts w:ascii="Times New Roman" w:hAnsi="Times New Roman"/>
-          <w:sz w:val="24"/>
-          <w:szCs w:val="24"/>
           <w:lang w:val="fr-CH"/>
         </w:rPr>
       </w:pPr>
       <w:r>
         <w:rPr>
           <w:rFonts w:ascii="Times New Roman" w:hAnsi="Times New Roman"/>
-          <w:sz w:val="24"/>
-          <w:szCs w:val="24"/>
           <w:lang w:val="fr-CH"/>
         </w:rPr>
-        <w:t xml:space="preserve">Représentation des communautés </w:t>
+        <w:t>Représentation des communautés linguistiques</w:t>
       </w:r>
       <w:r>
         <w:rPr>
           <w:rFonts w:ascii="Times New Roman" w:hAnsi="Times New Roman"/>
-          <w:sz w:val="24"/>
-          <w:szCs w:val="24"/>
-          <w:lang w:val="fr-CH"/>
-        </w:rPr>
-        <w:t>linguistiques</w:t>
-      </w:r>
-      <w:r>
-        <w:rPr>
-          <w:rFonts w:ascii="Times New Roman" w:hAnsi="Times New Roman"/>
-          <w:sz w:val="24"/>
-          <w:szCs w:val="24"/>
           <w:lang w:val="fr-CH"/>
         </w:rPr>
         <w:t>: &lt;&lt;[newCommittee.languageQuota]&gt;&gt;</w:t>
@@ -4085,16 +4112,12 @@
         <w:jc w:val="both"/>
         <w:rPr>
           <w:rFonts w:ascii="Times New Roman" w:hAnsi="Times New Roman"/>
-          <w:sz w:val="24"/>
-          <w:szCs w:val="24"/>
           <w:lang w:val="it-CH"/>
         </w:rPr>
       </w:pPr>
       <w:r>
         <w:rPr>
           <w:rFonts w:ascii="Times New Roman" w:hAnsi="Times New Roman"/>
-          <w:sz w:val="24"/>
-          <w:szCs w:val="24"/>
           <w:lang w:val="it-CH"/>
         </w:rPr>
         <w:t>&lt;&lt;/foreach&gt;&gt;</w:t>
@@ -4120,6 +4143,7 @@
           <w:lang w:val="en-US"/>
         </w:rPr>
       </w:pPr>
+      <w:bookmarkStart w:id="8" w:name="_Toc238569180"/>
       <w:r>
         <w:rPr>
           <w:rFonts w:ascii="Times New Roman" w:hAnsi="Times New Roman" w:cs="Times New Roman"/>
@@ -4127,6 +4151,7 @@
         </w:rPr>
         <w:t>Organes dissous</w:t>
       </w:r>
+      <w:bookmarkEnd w:id="8"/>
     </w:p>
     <w:p>
       <w:pPr>
@@ -4161,6 +4186,7 @@
           <w:rFonts w:ascii="Times New Roman" w:hAnsi="Times New Roman" w:cs="Times New Roman"/>
         </w:rPr>
       </w:pPr>
+      <w:bookmarkStart w:id="9" w:name="_Toc238569181"/>
       <w:r>
         <w:rPr>
           <w:rFonts w:ascii="Times New Roman" w:hAnsi="Times New Roman" w:cs="Times New Roman"/>
@@ -4180,9 +4206,11 @@
         </w:rPr>
         <w:t>.name]&gt;&gt;</w:t>
       </w:r>
+      <w:bookmarkEnd w:id="9"/>
     </w:p>
     <w:p>
       <w:pPr>
+        <w:ind w:left="567"/>
         <w:jc w:val="both"/>
         <w:rPr>
           <w:rFonts w:ascii="Times New Roman" w:hAnsi="Times New Roman"/>
@@ -4236,7 +4264,7 @@
 </file>
 
 <file path=word/endnotes.xml><?xml version="1.0" encoding="utf-8"?>
-<w:endnotes xmlns:wpc="http://schemas.microsoft.com/office/word/2010/wordprocessingCanvas" xmlns:cx="http://schemas.microsoft.com/office/drawing/2014/chartex" xmlns:cx1="http://schemas.microsoft.com/office/drawing/2015/9/8/chartex" xmlns:cx2="http://schemas.microsoft.com/office/drawing/2015/10/21/chartex" xmlns:cx3="http://schemas.microsoft.com/office/drawing/2016/5/9/chartex" xmlns:cx4="http://schemas.microsoft.com/office/drawing/2016/5/10/chartex" xmlns:cx5="http://schemas.microsoft.com/office/drawing/2016/5/11/chartex" xmlns:cx6="http://schemas.microsoft.com/office/drawing/2016/5/12/chartex" xmlns:cx7="http://schemas.microsoft.com/office/drawing/2016/5/13/chartex" xmlns:cx8="http://schemas.microsoft.com/office/drawing/2016/5/14/chartex" xmlns:mc="http://schemas.openxmlformats.org/markup-compatibility/2006" xmlns:aink="http://schemas.microsoft.com/office/drawing/2016/ink" xmlns:am3d="http://schemas.microsoft.com/office/drawing/2017/model3d" xmlns:o="urn:schemas-microsoft-com:office:office" xmlns:oel="http://schemas.microsoft.com/office/2019/extlst" xmlns:r="http://schemas.openxmlformats.org/officeDocument/2006/relationships" xmlns:m="http://schemas.openxmlformats.org/officeDocument/2006/math" xmlns:v="urn:schemas-microsoft-com:vml" xmlns:wp14="http://schemas.microsoft.com/office/word/2010/wordprocessingDrawing" xmlns:wp="http://schemas.openxmlformats.org/drawingml/2006/wordprocessingDrawing" xmlns:w10="urn:schemas-microsoft-com:office:word" xmlns:w="http://schemas.openxmlformats.org/wordprocessingml/2006/main" xmlns:w14="http://schemas.microsoft.com/office/word/2010/wordml" xmlns:w15="http://schemas.microsoft.com/office/word/2012/wordml" xmlns:w16cex="http://schemas.microsoft.com/office/word/2018/wordml/cex" xmlns:w16cid="http://schemas.microsoft.com/office/word/2016/wordml/cid" xmlns:w16="http://schemas.microsoft.com/office/word/2018/wordml" xmlns:w16du="http://schemas.microsoft.com/office/word/2023/wordml/word16du" xmlns:w16sdtdh="http://schemas.microsoft.com/office/word/2020/wordml/sdtdatahash" xmlns:w16sdtfl="http://schemas.microsoft.com/office/word/2024/wordml/sdtformatlock" xmlns:w16se="http://schemas.microsoft.com/office/word/2015/wordml/symex" xmlns:wpg="http://schemas.microsoft.com/office/word/2010/wordprocessingGroup" xmlns:wpi="http://schemas.microsoft.com/office/word/2010/wordprocessingInk" xmlns:wne="http://schemas.microsoft.com/office/word/2006/wordml" xmlns:wps="http://schemas.microsoft.com/office/word/2010/wordprocessingShape" mc:Ignorable="w14 w15 w16se w16cid w16 w16cex w16sdtdh w16sdtfl w16du wp14">
+<w:endnotes xmlns:wpc="http://schemas.microsoft.com/office/word/2010/wordprocessingCanvas" xmlns:cx="http://schemas.microsoft.com/office/drawing/2014/chartex" xmlns:cx1="http://schemas.microsoft.com/office/drawing/2015/9/8/chartex" xmlns:cx2="http://schemas.microsoft.com/office/drawing/2015/10/21/chartex" xmlns:cx3="http://schemas.microsoft.com/office/drawing/2016/5/9/chartex" xmlns:cx4="http://schemas.microsoft.com/office/drawing/2016/5/10/chartex" xmlns:cx5="http://schemas.microsoft.com/office/drawing/2016/5/11/chartex" xmlns:cx6="http://schemas.microsoft.com/office/drawing/2016/5/12/chartex" xmlns:cx7="http://schemas.microsoft.com/office/drawing/2016/5/13/chartex" xmlns:cx8="http://schemas.microsoft.com/office/drawing/2016/5/14/chartex" xmlns:mc="http://schemas.openxmlformats.org/markup-compatibility/2006" xmlns:aink="http://schemas.microsoft.com/office/drawing/2016/ink" xmlns:am3d="http://schemas.microsoft.com/office/drawing/2017/model3d" xmlns:o="urn:schemas-microsoft-com:office:office" xmlns:oel="http://schemas.microsoft.com/office/2019/extlst" xmlns:r="http://schemas.openxmlformats.org/officeDocument/2006/relationships" xmlns:m="http://schemas.openxmlformats.org/officeDocument/2006/math" xmlns:v="urn:schemas-microsoft-com:vml" xmlns:wp14="http://schemas.microsoft.com/office/word/2010/wordprocessingDrawing" xmlns:wp="http://schemas.openxmlformats.org/drawingml/2006/wordprocessingDrawing" xmlns:w10="urn:schemas-microsoft-com:office:word" xmlns:w="http://schemas.openxmlformats.org/wordprocessingml/2006/main" xmlns:w14="http://schemas.microsoft.com/office/word/2010/wordml" xmlns:w15="http://schemas.microsoft.com/office/word/2012/wordml" xmlns:w16cei="http://schemas.microsoft.com/office/word/2026/wordml/cei" xmlns:w16cex="http://schemas.microsoft.com/office/word/2018/wordml/cex" xmlns:w16cid="http://schemas.microsoft.com/office/word/2016/wordml/cid" xmlns:w16="http://schemas.microsoft.com/office/word/2018/wordml" xmlns:w16du="http://schemas.microsoft.com/office/word/2023/wordml/word16du" xmlns:w16sdtdh="http://schemas.microsoft.com/office/word/2020/wordml/sdtdatahash" xmlns:w16sdtfl="http://schemas.microsoft.com/office/word/2024/wordml/sdtformatlock" xmlns:w16se="http://schemas.microsoft.com/office/word/2015/wordml/symex" xmlns:wpg="http://schemas.microsoft.com/office/word/2010/wordprocessingGroup" xmlns:wpi="http://schemas.microsoft.com/office/word/2010/wordprocessingInk" xmlns:wne="http://schemas.microsoft.com/office/word/2006/wordml" xmlns:wps="http://schemas.microsoft.com/office/word/2010/wordprocessingShape" mc:Ignorable="w14 w15 w16se w16cid w16 w16cex w16sdtdh w16sdtfl w16du wp14">
   <w:endnote w:type="separator" w:id="-1">
     <w:p>
       <w:r>
@@ -4257,7 +4285,7 @@
 </file>
 
 <file path=word/footer1.xml><?xml version="1.0" encoding="utf-8"?>
-<w:ftr xmlns:wpc="http://schemas.microsoft.com/office/word/2010/wordprocessingCanvas" xmlns:cx="http://schemas.microsoft.com/office/drawing/2014/chartex" xmlns:cx1="http://schemas.microsoft.com/office/drawing/2015/9/8/chartex" xmlns:cx2="http://schemas.microsoft.com/office/drawing/2015/10/21/chartex" xmlns:cx3="http://schemas.microsoft.com/office/drawing/2016/5/9/chartex" xmlns:cx4="http://schemas.microsoft.com/office/drawing/2016/5/10/chartex" xmlns:cx5="http://schemas.microsoft.com/office/drawing/2016/5/11/chartex" xmlns:cx6="http://schemas.microsoft.com/office/drawing/2016/5/12/chartex" xmlns:cx7="http://schemas.microsoft.com/office/drawing/2016/5/13/chartex" xmlns:cx8="http://schemas.microsoft.com/office/drawing/2016/5/14/chartex" xmlns:mc="http://schemas.openxmlformats.org/markup-compatibility/2006" xmlns:aink="http://schemas.microsoft.com/office/drawing/2016/ink" xmlns:am3d="http://schemas.microsoft.com/office/drawing/2017/model3d" xmlns:o="urn:schemas-microsoft-com:office:office" xmlns:oel="http://schemas.microsoft.com/office/2019/extlst" xmlns:r="http://schemas.openxmlformats.org/officeDocument/2006/relationships" xmlns:m="http://schemas.openxmlformats.org/officeDocument/2006/math" xmlns:v="urn:schemas-microsoft-com:vml" xmlns:wp14="http://schemas.microsoft.com/office/word/2010/wordprocessingDrawing" xmlns:wp="http://schemas.openxmlformats.org/drawingml/2006/wordprocessingDrawing" xmlns:w10="urn:schemas-microsoft-com:office:word" xmlns:w="http://schemas.openxmlformats.org/wordprocessingml/2006/main" xmlns:w14="http://schemas.microsoft.com/office/word/2010/wordml" xmlns:w15="http://schemas.microsoft.com/office/word/2012/wordml" xmlns:w16cex="http://schemas.microsoft.com/office/word/2018/wordml/cex" xmlns:w16cid="http://schemas.microsoft.com/office/word/2016/wordml/cid" xmlns:w16="http://schemas.microsoft.com/office/word/2018/wordml" xmlns:w16du="http://schemas.microsoft.com/office/word/2023/wordml/word16du" xmlns:w16sdtdh="http://schemas.microsoft.com/office/word/2020/wordml/sdtdatahash" xmlns:w16sdtfl="http://schemas.microsoft.com/office/word/2024/wordml/sdtformatlock" xmlns:w16se="http://schemas.microsoft.com/office/word/2015/wordml/symex" xmlns:wpg="http://schemas.microsoft.com/office/word/2010/wordprocessingGroup" xmlns:wpi="http://schemas.microsoft.com/office/word/2010/wordprocessingInk" xmlns:wne="http://schemas.microsoft.com/office/word/2006/wordml" xmlns:wps="http://schemas.microsoft.com/office/word/2010/wordprocessingShape" mc:Ignorable="w14 w15 w16se w16cid w16 w16cex w16sdtdh w16sdtfl w16du wp14">
+<w:ftr xmlns:wpc="http://schemas.microsoft.com/office/word/2010/wordprocessingCanvas" xmlns:cx="http://schemas.microsoft.com/office/drawing/2014/chartex" xmlns:cx1="http://schemas.microsoft.com/office/drawing/2015/9/8/chartex" xmlns:cx2="http://schemas.microsoft.com/office/drawing/2015/10/21/chartex" xmlns:cx3="http://schemas.microsoft.com/office/drawing/2016/5/9/chartex" xmlns:cx4="http://schemas.microsoft.com/office/drawing/2016/5/10/chartex" xmlns:cx5="http://schemas.microsoft.com/office/drawing/2016/5/11/chartex" xmlns:cx6="http://schemas.microsoft.com/office/drawing/2016/5/12/chartex" xmlns:cx7="http://schemas.microsoft.com/office/drawing/2016/5/13/chartex" xmlns:cx8="http://schemas.microsoft.com/office/drawing/2016/5/14/chartex" xmlns:mc="http://schemas.openxmlformats.org/markup-compatibility/2006" xmlns:aink="http://schemas.microsoft.com/office/drawing/2016/ink" xmlns:am3d="http://schemas.microsoft.com/office/drawing/2017/model3d" xmlns:o="urn:schemas-microsoft-com:office:office" xmlns:oel="http://schemas.microsoft.com/office/2019/extlst" xmlns:r="http://schemas.openxmlformats.org/officeDocument/2006/relationships" xmlns:m="http://schemas.openxmlformats.org/officeDocument/2006/math" xmlns:v="urn:schemas-microsoft-com:vml" xmlns:wp14="http://schemas.microsoft.com/office/word/2010/wordprocessingDrawing" xmlns:wp="http://schemas.openxmlformats.org/drawingml/2006/wordprocessingDrawing" xmlns:w10="urn:schemas-microsoft-com:office:word" xmlns:w="http://schemas.openxmlformats.org/wordprocessingml/2006/main" xmlns:w14="http://schemas.microsoft.com/office/word/2010/wordml" xmlns:w15="http://schemas.microsoft.com/office/word/2012/wordml" xmlns:w16cei="http://schemas.microsoft.com/office/word/2026/wordml/cei" xmlns:w16cex="http://schemas.microsoft.com/office/word/2018/wordml/cex" xmlns:w16cid="http://schemas.microsoft.com/office/word/2016/wordml/cid" xmlns:w16="http://schemas.microsoft.com/office/word/2018/wordml" xmlns:w16du="http://schemas.microsoft.com/office/word/2023/wordml/word16du" xmlns:w16sdtdh="http://schemas.microsoft.com/office/word/2020/wordml/sdtdatahash" xmlns:w16sdtfl="http://schemas.microsoft.com/office/word/2024/wordml/sdtformatlock" xmlns:w16se="http://schemas.microsoft.com/office/word/2015/wordml/symex" xmlns:wpg="http://schemas.microsoft.com/office/word/2010/wordprocessingGroup" xmlns:wpi="http://schemas.microsoft.com/office/word/2010/wordprocessingInk" xmlns:wne="http://schemas.microsoft.com/office/word/2006/wordml" xmlns:wps="http://schemas.microsoft.com/office/word/2010/wordprocessingShape" mc:Ignorable="w14 w15 w16se w16cid w16 w16cex w16sdtdh w16sdtfl w16du wp14">
   <w:tbl>
     <w:tblPr>
       <w:tblW w:w="9611" w:type="dxa"/>
@@ -4356,7 +4384,7 @@
 </file>
 
 <file path=word/footnotes.xml><?xml version="1.0" encoding="utf-8"?>
-<w:footnotes xmlns:wpc="http://schemas.microsoft.com/office/word/2010/wordprocessingCanvas" xmlns:cx="http://schemas.microsoft.com/office/drawing/2014/chartex" xmlns:cx1="http://schemas.microsoft.com/office/drawing/2015/9/8/chartex" xmlns:cx2="http://schemas.microsoft.com/office/drawing/2015/10/21/chartex" xmlns:cx3="http://schemas.microsoft.com/office/drawing/2016/5/9/chartex" xmlns:cx4="http://schemas.microsoft.com/office/drawing/2016/5/10/chartex" xmlns:cx5="http://schemas.microsoft.com/office/drawing/2016/5/11/chartex" xmlns:cx6="http://schemas.microsoft.com/office/drawing/2016/5/12/chartex" xmlns:cx7="http://schemas.microsoft.com/office/drawing/2016/5/13/chartex" xmlns:cx8="http://schemas.microsoft.com/office/drawing/2016/5/14/chartex" xmlns:mc="http://schemas.openxmlformats.org/markup-compatibility/2006" xmlns:aink="http://schemas.microsoft.com/office/drawing/2016/ink" xmlns:am3d="http://schemas.microsoft.com/office/drawing/2017/model3d" xmlns:o="urn:schemas-microsoft-com:office:office" xmlns:oel="http://schemas.microsoft.com/office/2019/extlst" xmlns:r="http://schemas.openxmlformats.org/officeDocument/2006/relationships" xmlns:m="http://schemas.openxmlformats.org/officeDocument/2006/math" xmlns:v="urn:schemas-microsoft-com:vml" xmlns:wp14="http://schemas.microsoft.com/office/word/2010/wordprocessingDrawing" xmlns:wp="http://schemas.openxmlformats.org/drawingml/2006/wordprocessingDrawing" xmlns:w10="urn:schemas-microsoft-com:office:word" xmlns:w="http://schemas.openxmlformats.org/wordprocessingml/2006/main" xmlns:w14="http://schemas.microsoft.com/office/word/2010/wordml" xmlns:w15="http://schemas.microsoft.com/office/word/2012/wordml" xmlns:w16cex="http://schemas.microsoft.com/office/word/2018/wordml/cex" xmlns:w16cid="http://schemas.microsoft.com/office/word/2016/wordml/cid" xmlns:w16="http://schemas.microsoft.com/office/word/2018/wordml" xmlns:w16du="http://schemas.microsoft.com/office/word/2023/wordml/word16du" xmlns:w16sdtdh="http://schemas.microsoft.com/office/word/2020/wordml/sdtdatahash" xmlns:w16sdtfl="http://schemas.microsoft.com/office/word/2024/wordml/sdtformatlock" xmlns:w16se="http://schemas.microsoft.com/office/word/2015/wordml/symex" xmlns:wpg="http://schemas.microsoft.com/office/word/2010/wordprocessingGroup" xmlns:wpi="http://schemas.microsoft.com/office/word/2010/wordprocessingInk" xmlns:wne="http://schemas.microsoft.com/office/word/2006/wordml" xmlns:wps="http://schemas.microsoft.com/office/word/2010/wordprocessingShape" mc:Ignorable="w14 w15 w16se w16cid w16 w16cex w16sdtdh w16sdtfl w16du wp14">
+<w:footnotes xmlns:wpc="http://schemas.microsoft.com/office/word/2010/wordprocessingCanvas" xmlns:cx="http://schemas.microsoft.com/office/drawing/2014/chartex" xmlns:cx1="http://schemas.microsoft.com/office/drawing/2015/9/8/chartex" xmlns:cx2="http://schemas.microsoft.com/office/drawing/2015/10/21/chartex" xmlns:cx3="http://schemas.microsoft.com/office/drawing/2016/5/9/chartex" xmlns:cx4="http://schemas.microsoft.com/office/drawing/2016/5/10/chartex" xmlns:cx5="http://schemas.microsoft.com/office/drawing/2016/5/11/chartex" xmlns:cx6="http://schemas.microsoft.com/office/drawing/2016/5/12/chartex" xmlns:cx7="http://schemas.microsoft.com/office/drawing/2016/5/13/chartex" xmlns:cx8="http://schemas.microsoft.com/office/drawing/2016/5/14/chartex" xmlns:mc="http://schemas.openxmlformats.org/markup-compatibility/2006" xmlns:aink="http://schemas.microsoft.com/office/drawing/2016/ink" xmlns:am3d="http://schemas.microsoft.com/office/drawing/2017/model3d" xmlns:o="urn:schemas-microsoft-com:office:office" xmlns:oel="http://schemas.microsoft.com/office/2019/extlst" xmlns:r="http://schemas.openxmlformats.org/officeDocument/2006/relationships" xmlns:m="http://schemas.openxmlformats.org/officeDocument/2006/math" xmlns:v="urn:schemas-microsoft-com:vml" xmlns:wp14="http://schemas.microsoft.com/office/word/2010/wordprocessingDrawing" xmlns:wp="http://schemas.openxmlformats.org/drawingml/2006/wordprocessingDrawing" xmlns:w10="urn:schemas-microsoft-com:office:word" xmlns:w="http://schemas.openxmlformats.org/wordprocessingml/2006/main" xmlns:w14="http://schemas.microsoft.com/office/word/2010/wordml" xmlns:w15="http://schemas.microsoft.com/office/word/2012/wordml" xmlns:w16cei="http://schemas.microsoft.com/office/word/2026/wordml/cei" xmlns:w16cex="http://schemas.microsoft.com/office/word/2018/wordml/cex" xmlns:w16cid="http://schemas.microsoft.com/office/word/2016/wordml/cid" xmlns:w16="http://schemas.microsoft.com/office/word/2018/wordml" xmlns:w16du="http://schemas.microsoft.com/office/word/2023/wordml/word16du" xmlns:w16sdtdh="http://schemas.microsoft.com/office/word/2020/wordml/sdtdatahash" xmlns:w16sdtfl="http://schemas.microsoft.com/office/word/2024/wordml/sdtformatlock" xmlns:w16se="http://schemas.microsoft.com/office/word/2015/wordml/symex" xmlns:wpg="http://schemas.microsoft.com/office/word/2010/wordprocessingGroup" xmlns:wpi="http://schemas.microsoft.com/office/word/2010/wordprocessingInk" xmlns:wne="http://schemas.microsoft.com/office/word/2006/wordml" xmlns:wps="http://schemas.microsoft.com/office/word/2010/wordprocessingShape" mc:Ignorable="w14 w15 w16se w16cid w16 w16cex w16sdtdh w16sdtfl w16du wp14">
   <w:footnote w:type="separator" w:id="-1">
     <w:p>
       <w:r>
@@ -4377,7 +4405,7 @@
 </file>
 
 <file path=word/header1.xml><?xml version="1.0" encoding="utf-8"?>
-<w:hdr xmlns:wpc="http://schemas.microsoft.com/office/word/2010/wordprocessingCanvas" xmlns:cx="http://schemas.microsoft.com/office/drawing/2014/chartex" xmlns:cx1="http://schemas.microsoft.com/office/drawing/2015/9/8/chartex" xmlns:cx2="http://schemas.microsoft.com/office/drawing/2015/10/21/chartex" xmlns:cx3="http://schemas.microsoft.com/office/drawing/2016/5/9/chartex" xmlns:cx4="http://schemas.microsoft.com/office/drawing/2016/5/10/chartex" xmlns:cx5="http://schemas.microsoft.com/office/drawing/2016/5/11/chartex" xmlns:cx6="http://schemas.microsoft.com/office/drawing/2016/5/12/chartex" xmlns:cx7="http://schemas.microsoft.com/office/drawing/2016/5/13/chartex" xmlns:cx8="http://schemas.microsoft.com/office/drawing/2016/5/14/chartex" xmlns:mc="http://schemas.openxmlformats.org/markup-compatibility/2006" xmlns:aink="http://schemas.microsoft.com/office/drawing/2016/ink" xmlns:am3d="http://schemas.microsoft.com/office/drawing/2017/model3d" xmlns:o="urn:schemas-microsoft-com:office:office" xmlns:oel="http://schemas.microsoft.com/office/2019/extlst" xmlns:r="http://schemas.openxmlformats.org/officeDocument/2006/relationships" xmlns:m="http://schemas.openxmlformats.org/officeDocument/2006/math" xmlns:v="urn:schemas-microsoft-com:vml" xmlns:wp14="http://schemas.microsoft.com/office/word/2010/wordprocessingDrawing" xmlns:wp="http://schemas.openxmlformats.org/drawingml/2006/wordprocessingDrawing" xmlns:w10="urn:schemas-microsoft-com:office:word" xmlns:w="http://schemas.openxmlformats.org/wordprocessingml/2006/main" xmlns:w14="http://schemas.microsoft.com/office/word/2010/wordml" xmlns:w15="http://schemas.microsoft.com/office/word/2012/wordml" xmlns:w16cex="http://schemas.microsoft.com/office/word/2018/wordml/cex" xmlns:w16cid="http://schemas.microsoft.com/office/word/2016/wordml/cid" xmlns:w16="http://schemas.microsoft.com/office/word/2018/wordml" xmlns:w16du="http://schemas.microsoft.com/office/word/2023/wordml/word16du" xmlns:w16sdtdh="http://schemas.microsoft.com/office/word/2020/wordml/sdtdatahash" xmlns:w16sdtfl="http://schemas.microsoft.com/office/word/2024/wordml/sdtformatlock" xmlns:w16se="http://schemas.microsoft.com/office/word/2015/wordml/symex" xmlns:wpg="http://schemas.microsoft.com/office/word/2010/wordprocessingGroup" xmlns:wpi="http://schemas.microsoft.com/office/word/2010/wordprocessingInk" xmlns:wne="http://schemas.microsoft.com/office/word/2006/wordml" xmlns:wps="http://schemas.microsoft.com/office/word/2010/wordprocessingShape" mc:Ignorable="w14 w15 w16se w16cid w16 w16cex w16sdtdh w16sdtfl w16du wp14">
+<w:hdr xmlns:wpc="http://schemas.microsoft.com/office/word/2010/wordprocessingCanvas" xmlns:cx="http://schemas.microsoft.com/office/drawing/2014/chartex" xmlns:cx1="http://schemas.microsoft.com/office/drawing/2015/9/8/chartex" xmlns:cx2="http://schemas.microsoft.com/office/drawing/2015/10/21/chartex" xmlns:cx3="http://schemas.microsoft.com/office/drawing/2016/5/9/chartex" xmlns:cx4="http://schemas.microsoft.com/office/drawing/2016/5/10/chartex" xmlns:cx5="http://schemas.microsoft.com/office/drawing/2016/5/11/chartex" xmlns:cx6="http://schemas.microsoft.com/office/drawing/2016/5/12/chartex" xmlns:cx7="http://schemas.microsoft.com/office/drawing/2016/5/13/chartex" xmlns:cx8="http://schemas.microsoft.com/office/drawing/2016/5/14/chartex" xmlns:mc="http://schemas.openxmlformats.org/markup-compatibility/2006" xmlns:aink="http://schemas.microsoft.com/office/drawing/2016/ink" xmlns:am3d="http://schemas.microsoft.com/office/drawing/2017/model3d" xmlns:o="urn:schemas-microsoft-com:office:office" xmlns:oel="http://schemas.microsoft.com/office/2019/extlst" xmlns:r="http://schemas.openxmlformats.org/officeDocument/2006/relationships" xmlns:m="http://schemas.openxmlformats.org/officeDocument/2006/math" xmlns:v="urn:schemas-microsoft-com:vml" xmlns:wp14="http://schemas.microsoft.com/office/word/2010/wordprocessingDrawing" xmlns:wp="http://schemas.openxmlformats.org/drawingml/2006/wordprocessingDrawing" xmlns:w10="urn:schemas-microsoft-com:office:word" xmlns:w="http://schemas.openxmlformats.org/wordprocessingml/2006/main" xmlns:w14="http://schemas.microsoft.com/office/word/2010/wordml" xmlns:w15="http://schemas.microsoft.com/office/word/2012/wordml" xmlns:w16cei="http://schemas.microsoft.com/office/word/2026/wordml/cei" xmlns:w16cex="http://schemas.microsoft.com/office/word/2018/wordml/cex" xmlns:w16cid="http://schemas.microsoft.com/office/word/2016/wordml/cid" xmlns:w16="http://schemas.microsoft.com/office/word/2018/wordml" xmlns:w16du="http://schemas.microsoft.com/office/word/2023/wordml/word16du" xmlns:w16sdtdh="http://schemas.microsoft.com/office/word/2020/wordml/sdtdatahash" xmlns:w16sdtfl="http://schemas.microsoft.com/office/word/2024/wordml/sdtformatlock" xmlns:w16se="http://schemas.microsoft.com/office/word/2015/wordml/symex" xmlns:wpg="http://schemas.microsoft.com/office/word/2010/wordprocessingGroup" xmlns:wpi="http://schemas.microsoft.com/office/word/2010/wordprocessingInk" xmlns:wne="http://schemas.microsoft.com/office/word/2006/wordml" xmlns:wps="http://schemas.microsoft.com/office/word/2010/wordprocessingShape" mc:Ignorable="w14 w15 w16se w16cid w16 w16cex w16sdtdh w16sdtfl w16du wp14">
   <w:tbl>
     <w:tblPr>
       <w:tblW w:w="9809" w:type="dxa"/>
@@ -4488,7 +4516,7 @@
 </file>
 
 <file path=word/header2.xml><?xml version="1.0" encoding="utf-8"?>
-<w:hdr xmlns:wpc="http://schemas.microsoft.com/office/word/2010/wordprocessingCanvas" xmlns:cx="http://schemas.microsoft.com/office/drawing/2014/chartex" xmlns:cx1="http://schemas.microsoft.com/office/drawing/2015/9/8/chartex" xmlns:cx2="http://schemas.microsoft.com/office/drawing/2015/10/21/chartex" xmlns:cx3="http://schemas.microsoft.com/office/drawing/2016/5/9/chartex" xmlns:cx4="http://schemas.microsoft.com/office/drawing/2016/5/10/chartex" xmlns:cx5="http://schemas.microsoft.com/office/drawing/2016/5/11/chartex" xmlns:cx6="http://schemas.microsoft.com/office/drawing/2016/5/12/chartex" xmlns:cx7="http://schemas.microsoft.com/office/drawing/2016/5/13/chartex" xmlns:cx8="http://schemas.microsoft.com/office/drawing/2016/5/14/chartex" xmlns:mc="http://schemas.openxmlformats.org/markup-compatibility/2006" xmlns:aink="http://schemas.microsoft.com/office/drawing/2016/ink" xmlns:am3d="http://schemas.microsoft.com/office/drawing/2017/model3d" xmlns:o="urn:schemas-microsoft-com:office:office" xmlns:oel="http://schemas.microsoft.com/office/2019/extlst" xmlns:r="http://schemas.openxmlformats.org/officeDocument/2006/relationships" xmlns:m="http://schemas.openxmlformats.org/officeDocument/2006/math" xmlns:v="urn:schemas-microsoft-com:vml" xmlns:wp14="http://schemas.microsoft.com/office/word/2010/wordprocessingDrawing" xmlns:wp="http://schemas.openxmlformats.org/drawingml/2006/wordprocessingDrawing" xmlns:w10="urn:schemas-microsoft-com:office:word" xmlns:w="http://schemas.openxmlformats.org/wordprocessingml/2006/main" xmlns:w14="http://schemas.microsoft.com/office/word/2010/wordml" xmlns:w15="http://schemas.microsoft.com/office/word/2012/wordml" xmlns:w16cex="http://schemas.microsoft.com/office/word/2018/wordml/cex" xmlns:w16cid="http://schemas.microsoft.com/office/word/2016/wordml/cid" xmlns:w16="http://schemas.microsoft.com/office/word/2018/wordml" xmlns:w16du="http://schemas.microsoft.com/office/word/2023/wordml/word16du" xmlns:w16sdtdh="http://schemas.microsoft.com/office/word/2020/wordml/sdtdatahash" xmlns:w16sdtfl="http://schemas.microsoft.com/office/word/2024/wordml/sdtformatlock" xmlns:w16se="http://schemas.microsoft.com/office/word/2015/wordml/symex" xmlns:wpg="http://schemas.microsoft.com/office/word/2010/wordprocessingGroup" xmlns:wpi="http://schemas.microsoft.com/office/word/2010/wordprocessingInk" xmlns:wne="http://schemas.microsoft.com/office/word/2006/wordml" xmlns:wps="http://schemas.microsoft.com/office/word/2010/wordprocessingShape" mc:Ignorable="w14 w15 w16se w16cid w16 w16cex w16sdtdh w16sdtfl w16du wp14">
+<w:hdr xmlns:wpc="http://schemas.microsoft.com/office/word/2010/wordprocessingCanvas" xmlns:cx="http://schemas.microsoft.com/office/drawing/2014/chartex" xmlns:cx1="http://schemas.microsoft.com/office/drawing/2015/9/8/chartex" xmlns:cx2="http://schemas.microsoft.com/office/drawing/2015/10/21/chartex" xmlns:cx3="http://schemas.microsoft.com/office/drawing/2016/5/9/chartex" xmlns:cx4="http://schemas.microsoft.com/office/drawing/2016/5/10/chartex" xmlns:cx5="http://schemas.microsoft.com/office/drawing/2016/5/11/chartex" xmlns:cx6="http://schemas.microsoft.com/office/drawing/2016/5/12/chartex" xmlns:cx7="http://schemas.microsoft.com/office/drawing/2016/5/13/chartex" xmlns:cx8="http://schemas.microsoft.com/office/drawing/2016/5/14/chartex" xmlns:mc="http://schemas.openxmlformats.org/markup-compatibility/2006" xmlns:aink="http://schemas.microsoft.com/office/drawing/2016/ink" xmlns:am3d="http://schemas.microsoft.com/office/drawing/2017/model3d" xmlns:o="urn:schemas-microsoft-com:office:office" xmlns:oel="http://schemas.microsoft.com/office/2019/extlst" xmlns:r="http://schemas.openxmlformats.org/officeDocument/2006/relationships" xmlns:m="http://schemas.openxmlformats.org/officeDocument/2006/math" xmlns:v="urn:schemas-microsoft-com:vml" xmlns:wp14="http://schemas.microsoft.com/office/word/2010/wordprocessingDrawing" xmlns:wp="http://schemas.openxmlformats.org/drawingml/2006/wordprocessingDrawing" xmlns:w10="urn:schemas-microsoft-com:office:word" xmlns:w="http://schemas.openxmlformats.org/wordprocessingml/2006/main" xmlns:w14="http://schemas.microsoft.com/office/word/2010/wordml" xmlns:w15="http://schemas.microsoft.com/office/word/2012/wordml" xmlns:w16cei="http://schemas.microsoft.com/office/word/2026/wordml/cei" xmlns:w16cex="http://schemas.microsoft.com/office/word/2018/wordml/cex" xmlns:w16cid="http://schemas.microsoft.com/office/word/2016/wordml/cid" xmlns:w16="http://schemas.microsoft.com/office/word/2018/wordml" xmlns:w16du="http://schemas.microsoft.com/office/word/2023/wordml/word16du" xmlns:w16sdtdh="http://schemas.microsoft.com/office/word/2020/wordml/sdtdatahash" xmlns:w16sdtfl="http://schemas.microsoft.com/office/word/2024/wordml/sdtformatlock" xmlns:w16se="http://schemas.microsoft.com/office/word/2015/wordml/symex" xmlns:wpg="http://schemas.microsoft.com/office/word/2010/wordprocessingGroup" xmlns:wpi="http://schemas.microsoft.com/office/word/2010/wordprocessingInk" xmlns:wne="http://schemas.microsoft.com/office/word/2006/wordml" xmlns:wps="http://schemas.microsoft.com/office/word/2010/wordprocessingShape" mc:Ignorable="w14 w15 w16se w16cid w16 w16cex w16sdtdh w16sdtfl w16du wp14">
   <w:tbl>
     <w:tblPr>
       <w:tblW w:w="9809" w:type="dxa"/>
@@ -4597,7 +4625,7 @@
 </file>
 
 <file path=word/numbering.xml><?xml version="1.0" encoding="utf-8"?>
-<w:numbering xmlns:wpc="http://schemas.microsoft.com/office/word/2010/wordprocessingCanvas" xmlns:cx="http://schemas.microsoft.com/office/drawing/2014/chartex" xmlns:cx1="http://schemas.microsoft.com/office/drawing/2015/9/8/chartex" xmlns:cx2="http://schemas.microsoft.com/office/drawing/2015/10/21/chartex" xmlns:cx3="http://schemas.microsoft.com/office/drawing/2016/5/9/chartex" xmlns:cx4="http://schemas.microsoft.com/office/drawing/2016/5/10/chartex" xmlns:cx5="http://schemas.microsoft.com/office/drawing/2016/5/11/chartex" xmlns:cx6="http://schemas.microsoft.com/office/drawing/2016/5/12/chartex" xmlns:cx7="http://schemas.microsoft.com/office/drawing/2016/5/13/chartex" xmlns:cx8="http://schemas.microsoft.com/office/drawing/2016/5/14/chartex" xmlns:mc="http://schemas.openxmlformats.org/markup-compatibility/2006" xmlns:aink="http://schemas.microsoft.com/office/drawing/2016/ink" xmlns:am3d="http://schemas.microsoft.com/office/drawing/2017/model3d" xmlns:o="urn:schemas-microsoft-com:office:office" xmlns:oel="http://schemas.microsoft.com/office/2019/extlst" xmlns:r="http://schemas.openxmlformats.org/officeDocument/2006/relationships" xmlns:m="http://schemas.openxmlformats.org/officeDocument/2006/math" xmlns:v="urn:schemas-microsoft-com:vml" xmlns:wp14="http://schemas.microsoft.com/office/word/2010/wordprocessingDrawing" xmlns:wp="http://schemas.openxmlformats.org/drawingml/2006/wordprocessingDrawing" xmlns:w10="urn:schemas-microsoft-com:office:word" xmlns:w="http://schemas.openxmlformats.org/wordprocessingml/2006/main" xmlns:w14="http://schemas.microsoft.com/office/word/2010/wordml" xmlns:w15="http://schemas.microsoft.com/office/word/2012/wordml" xmlns:w16cex="http://schemas.microsoft.com/office/word/2018/wordml/cex" xmlns:w16cid="http://schemas.microsoft.com/office/word/2016/wordml/cid" xmlns:w16="http://schemas.microsoft.com/office/word/2018/wordml" xmlns:w16du="http://schemas.microsoft.com/office/word/2023/wordml/word16du" xmlns:w16sdtdh="http://schemas.microsoft.com/office/word/2020/wordml/sdtdatahash" xmlns:w16sdtfl="http://schemas.microsoft.com/office/word/2024/wordml/sdtformatlock" xmlns:w16se="http://schemas.microsoft.com/office/word/2015/wordml/symex" xmlns:wpg="http://schemas.microsoft.com/office/word/2010/wordprocessingGroup" xmlns:wpi="http://schemas.microsoft.com/office/word/2010/wordprocessingInk" xmlns:wne="http://schemas.microsoft.com/office/word/2006/wordml" xmlns:wps="http://schemas.microsoft.com/office/word/2010/wordprocessingShape" mc:Ignorable="w14 w15 w16se w16cid w16 w16cex w16sdtdh w16sdtfl w16du wp14">
+<w:numbering xmlns:wpc="http://schemas.microsoft.com/office/word/2010/wordprocessingCanvas" xmlns:cx="http://schemas.microsoft.com/office/drawing/2014/chartex" xmlns:cx1="http://schemas.microsoft.com/office/drawing/2015/9/8/chartex" xmlns:cx2="http://schemas.microsoft.com/office/drawing/2015/10/21/chartex" xmlns:cx3="http://schemas.microsoft.com/office/drawing/2016/5/9/chartex" xmlns:cx4="http://schemas.microsoft.com/office/drawing/2016/5/10/chartex" xmlns:cx5="http://schemas.microsoft.com/office/drawing/2016/5/11/chartex" xmlns:cx6="http://schemas.microsoft.com/office/drawing/2016/5/12/chartex" xmlns:cx7="http://schemas.microsoft.com/office/drawing/2016/5/13/chartex" xmlns:cx8="http://schemas.microsoft.com/office/drawing/2016/5/14/chartex" xmlns:mc="http://schemas.openxmlformats.org/markup-compatibility/2006" xmlns:aink="http://schemas.microsoft.com/office/drawing/2016/ink" xmlns:am3d="http://schemas.microsoft.com/office/drawing/2017/model3d" xmlns:o="urn:schemas-microsoft-com:office:office" xmlns:oel="http://schemas.microsoft.com/office/2019/extlst" xmlns:r="http://schemas.openxmlformats.org/officeDocument/2006/relationships" xmlns:m="http://schemas.openxmlformats.org/officeDocument/2006/math" xmlns:v="urn:schemas-microsoft-com:vml" xmlns:wp14="http://schemas.microsoft.com/office/word/2010/wordprocessingDrawing" xmlns:wp="http://schemas.openxmlformats.org/drawingml/2006/wordprocessingDrawing" xmlns:w10="urn:schemas-microsoft-com:office:word" xmlns:w="http://schemas.openxmlformats.org/wordprocessingml/2006/main" xmlns:w14="http://schemas.microsoft.com/office/word/2010/wordml" xmlns:w15="http://schemas.microsoft.com/office/word/2012/wordml" xmlns:w16cei="http://schemas.microsoft.com/office/word/2026/wordml/cei" xmlns:w16cex="http://schemas.microsoft.com/office/word/2018/wordml/cex" xmlns:w16cid="http://schemas.microsoft.com/office/word/2016/wordml/cid" xmlns:w16="http://schemas.microsoft.com/office/word/2018/wordml" xmlns:w16du="http://schemas.microsoft.com/office/word/2023/wordml/word16du" xmlns:w16sdtdh="http://schemas.microsoft.com/office/word/2020/wordml/sdtdatahash" xmlns:w16sdtfl="http://schemas.microsoft.com/office/word/2024/wordml/sdtformatlock" xmlns:w16se="http://schemas.microsoft.com/office/word/2015/wordml/symex" xmlns:wpg="http://schemas.microsoft.com/office/word/2010/wordprocessingGroup" xmlns:wpi="http://schemas.microsoft.com/office/word/2010/wordprocessingInk" xmlns:wne="http://schemas.microsoft.com/office/word/2006/wordml" xmlns:wps="http://schemas.microsoft.com/office/word/2010/wordprocessingShape" mc:Ignorable="w14 w15 w16se w16cid w16 w16cex w16sdtdh w16sdtfl w16du wp14">
   <w:abstractNum w:abstractNumId="0" w15:restartNumberingAfterBreak="0">
     <w:nsid w:val="02662F3E"/>
     <w:multiLevelType w:val="hybridMultilevel"/>
@@ -5175,7 +5203,7 @@
   <w:abstractNum w:abstractNumId="5" w15:restartNumberingAfterBreak="0">
     <w:nsid w:val="18EB2A55"/>
     <w:multiLevelType w:val="multilevel"/>
-    <w:tmpl w:val="AC4A0814"/>
+    <w:tmpl w:val="25B26BB4"/>
     <w:lvl w:ilvl="0">
       <w:start w:val="1"/>
       <w:numFmt w:val="decimal"/>
@@ -6930,6 +6958,7 @@
     <w:link w:val="berschrift3Zchn"/>
     <w:autoRedefine/>
     <w:qFormat/>
+    <w:rsid w:val="001D1DCB"/>
     <w:pPr>
       <w:keepNext/>
       <w:numPr>
@@ -6939,10 +6968,11 @@
       <w:outlineLvl w:val="2"/>
     </w:pPr>
     <w:rPr>
-      <w:rFonts w:cs="Arial"/>
+      <w:rFonts w:ascii="Times New Roman" w:hAnsi="Times New Roman"/>
       <w:b/>
       <w:bCs/>
       <w:noProof/>
+      <w:lang w:eastAsia="de-DE"/>
     </w:rPr>
   </w:style>
   <w:style w:type="paragraph" w:styleId="berschrift4">
@@ -7120,6 +7150,7 @@
   <w:style w:type="character" w:default="1" w:styleId="Absatz-Standardschriftart">
     <w:name w:val="Default Paragraph Font"/>
     <w:uiPriority w:val="1"/>
+    <w:semiHidden/>
     <w:unhideWhenUsed/>
   </w:style>
   <w:style w:type="table" w:default="1" w:styleId="NormaleTabelle">
@@ -7592,11 +7623,17 @@
     <w:next w:val="Standard"/>
     <w:autoRedefine/>
     <w:uiPriority w:val="39"/>
+    <w:rsid w:val="002419EB"/>
     <w:pPr>
+      <w:tabs>
+        <w:tab w:val="left" w:pos="1200"/>
+        <w:tab w:val="right" w:leader="dot" w:pos="9061"/>
+      </w:tabs>
       <w:ind w:left="482"/>
     </w:pPr>
     <w:rPr>
-      <w:rFonts w:asciiTheme="minorHAnsi" w:hAnsiTheme="minorHAnsi" w:cstheme="minorHAnsi"/>
+      <w:rFonts w:ascii="Times New Roman" w:hAnsi="Times New Roman"/>
+      <w:noProof/>
       <w:sz w:val="20"/>
     </w:rPr>
   </w:style>
@@ -7834,13 +7871,13 @@
     <w:name w:val="Überschrift 3 Zchn"/>
     <w:basedOn w:val="Absatz-Standardschriftart"/>
     <w:link w:val="berschrift3"/>
+    <w:rsid w:val="001D1DCB"/>
     <w:rPr>
-      <w:rFonts w:ascii="Arial" w:hAnsi="Arial" w:cs="Arial"/>
       <w:b/>
       <w:bCs/>
       <w:noProof/>
       <w:sz w:val="24"/>
-      <w:lang w:val="de-CH" w:eastAsia="de-CH"/>
+      <w:lang w:val="de-CH" w:eastAsia="de-DE"/>
     </w:rPr>
   </w:style>
   <w:style w:type="paragraph" w:customStyle="1" w:styleId="AllgemeineMassnahme">

</xml_diff>